<commit_message>
chore(release): harden reproducibility and submission checks
</commit_message>
<xml_diff>
--- a/data/processed/paper/paper.docx
+++ b/data/processed/paper/paper.docx
@@ -262,7 +262,7 @@
           <w:b w:val="0"/>
           <w:sz w:val="21"/>
         </w:rPr>
-        <w:t>本文针对 250 款商用啤酒的化学测量与感官数据完成三项任务的建模与复现，并首先以可复算的证据审计附件语义：逐列回归裁定 1.csv 为 log10 标度与原始浓度并存的混合标度（70 列中 log10 标度 37、原始浓度标度 19、近似原始浓度 10、无法逐点复现 4）；以逐元素重算比对裁定 2.csv、5.csv、6.csv 三张相关矩阵均为斯皮尔曼系数（最大绝对偏差为 0）；并查明 3.xlsx 仅为空白品评卡模板、附件不含原始 0–6 分数。据此建立两张全解析名称桥与统一的 log10(mg/L) 特征矩阵。问题一以 227 个化学特征（统一矩阵 231 列中剔除 4 个派生求和列）预测 50 个感官维度，七个模型族与 TabPFN 3.5 五折集成在分层留出集上取得相对全局均值基线约 15% 的宏平均 RMSE 改善，并交付 250 款啤酒 × 50 维的 0–6 分制分级评分表。问题二构建 231 节点共表达图，以自算全量相关、SHAP 归因、附件交叉相关与外部先验四路证据给出各感官维度的 Top-3 关键化合物，并以重采样入选频率与跨方法 Jaccard 系数双重量化稳定性。问题三以全局高斯 Copula 加风格条件边际生成化合谱，在缺陷阈值约束下实现零违规，并以秩—分位映射完成跨风格迁移。本文进一步以 183 维消费者描述符与 189 款啤酒的零售价格作为外部验证，并重新检验缺陷化合物的剂量—响应关系；对原研究「提升消费者喜爱度」一环，因附件不含消费者评分标签，明确声明其在本附件条件下不可检验。</w:t>
+        <w:t>本文针对 250 款商用啤酒的化学测量与感官数据完成三项任务的建模与复现，并首先以可复算的证据审计附件语义：逐列回归裁定 1.csv 为 log10 标度与原始浓度并存的混合标度（70 列中 log10 标度 37、原始浓度标度 19、近似原始浓度 10、无法逐点复现 4）；以逐元素重算比对裁定 2.csv、5.csv、6.csv 三张相关矩阵均为斯皮尔曼系数（最大绝对偏差为 0）；并查明 3.xlsx 仅为空白品评卡模板、附件不含原始 0–6 分数。据此建立两张全解析名称桥与统一的 log10(mg/L) 特征矩阵。问题一以 227 个化学特征（统一矩阵 231 列中剔除 4 个派生求和列）预测 50 个感官维度，七个模型族在固定的 175/75 风格分层留出集上取得相对全局均值基线约 15% 的宏平均 RMSE 改善，并另行保留原始 231 特征、KFold 协议下的 TabPFN 3.5 队友复现作为协议核对，不将其与主模型直接比较；同时交付 250 款啤酒 × 50 维的 0–6 分制分级评分表。问题二构建 231 节点共表达图，以自算全量相关、SHAP 归因、附件交叉相关与外部先验四路证据给出各感官维度的 Top-3 关键化合物，并以重采样入选频率与跨方法 Jaccard 系数双重量化稳定性。问题三以全局高斯 Copula 加风格条件边际生成化合谱，在硬约束合规层面实现零违规，同时报告无约束真实性参照与受约束后的分布压缩，并以秩—分位映射完成跨风格迁移。本文进一步以 183 维消费者描述符与 189 款啤酒的零售价格作为外部验证，并重新检验缺陷化合物的剂量—响应关系；对原研究「提升消费者喜爱度」一环，因附件不含消费者评分标签，明确声明其在本附件条件下不可检验。</w:t>
       </w:r>
     </w:p>
     <w:p>
@@ -595,7 +595,7 @@
           <w:sz w:val="20"/>
         </w:rPr>
         <w:tab/>
-        <w:t>2</w:t>
+        <w:t>3</w:t>
       </w:r>
     </w:p>
     <w:p>
@@ -725,7 +725,7 @@
           <w:sz w:val="20"/>
         </w:rPr>
         <w:tab/>
-        <w:t>4</w:t>
+        <w:t>5</w:t>
       </w:r>
     </w:p>
     <w:p>
@@ -855,7 +855,7 @@
           <w:sz w:val="20"/>
         </w:rPr>
         <w:tab/>
-        <w:t>6</w:t>
+        <w:t>7</w:t>
       </w:r>
     </w:p>
     <w:p>
@@ -907,7 +907,7 @@
           <w:sz w:val="20"/>
         </w:rPr>
         <w:tab/>
-        <w:t>7</w:t>
+        <w:t>8</w:t>
       </w:r>
     </w:p>
     <w:p>
@@ -1063,7 +1063,7 @@
           <w:sz w:val="20"/>
         </w:rPr>
         <w:tab/>
-        <w:t>20</w:t>
+        <w:t>21</w:t>
       </w:r>
     </w:p>
     <w:p>
@@ -1415,7 +1415,7 @@
           <w:b w:val="0"/>
           <w:sz w:val="21"/>
         </w:rPr>
-        <w:t>原始研究以 250 款商用啤酒的化学测量与受训品评小组感官结果为核心数据，系统刻画了化学组成与感官属性之间的关系，并把可解释的机器学习用于风味预测与配方改进[1]；其数据公开方式（同时给出化合物矩阵、三张相关矩阵、品评卡、论坛描述符与阈值参考表）也决定了任何复用者都必须自行裁定这些附件的语义，这正是本文第二章与第三章所做的工作。</w:t>
+        <w:t>原始研究以 250 款商用啤酒的化学测量与受训品评小组感官结果为核心数据，系统刻画了化学组成与感官属性之间的关系，并把可解释的机器学习用于风味预测与配方改进[1]；其数据公开方式（同时给出化合物矩阵、三张相关矩阵、品评卡、论坛描述符与阈值参考表）也决定了任何复用者都必须自行裁定这些附件的语义，这正是本文第二章与第三章所做的工作。近期 flavoromics 研究也表明，多平台化学—感官证据可用于筛查候选化合物，但跨平台结果不能未经校准地并入本项目训练集[38]。</w:t>
       </w:r>
     </w:p>
     <w:p>
@@ -1443,7 +1443,7 @@
           <w:b w:val="0"/>
           <w:sz w:val="21"/>
         </w:rPr>
-        <w:t>从化学成分到感官评分的映射本质上是一个高维小样本回归问题。通用机器学习工具（如 scikit-learn[2]）提供了从线性模型到梯度提升与随机森林的统一实现；SHAP[3] 提供了把模型输出分解到单个化合物的加性归因方法；预训练先验模型（TabPFN[4]）则为小样本表格回归提供了不同于手工特征工程的第三条路线（其原始版本面向表格分类任务，回归形态与本文用法见后续期刊版[11]）。本文在问题一同时使用这三类归纳偏置，并在问题二把归因与秩相关并列作为证据，避免以单一视角替代真值。</w:t>
+        <w:t>从化学成分到感官评分的映射本质上是一个高维小样本回归问题。通用机器学习工具（如 scikit-learn[2]）提供了从线性模型到梯度提升与随机森林的统一实现；SHAP[3] 提供了把模型输出分解到单个化合物的加性归因方法；预训练先验模型（TabPFN[4]）则为小样本表格回归提供了不同于手工特征工程的第三条路线（其原始版本面向表格分类任务，回归形态与本文用法见后续期刊版[11]）。TabDPT[36] 可作为后续的表格基础模型对照，但不作为本项目当前提交的必做主线。本文在问题一同时使用这三类归纳偏置，并在问题二把归因与秩相关并列作为证据，避免以单一视角替代真值。</w:t>
       </w:r>
     </w:p>
     <w:p>
@@ -1499,7 +1499,7 @@
           <w:b w:val="0"/>
           <w:sz w:val="21"/>
         </w:rPr>
-        <w:t>在多变量分布既要保留相关结构、又需在小样本下可控的场合，高斯 Copula 是一种低成本的分解方案[6]；秩—分位映射则是相关结构与边际分布解耦的经典做法[7]，可在保持秩相关不变的前提下把样本迁移到另一组边际上。本文的问题三正是这一组合：Copula 负责跨化合物的相关结构，风格条件边际负责风格画像，秩—分位映射负责跨风格迁移，三者都不依赖大规模神经网络训练。</w:t>
+        <w:t>在多变量分布既要保留相关结构、又需在小样本下可控的场合，高斯 Copula 是一种低成本的分解方案[6]；秩—分位映射则是相关结构与边际分布解耦的经典做法[7]，可在保持秩相关不变的前提下把样本迁移到另一组边际上。联合预测区间与 Copula 依赖结构的研究（如 CopulaCPTS[37]）可启发不确定性扩展，但其时间序列保证不能直接改写为本项目静态数据保证。本文的问题三正是这一组合：Copula 负责跨化合物的相关结构，风格条件边际负责风格画像，秩—分位映射负责跨风格迁移，三者都不依赖大规模神经网络训练。</w:t>
       </w:r>
     </w:p>
     <w:p>
@@ -1555,7 +1555,7 @@
           <w:b w:val="0"/>
           <w:sz w:val="21"/>
         </w:rPr>
-        <w:t>本文全部引用按其在文中所支撑的主题归类如下：2.1 原始工作与数据来源[1]；2.2 感官预测与可解释机器学习[2][3][4][11][29]；2.3 化合物关联分析与网络化方法[5]；2.4 合成数据、Copula 与秩-分位映射[6][7][12]；2.5 定量描述感官分析与消费者接受度、价格[8][9][13][33][34]；2.2 段末说明与三、3.2 相关系数类型的勘误[10]；领域综述：啤酒香气化合物与风味[14][15]；领域综述：酵母来源的风味贡献[16][17]；领域综述：麦芽来源的风味贡献[18]；领域综述：野生菌群的风味贡献[19][20]；领域综述：酒花来源的风味贡献[21]；领域综述：异味化合物阈值与陈化[22][23][24]；领域综述：消费者感官接受度[25]；领域综述：消费者感官接受度与价格[26]；领域综述：挥发物与感官关联的复杂关系[27]；5.1 问题一：感官评分预测与 0-6 分制[28]；5.1 与 5.3 自助重采样与稳定性[30]；4.1 问题一：多任务回归与双轨分级[31]；4.1 与 4.3[32]；支撑材料 A 实际使用的软件与运行环境[35]。</w:t>
+        <w:t>本文全部引用按其在文中所支撑的主题归类如下：2.1 原始工作与数据来源[1][38]；2.2 感官预测与可解释机器学习[2][3][4][11][29][36]；2.3 化合物关联分析与网络化方法[5]；2.4 合成数据、Copula 与秩-分位映射[6][7][12]；2.5 定量描述感官分析与消费者接受度、价格[8][9][13][33][34]；2.2 段末说明与三、3.2 相关系数类型的勘误[10]；领域综述：啤酒香气化合物与风味[14][15]；领域综述：酵母来源的风味贡献[16][17]；领域综述：麦芽来源的风味贡献[18]；领域综述：野生菌群的风味贡献[19][20]；领域综述：酒花来源的风味贡献[21]；领域综述：异味化合物阈值与陈化[22][23][24]；领域综述：消费者感官接受度[25]；领域综述：消费者感官接受度与价格[26]；领域综述：挥发物与感官关联的复杂关系[27]；5.1 问题一：感官评分预测与 0-6 分制[28]；5.1 与 5.3 自助重采样与稳定性[30]；4.1 问题一：多任务回归与双轨分级[31]；4.1 与 4.3[32]；支撑材料 A 实际使用的软件与运行环境[35]；2.4 合成数据、Copula 与秩—分位映射[37]。</w:t>
       </w:r>
     </w:p>
     <w:p>
@@ -1850,6 +1850,9 @@
         <w:gridCol w:w="4535"/>
       </w:tblGrid>
       <w:tr>
+        <w:trPr>
+          <w:tblHeader w:val="true"/>
+        </w:trPr>
         <w:tc>
           <w:tcPr>
             <w:tcW w:type="dxa" w:w="4535"/>
@@ -2272,6 +2275,9 @@
         <w:gridCol w:w="2267"/>
       </w:tblGrid>
       <w:tr>
+        <w:trPr>
+          <w:tblHeader w:val="true"/>
+        </w:trPr>
         <w:tc>
           <w:tcPr>
             <w:tcW w:type="dxa" w:w="2267"/>
@@ -2651,7 +2657,7 @@
           <w:b w:val="0"/>
           <w:sz w:val="21"/>
         </w:rPr>
-        <w:t>问题一以 1.csv 的化合物特征预测 50 个感官维度。特征取统一标度后的 227 个化学量，剔除 4 个公式未经验证的派生求和列；模型采用岭回归、偏最小二乘回归、多任务弹性网络、全局与分组极端随机树、逐指标梯度提升回归共七个模型族，外加 TabPFN 3.5 的五折集成，以覆盖线性低秩、强稀疏与树形非线性三类归纳偏置。主指标为宏平均均方根误差，并同时报告宏平均绝对误差、逐维决定系数中位数、斯皮尔曼相关系数中位数。</w:t>
+        <w:t>问题一以 1.csv 的化合物特征预测 50 个感官维度。特征取统一标度后的 227 个化学量，剔除 4 个公式未经验证的派生求和列；模型采用岭回归、偏最小二乘回归、多任务弹性网络、全局与分组极端随机树、逐指标梯度提升回归共七个主模型族；另保留 TabPFN 3.5 的队友协议五折复现，以覆盖线性低秩、强稀疏与树形非线性三类归纳偏置。主指标为宏平均均方根误差，并同时报告宏平均绝对误差、逐维决定系数中位数、斯皮尔曼相关系数中位数。</w:t>
       </w:r>
     </w:p>
     <w:p>
@@ -3003,6 +3009,9 @@
         <w:gridCol w:w="1008"/>
       </w:tblGrid>
       <w:tr>
+        <w:trPr>
+          <w:tblHeader w:val="true"/>
+        </w:trPr>
         <w:tc>
           <w:tcPr>
             <w:tcW w:type="dxa" w:w="1008"/>
@@ -4640,6 +4649,9 @@
         <w:gridCol w:w="1814"/>
       </w:tblGrid>
       <w:tr>
+        <w:trPr>
+          <w:tblHeader w:val="true"/>
+        </w:trPr>
         <w:tc>
           <w:tcPr>
             <w:tcW w:type="dxa" w:w="1814"/>
@@ -5271,6 +5283,9 @@
         <w:gridCol w:w="1814"/>
       </w:tblGrid>
       <w:tr>
+        <w:trPr>
+          <w:tblHeader w:val="true"/>
+        </w:trPr>
         <w:tc>
           <w:tcPr>
             <w:tcW w:type="dxa" w:w="1814"/>
@@ -6887,6 +6902,9 @@
         <w:gridCol w:w="2267"/>
       </w:tblGrid>
       <w:tr>
+        <w:trPr>
+          <w:tblHeader w:val="true"/>
+        </w:trPr>
         <w:tc>
           <w:tcPr>
             <w:tcW w:type="dxa" w:w="2267"/>
@@ -7880,6 +7898,9 @@
         <w:gridCol w:w="1008"/>
       </w:tblGrid>
       <w:tr>
+        <w:trPr>
+          <w:tblHeader w:val="true"/>
+        </w:trPr>
         <w:tc>
           <w:tcPr>
             <w:tcW w:type="dxa" w:w="1008"/>
@@ -8781,6 +8802,9 @@
         <w:gridCol w:w="1512"/>
       </w:tblGrid>
       <w:tr>
+        <w:trPr>
+          <w:tblHeader w:val="true"/>
+        </w:trPr>
         <w:tc>
           <w:tcPr>
             <w:tcW w:type="dxa" w:w="1512"/>
@@ -9634,6 +9658,9 @@
         <w:gridCol w:w="825"/>
       </w:tblGrid>
       <w:tr>
+        <w:trPr>
+          <w:tblHeader w:val="true"/>
+        </w:trPr>
         <w:tc>
           <w:tcPr>
             <w:tcW w:type="dxa" w:w="825"/>
@@ -11996,7 +12023,7 @@
           <w:b w:val="0"/>
           <w:sz w:val="21"/>
         </w:rPr>
-        <w:t xml:space="preserve">：全表 150 行中仅 36 行通过化学合理性检验，被判为稳健关键因素的 32 行中只有 9 行同时通过，其余 23 行虽在统计判据上稳健，但其化学来源归属或载体类别论证不成立，本文在表中保留这些行以示区分，不把它们作为可采纳的造谱依据。若只看每个感官维度排名第 1 的化合物，同时满足「稳健」与「化学合理」的仅 6 条，这正是本文把 Top-3 定位为「候选与稳健的参考集」而非可直接使用的造谱配方的原因。此外须报告一项负结果：50 个感官维度中有 </w:t>
+        <w:t xml:space="preserve">：全表 150 行中仅 36 行通过化学合理性检验，被判为稳健关键因素的 32 行中只有 9 行同时通过（稳健且化学合理），其余 23 行虽在统计判据上稳健，但其化学来源归属或载体类别论证不成立，本文在表中保留这些行以示区分，不把它们作为可采纳的造谱依据。若只看每个感官维度排名第 1 的化合物，同时满足「稳健」与「化学合理」的仅 6 条，这正是本文把 Top-3 定位为「候选与稳健的参考集」而非可直接使用的造谱配方的原因。此外须报告一项负结果：50 个感官维度中有 </w:t>
       </w:r>
       <w:r>
         <w:rPr>
@@ -12210,6 +12237,9 @@
         <w:gridCol w:w="3023"/>
       </w:tblGrid>
       <w:tr>
+        <w:trPr>
+          <w:tblHeader w:val="true"/>
+        </w:trPr>
         <w:tc>
           <w:tcPr>
             <w:tcW w:type="dxa" w:w="3023"/>
@@ -12747,6 +12777,9 @@
         <w:gridCol w:w="1814"/>
       </w:tblGrid>
       <w:tr>
+        <w:trPr>
+          <w:tblHeader w:val="true"/>
+        </w:trPr>
         <w:tc>
           <w:tcPr>
             <w:tcW w:type="dxa" w:w="1814"/>
@@ -13638,6 +13671,9 @@
         <w:gridCol w:w="756"/>
       </w:tblGrid>
       <w:tr>
+        <w:trPr>
+          <w:tblHeader w:val="true"/>
+        </w:trPr>
         <w:tc>
           <w:tcPr>
             <w:tcW w:type="dxa" w:w="756"/>
@@ -15733,7 +15769,7 @@
           <w:b w:val="0"/>
           <w:sz w:val="21"/>
         </w:rPr>
-        <w:t>全部风格生成样本中有阈值的缺陷化合物超阈值数量合计 0，即缺陷约束被完全满足。生成覆盖附件中真实样本数不少于 10 款的 8 个风格（22 个细分风格中样本量更小的风格未纳入，故本文的生成结论只对这 8 个风格成立）；边际分布的可行性以生成值与真实样本的柯尔莫哥洛夫—斯米尔诺夫距离度量。为把「生成器本身的还原度」与「缺陷约束对边际的压平作用」区分开，本文同时给出不作约束的参照生成，并同时给出</w:t>
+        <w:t>全部风格生成样本中有阈值的缺陷化合物超阈值数量合计 0，即硬约束合规。该零违规结果不衡量无约束生成的真实性；受约束后的边际可能因拒绝重抽和单调压缩而发生分布压缩。生成覆盖附件中真实样本数不少于 10 款的 8 个风格（22 个细分风格中样本量更小的风格未纳入，故本文的生成结论只对这 8 个风格成立）；边际分布的可行性以生成值与真实样本的柯尔莫哥洛夫—斯米尔诺夫距离度量。为把「生成器本身的还原度」与「缺陷约束对边际的压平作用」区分开，本文同时给出不作约束的参照生成，并同时给出</w:t>
       </w:r>
       <w:r>
         <w:rPr>
@@ -15749,7 +15785,7 @@
           <w:b w:val="0"/>
           <w:sz w:val="21"/>
         </w:rPr>
-        <w:t>参照量：受约束谱的 KS 中位数为 0.1780，无约束参照谱为 0.1207；其一是「同分布的两个随机样本之间」的期望值 0.2229，其二是「完美复现该风格经验边际」时的经验匹配地板 0.0411（由真实样本自助重采样得到）。可见无约束参照谱明显优于同分布随机样本的期望值，说明生成器本身优于随机重抽；但与经验匹配地板相比仍高出一个量级，说明</w:t>
+        <w:t>参照量：受约束谱的 KS 中位数为 0.1780，无约束参照谱为 0.1207；其一是「同分布的两个随机样本之间」的期望值 0.2229，其二是「完美复现该风格经验边际」时的经验匹配地板 0.0411（由真实样本自助重采样得到）。在当前参照下，无约束参照谱距离小于同分布随机重抽的期望距离；但与经验匹配地板相比仍高出一个量级，说明</w:t>
       </w:r>
       <w:r>
         <w:rPr>
@@ -15765,7 +15801,7 @@
           <w:b w:val="0"/>
           <w:sz w:val="21"/>
         </w:rPr>
-        <w:t>——本文只主张其「不劣于随机重抽且结构性可用」，不主张精确还原。受约束谱之所以偏离，是拒绝重抽把分布条件化到缺陷项低尾的结果——当某风格的真实样本本身大量超过阈值时，这一条件化尤为强烈。生成值落在真实风格取值区间内的比例中位数为 0.916。因此本文的两套生成谱分别对应「合规画像」与「风格代表性画像」两种用途，不可混用。</w:t>
+        <w:t>——因此本文只主张其在当前参照下具有结构性可用性，不把该差异解释为生成真实性或因果证据。受约束谱之所以偏离，是拒绝重抽把分布条件化到缺陷项低尾的结果——当某风格的真实样本本身大量超过阈值时，这一条件化尤为强烈。生成值落在真实风格取值区间内的比例中位数为 0.916。因此本文的两套生成谱分别对应「合规画像」与「风格代表性画像」两种用途，不可混用。</w:t>
       </w:r>
     </w:p>
     <w:p>
@@ -15806,6 +15842,9 @@
         <w:gridCol w:w="1134"/>
       </w:tblGrid>
       <w:tr>
+        <w:trPr>
+          <w:tblHeader w:val="true"/>
+        </w:trPr>
         <w:tc>
           <w:tcPr>
             <w:tcW w:type="dxa" w:w="1134"/>
@@ -18979,7 +19018,7 @@
           <w:b w:val="0"/>
           <w:sz w:val="21"/>
         </w:rPr>
-        <w:t>（4）问题三以全局 Copula 结构加风格条件边际生成化合谱，在缺陷阈值约束下实现了零违规，并以秩—分位映射完成跨风格迁移，迁移后各缺陷化合物均不恶化。相关结构的保持程度需并置两个数字看：迁移前后斯皮尔曼相关系数的</w:t>
+        <w:t>（4）问题三以全局 Copula 结构加风格条件边际生成化合谱，在缺陷阈值约束下实现了零违规；这里的零违规只表示硬约束合规，不等同于无约束生成真实性，且受约束后的边际会发生分布压缩。并以秩—分位映射完成跨风格迁移，迁移后各缺陷化合物均不恶化。相关结构的保持程度需并置两个数字看：迁移前后斯皮尔曼相关系数的</w:t>
       </w:r>
       <w:r>
         <w:rPr>
@@ -19011,23 +19050,7 @@
           <w:b w:val="0"/>
           <w:sz w:val="21"/>
         </w:rPr>
-        <w:t>的最大偏差明显更大（见 5.5 节），即整体分布形态得以保持而个别化合物对仍会被重排，故本文只作「整体结构基本保持」的表述。本文通过并列给出不作约束的参照生成，证明了生成器本身</w:t>
-      </w:r>
-      <w:r>
-        <w:rPr>
-          <w:rFonts w:ascii="Times New Roman" w:hAnsi="Times New Roman" w:eastAsia="宋体"/>
-          <w:b/>
-          <w:sz w:val="21"/>
-        </w:rPr>
-        <w:t>优于同分布随机重抽</w:t>
-      </w:r>
-      <w:r>
-        <w:rPr>
-          <w:rFonts w:ascii="Times New Roman" w:hAnsi="Times New Roman" w:eastAsia="宋体"/>
-          <w:b w:val="0"/>
-          <w:sz w:val="21"/>
-        </w:rPr>
-        <w:t>（无约束参照谱的边际距离明显优于同分布随机样本的期望值），但与「完美复现风格经验边际」的经验匹配地板相比仍高出一个量级，故本文只主张生成谱「不劣于随机重抽且结构性可用」，不主张精确还原真实边际；受约束谱的边际偏移来自拒绝重抽对缺陷项低尾的条件化，而非生成器的还原能力不足。一个值得注意的发现是：约束对感官画像的影响方向随维度而异——对二甲基硫醚与 4-乙烯基愈创木酚压低浓度即拉低评分，而对双乙酰与 trans-2-壬烯醛，由于其浓度与感官在训练数据中呈弱负相关，压低浓度反而使预测评分略有升高，说明约束效应必须逐维度判读。</w:t>
+        <w:t>的最大偏差明显更大（见 5.5 节），即整体分布形态得以保持而个别化合物对仍会被重排，故本文只作「整体结构基本保持」的表述。本文通过并列给出不作约束的参照生成，发现其在当前参照下距离小于同分布随机重抽的期望距离，但与「完美复现风格经验边际」的经验匹配地板相比仍高出一个量级，故本文只主张其在当前参照下具有结构性可用性，不主张精确还原真实边际；受约束谱的边际偏移来自拒绝重抽对缺陷项低尾的条件化，而非生成器的还原能力不足。一个值得注意的发现是：约束对感官画像的影响方向随维度而异——对二甲基硫醚与 4-乙烯基愈创木酚压低浓度即拉低评分，而对双乙酰与 trans-2-壬烯醛，由于其浓度与感官在训练数据中呈弱负相关，压低浓度反而使预测评分略有升高，说明约束效应必须逐维度判读。</w:t>
       </w:r>
     </w:p>
     <w:p>
@@ -19120,6 +19143,7 @@
     </w:p>
     <w:p>
       <w:pPr>
+        <w:keepLines/>
         <w:spacing w:after="40" w:line="324" w:lineRule="auto"/>
         <w:ind w:firstLine="0"/>
       </w:pPr>
@@ -19134,6 +19158,7 @@
     </w:p>
     <w:p>
       <w:pPr>
+        <w:keepLines/>
         <w:spacing w:after="40" w:line="324" w:lineRule="auto"/>
         <w:ind w:firstLine="0"/>
       </w:pPr>
@@ -19148,6 +19173,7 @@
     </w:p>
     <w:p>
       <w:pPr>
+        <w:keepLines/>
         <w:spacing w:after="40" w:line="324" w:lineRule="auto"/>
         <w:ind w:firstLine="0"/>
       </w:pPr>
@@ -19162,6 +19188,7 @@
     </w:p>
     <w:p>
       <w:pPr>
+        <w:keepLines/>
         <w:spacing w:after="40" w:line="324" w:lineRule="auto"/>
         <w:ind w:firstLine="0"/>
       </w:pPr>
@@ -19176,6 +19203,7 @@
     </w:p>
     <w:p>
       <w:pPr>
+        <w:keepLines/>
         <w:spacing w:after="40" w:line="324" w:lineRule="auto"/>
         <w:ind w:firstLine="0"/>
       </w:pPr>
@@ -19190,6 +19218,7 @@
     </w:p>
     <w:p>
       <w:pPr>
+        <w:keepLines/>
         <w:spacing w:after="40" w:line="324" w:lineRule="auto"/>
         <w:ind w:firstLine="0"/>
       </w:pPr>
@@ -19204,6 +19233,7 @@
     </w:p>
     <w:p>
       <w:pPr>
+        <w:keepLines/>
         <w:spacing w:after="40" w:line="324" w:lineRule="auto"/>
         <w:ind w:firstLine="0"/>
       </w:pPr>
@@ -19218,6 +19248,7 @@
     </w:p>
     <w:p>
       <w:pPr>
+        <w:keepLines/>
         <w:spacing w:after="40" w:line="324" w:lineRule="auto"/>
         <w:ind w:firstLine="0"/>
       </w:pPr>
@@ -19232,6 +19263,7 @@
     </w:p>
     <w:p>
       <w:pPr>
+        <w:keepLines/>
         <w:spacing w:after="40" w:line="324" w:lineRule="auto"/>
         <w:ind w:firstLine="0"/>
       </w:pPr>
@@ -19246,6 +19278,7 @@
     </w:p>
     <w:p>
       <w:pPr>
+        <w:keepLines/>
         <w:spacing w:after="40" w:line="324" w:lineRule="auto"/>
         <w:ind w:firstLine="0"/>
       </w:pPr>
@@ -19260,6 +19293,7 @@
     </w:p>
     <w:p>
       <w:pPr>
+        <w:keepLines/>
         <w:spacing w:after="40" w:line="324" w:lineRule="auto"/>
         <w:ind w:firstLine="0"/>
       </w:pPr>
@@ -19274,6 +19308,7 @@
     </w:p>
     <w:p>
       <w:pPr>
+        <w:keepLines/>
         <w:spacing w:after="40" w:line="324" w:lineRule="auto"/>
         <w:ind w:firstLine="0"/>
       </w:pPr>
@@ -19288,6 +19323,7 @@
     </w:p>
     <w:p>
       <w:pPr>
+        <w:keepLines/>
         <w:spacing w:after="40" w:line="324" w:lineRule="auto"/>
         <w:ind w:firstLine="0"/>
       </w:pPr>
@@ -19302,6 +19338,7 @@
     </w:p>
     <w:p>
       <w:pPr>
+        <w:keepLines/>
         <w:spacing w:after="40" w:line="324" w:lineRule="auto"/>
         <w:ind w:firstLine="0"/>
       </w:pPr>
@@ -19316,6 +19353,7 @@
     </w:p>
     <w:p>
       <w:pPr>
+        <w:keepLines/>
         <w:spacing w:after="40" w:line="324" w:lineRule="auto"/>
         <w:ind w:firstLine="0"/>
       </w:pPr>
@@ -19330,6 +19368,7 @@
     </w:p>
     <w:p>
       <w:pPr>
+        <w:keepLines/>
         <w:spacing w:after="40" w:line="324" w:lineRule="auto"/>
         <w:ind w:firstLine="0"/>
       </w:pPr>
@@ -19344,6 +19383,7 @@
     </w:p>
     <w:p>
       <w:pPr>
+        <w:keepLines/>
         <w:spacing w:after="40" w:line="324" w:lineRule="auto"/>
         <w:ind w:firstLine="0"/>
       </w:pPr>
@@ -19358,6 +19398,7 @@
     </w:p>
     <w:p>
       <w:pPr>
+        <w:keepLines/>
         <w:spacing w:after="40" w:line="324" w:lineRule="auto"/>
         <w:ind w:firstLine="0"/>
       </w:pPr>
@@ -19372,6 +19413,7 @@
     </w:p>
     <w:p>
       <w:pPr>
+        <w:keepLines/>
         <w:spacing w:after="40" w:line="324" w:lineRule="auto"/>
         <w:ind w:firstLine="0"/>
       </w:pPr>
@@ -19386,6 +19428,7 @@
     </w:p>
     <w:p>
       <w:pPr>
+        <w:keepLines/>
         <w:spacing w:after="40" w:line="324" w:lineRule="auto"/>
         <w:ind w:firstLine="0"/>
       </w:pPr>
@@ -19400,6 +19443,7 @@
     </w:p>
     <w:p>
       <w:pPr>
+        <w:keepLines/>
         <w:spacing w:after="40" w:line="324" w:lineRule="auto"/>
         <w:ind w:firstLine="0"/>
       </w:pPr>
@@ -19414,6 +19458,7 @@
     </w:p>
     <w:p>
       <w:pPr>
+        <w:keepLines/>
         <w:spacing w:after="40" w:line="324" w:lineRule="auto"/>
         <w:ind w:firstLine="0"/>
       </w:pPr>
@@ -19428,6 +19473,7 @@
     </w:p>
     <w:p>
       <w:pPr>
+        <w:keepLines/>
         <w:spacing w:after="40" w:line="324" w:lineRule="auto"/>
         <w:ind w:firstLine="0"/>
       </w:pPr>
@@ -19442,6 +19488,7 @@
     </w:p>
     <w:p>
       <w:pPr>
+        <w:keepLines/>
         <w:spacing w:after="40" w:line="324" w:lineRule="auto"/>
         <w:ind w:firstLine="0"/>
       </w:pPr>
@@ -19456,6 +19503,7 @@
     </w:p>
     <w:p>
       <w:pPr>
+        <w:keepLines/>
         <w:spacing w:after="40" w:line="324" w:lineRule="auto"/>
         <w:ind w:firstLine="0"/>
       </w:pPr>
@@ -19470,6 +19518,7 @@
     </w:p>
     <w:p>
       <w:pPr>
+        <w:keepLines/>
         <w:spacing w:after="40" w:line="324" w:lineRule="auto"/>
         <w:ind w:firstLine="0"/>
       </w:pPr>
@@ -19484,6 +19533,7 @@
     </w:p>
     <w:p>
       <w:pPr>
+        <w:keepLines/>
         <w:spacing w:after="40" w:line="324" w:lineRule="auto"/>
         <w:ind w:firstLine="0"/>
       </w:pPr>
@@ -19498,6 +19548,7 @@
     </w:p>
     <w:p>
       <w:pPr>
+        <w:keepLines/>
         <w:spacing w:after="40" w:line="324" w:lineRule="auto"/>
         <w:ind w:firstLine="0"/>
       </w:pPr>
@@ -19512,6 +19563,7 @@
     </w:p>
     <w:p>
       <w:pPr>
+        <w:keepLines/>
         <w:spacing w:after="40" w:line="324" w:lineRule="auto"/>
         <w:ind w:firstLine="0"/>
       </w:pPr>
@@ -19526,6 +19578,7 @@
     </w:p>
     <w:p>
       <w:pPr>
+        <w:keepLines/>
         <w:spacing w:after="40" w:line="324" w:lineRule="auto"/>
         <w:ind w:firstLine="0"/>
       </w:pPr>
@@ -19540,6 +19593,7 @@
     </w:p>
     <w:p>
       <w:pPr>
+        <w:keepLines/>
         <w:spacing w:after="40" w:line="324" w:lineRule="auto"/>
         <w:ind w:firstLine="0"/>
       </w:pPr>
@@ -19554,6 +19608,7 @@
     </w:p>
     <w:p>
       <w:pPr>
+        <w:keepLines/>
         <w:spacing w:after="40" w:line="324" w:lineRule="auto"/>
         <w:ind w:firstLine="0"/>
       </w:pPr>
@@ -19568,6 +19623,7 @@
     </w:p>
     <w:p>
       <w:pPr>
+        <w:keepLines/>
         <w:spacing w:after="40" w:line="324" w:lineRule="auto"/>
         <w:ind w:firstLine="0"/>
       </w:pPr>
@@ -19582,6 +19638,7 @@
     </w:p>
     <w:p>
       <w:pPr>
+        <w:keepLines/>
         <w:spacing w:after="40" w:line="324" w:lineRule="auto"/>
         <w:ind w:firstLine="0"/>
       </w:pPr>
@@ -19596,6 +19653,7 @@
     </w:p>
     <w:p>
       <w:pPr>
+        <w:keepLines/>
         <w:spacing w:after="40" w:line="324" w:lineRule="auto"/>
         <w:ind w:firstLine="0"/>
       </w:pPr>
@@ -19610,6 +19668,7 @@
     </w:p>
     <w:p>
       <w:pPr>
+        <w:keepLines/>
         <w:spacing w:after="40" w:line="324" w:lineRule="auto"/>
         <w:ind w:firstLine="0"/>
       </w:pPr>
@@ -19619,7 +19678,52 @@
           <w:b w:val="0"/>
           <w:sz w:val="19"/>
         </w:rPr>
-        <w:t>本论文使用的人工智能工具：[36] MiniMax Code，模型 MiniMax-M3.1-Flash，开发机构 MiniMax，使用日期 2026-10-29。（参考文献来源：docs/refs_verified.json）</w:t>
+        <w:t>[36] Ma J, Thomas V, Hosseinzadeh R, et al，TabDPT: Scaling Tabular Foundation Models on Real Data[C]//Advances in Neural Information Processing Systems 38, 2025.</w:t>
+      </w:r>
+    </w:p>
+    <w:p>
+      <w:pPr>
+        <w:keepLines/>
+        <w:spacing w:after="40" w:line="324" w:lineRule="auto"/>
+        <w:ind w:firstLine="0"/>
+      </w:pPr>
+      <w:r>
+        <w:rPr>
+          <w:rFonts w:ascii="Times New Roman" w:hAnsi="Times New Roman" w:eastAsia="宋体"/>
+          <w:b w:val="0"/>
+          <w:sz w:val="19"/>
+        </w:rPr>
+        <w:t>[37] Sun S, Yu R，Copula Conformal prediction for multi-step time series prediction[C]//International Conference on Learning Representations 2024, 2024.</w:t>
+      </w:r>
+    </w:p>
+    <w:p>
+      <w:pPr>
+        <w:keepLines/>
+        <w:spacing w:after="40" w:line="324" w:lineRule="auto"/>
+        <w:ind w:firstLine="0"/>
+      </w:pPr>
+      <w:r>
+        <w:rPr>
+          <w:rFonts w:ascii="Times New Roman" w:hAnsi="Times New Roman" w:eastAsia="宋体"/>
+          <w:b w:val="0"/>
+          <w:sz w:val="19"/>
+        </w:rPr>
+        <w:t>[38] Chen Y, Huang H, Yin R, He X, Guo L, Song Y, Zhao D, Sun J, Li J, Huang M, Sun B，Multi-Technique Flavoromics for Identifying Key Differential Volatile Compounds Underlying Sensory Profiles in Lager Beers，Foods，14(19)：3428，2025. DOI: 10.3390/foods14193428.</w:t>
+      </w:r>
+    </w:p>
+    <w:p>
+      <w:pPr>
+        <w:keepLines/>
+        <w:spacing w:after="40" w:line="324" w:lineRule="auto"/>
+        <w:ind w:firstLine="0"/>
+      </w:pPr>
+      <w:r>
+        <w:rPr>
+          <w:rFonts w:ascii="Times New Roman" w:hAnsi="Times New Roman" w:eastAsia="宋体"/>
+          <w:b w:val="0"/>
+          <w:sz w:val="19"/>
+        </w:rPr>
+        <w:t>本论文使用的人工智能工具：[39] MiniMax Code，模型 MiniMax-M3.1-Flash，开发机构 MiniMax，使用日期 2026-10-29。（参考文献来源：docs/refs_verified.json）</w:t>
       </w:r>
     </w:p>
     <w:p>
@@ -20731,6 +20835,19 @@
           <w:b w:val="0"/>
           <w:sz w:val="18"/>
         </w:rPr>
+        <w:t>其他工具与辅助脚本：build_release_manifest.py</w:t>
+      </w:r>
+    </w:p>
+    <w:p>
+      <w:pPr>
+        <w:spacing w:after="60" w:line="324" w:lineRule="auto"/>
+      </w:pPr>
+      <w:r>
+        <w:rPr>
+          <w:rFonts w:ascii="Times New Roman" w:hAnsi="Times New Roman" w:eastAsia="宋体"/>
+          <w:b w:val="0"/>
+          <w:sz w:val="18"/>
+        </w:rPr>
         <w:t>图表风格与论文产出：build_ai_usage_doc.py、build_paper.py、plot_style.py</w:t>
       </w:r>
     </w:p>
@@ -20835,7 +20952,7 @@
           <w:b w:val="0"/>
           <w:sz w:val="18"/>
         </w:rPr>
-        <w:t>以上合计 57 个源程序文件，随支撑材料 ZIP 一并提供，可据以逐条复算本文的数值结论。</w:t>
+        <w:t>以上合计 58 个源程序文件，随支撑材料 ZIP 一并提供，可据以逐条复算本文的数值结论。</w:t>
       </w:r>
     </w:p>
     <w:p>
@@ -20861,7 +20978,7 @@
           <w:b w:val="0"/>
           <w:sz w:val="18"/>
         </w:rPr>
-        <w:t>单元测试（tests_q1/）：conftest.py、test_q1_deliverables.py</w:t>
+        <w:t>单元测试（tests_q1/）：conftest.py、test_absolute_summary.py、test_q1_deliverables.py</w:t>
       </w:r>
     </w:p>
     <w:p>
@@ -20992,7 +21109,7 @@
           <w:b w:val="0"/>
           <w:sz w:val="18"/>
         </w:rPr>
-        <w:t>文献著录清单存放于 docs/refs_verified.json，论文的参考文献列表由该文件自动生成（按 citation_number 排序，期刊/图书/会议/网络资源四类分别按赛题格式著录），与人读版 docs/literature.md 一一对应；本次构建使用的即为该自动路径，引用条目共 35 条。若该文件缺失，构建脚本会退回到手写清单并在构建日志中打印告警。</w:t>
+        <w:t>文献著录清单存放于 docs/refs_verified.json，论文的参考文献列表由该文件自动生成（按 citation_number 排序，期刊/图书/会议/网络资源四类分别按赛题格式著录），与人读版 docs/literature.md 一一对应；本次构建使用的即为该自动路径，引用条目共 38 条。</w:t>
       </w:r>
     </w:p>
     <w:sectPr>

</xml_diff>

<commit_message>
nightly(q123): review and harden overnight outputs 20261030
</commit_message>
<xml_diff>
--- a/data/processed/paper/paper.docx
+++ b/data/processed/paper/paper.docx
@@ -985,7 +985,7 @@
           <w:sz w:val="20"/>
         </w:rPr>
         <w:tab/>
-        <w:t>11</w:t>
+        <w:t>12</w:t>
       </w:r>
     </w:p>
     <w:p>
@@ -1011,7 +1011,7 @@
           <w:sz w:val="20"/>
         </w:rPr>
         <w:tab/>
-        <w:t>14</w:t>
+        <w:t>15</w:t>
       </w:r>
     </w:p>
     <w:p>
@@ -1037,7 +1037,7 @@
           <w:sz w:val="20"/>
         </w:rPr>
         <w:tab/>
-        <w:t>18</w:t>
+        <w:t>19</w:t>
       </w:r>
     </w:p>
     <w:p>
@@ -1063,7 +1063,7 @@
           <w:sz w:val="20"/>
         </w:rPr>
         <w:tab/>
-        <w:t>21</w:t>
+        <w:t>22</w:t>
       </w:r>
     </w:p>
     <w:p>
@@ -1089,7 +1089,7 @@
           <w:sz w:val="20"/>
         </w:rPr>
         <w:tab/>
-        <w:t>25</w:t>
+        <w:t>26</w:t>
       </w:r>
     </w:p>
     <w:p>
@@ -1115,7 +1115,7 @@
           <w:sz w:val="20"/>
         </w:rPr>
         <w:tab/>
-        <w:t>25</w:t>
+        <w:t>26</w:t>
       </w:r>
     </w:p>
     <w:p>
@@ -1141,7 +1141,7 @@
           <w:sz w:val="20"/>
         </w:rPr>
         <w:tab/>
-        <w:t>26</w:t>
+        <w:t>27</w:t>
       </w:r>
     </w:p>
     <w:p>
@@ -1167,7 +1167,7 @@
           <w:sz w:val="20"/>
         </w:rPr>
         <w:tab/>
-        <w:t>26</w:t>
+        <w:t>27</w:t>
       </w:r>
     </w:p>
     <w:p/>
@@ -2657,7 +2657,7 @@
           <w:b w:val="0"/>
           <w:sz w:val="21"/>
         </w:rPr>
-        <w:t>问题一以 1.csv 的化合物特征预测 50 个感官维度。特征取统一标度后的 227 个化学量，剔除 4 个公式未经验证的派生求和列；模型采用岭回归、偏最小二乘回归、多任务弹性网络、全局与分组极端随机树、逐指标梯度提升回归共七个主模型族；另保留 TabPFN 3.5 的队友协议五折复现，以覆盖线性低秩、强稀疏与树形非线性三类归纳偏置。主指标为宏平均均方根误差，并同时报告宏平均绝对误差、逐维决定系数中位数、斯皮尔曼相关系数中位数。</w:t>
+        <w:t>问题一以 1.csv 的化合物特征预测 50 个感官维度。特征取统一标度后的 227 个化学量，剔除 4 个公式未经验证的派生求和列；模型采用岭回归、偏最小二乘回归、多任务弹性网络、全局与分组极端随机树、逐指标梯度提升回归共七个主模型族；另保留 TabPFN 3.5 的队友协议五折复现，以覆盖线性低秩、强稀疏与树形非线性三类归纳偏置。该复现使用 231 个原始特征和 KFold，与主模型的 227 特征、固定 175/75 留出协议不同，只作协议核对，不参与主模型优劣排序。主指标为宏平均均方根误差，并同时报告宏平均绝对误差、逐维决定系数中位数、斯皮尔曼相关系数中位数。</w:t>
       </w:r>
     </w:p>
     <w:p>
@@ -2905,7 +2905,7 @@
           <w:b w:val="0"/>
           <w:sz w:val="21"/>
         </w:rPr>
-        <w:t>第三，外部价值信号：8.xlsx 给出 7 个零售来源的逐款价格，其中覆盖 ≥2 家零售商的共 189 款可计算几何均价（GM）；本文以价格为外部价值代理，回归中控制酒精度与风格，并明确其局限——价格来自单一零售体系，是市场价值的代理而非消费者效用本身。</w:t>
+        <w:t>第三，外部价值信号：8.xlsx 给出 7 个零售来源的逐款价格，其中覆盖 ≥2 家零售商的共 189 款可计算几何均价（GM）；本文以价格为外部价值代理，回归中控制酒精度与风格，并明确其局限——价格来自同一附件内 7 家零售商的跨币种报价，未做汇率换算，是市场价值的代理而非消费者效用本身。</w:t>
       </w:r>
       <w:r>
         <w:rPr>
@@ -7632,7 +7632,7 @@
           <w:b w:val="0"/>
           <w:sz w:val="21"/>
         </w:rPr>
-        <w:t>价格回归以可算几何均价的 189 款样品为样本，并列给出 3 组模型：ols；ols_with_abv；fixed_effects（依次为不控变量、控制酒精度、控制酒精度并加入风格固定效应）。ols 的 R² = 0.340、ols_with_abv 的 R² = 0.366、fixed_effects 的 R² = 0.472，在 8 个可跨模型比较的描述符项中，有 8 项的系数符号在三个模型间保持一致，说明化学—感知组合携带的信息不完全由酒精度与风格标签解释。需要强调其边界：价格来自单一零售体系，是市场价值的代理，</w:t>
+        <w:t>价格回归以可算几何均价的 189 款样品为样本，并列给出 3 组模型：ols；ols_with_abv；fixed_effects（依次为不控变量、控制酒精度、控制酒精度并加入风格固定效应）。ols 的 R² = 0.340、ols_with_abv 的 R² = 0.366、fixed_effects 的 R² = 0.472，在 8 个可跨模型比较的描述符项中，有 8 项的系数符号在三个模型间保持一致，说明化学—感知组合携带的信息不完全由酒精度与风格标签解释。需要强调其边界：价格来自同一附件内 7 家零售商的跨币种报价，且未做汇率换算，是市场价值的代理，</w:t>
       </w:r>
       <w:r>
         <w:rPr>
@@ -7842,7 +7842,7 @@
           <w:b w:val="0"/>
           <w:sz w:val="18"/>
         </w:rPr>
-        <w:t>图 6  价格部分效应。三个设定下 log 价格对各感官维度的偏回归系数及 95% 置信区间：ols（R²=0.340）、ols_with_abv（加入 ABV，R²=0.366）、fixed_effects（再加入风格固定效应、按风格聚类稳健标准误，R²=0.472），样本量 n=189（仅含 ≥2 家零售报价的啤酒）。价格来自单一零售源附件，此处仅作为外部价值信号，不作市场因果解释。</w:t>
+        <w:t>图 6  价格部分效应。三个设定下 log 价格对各感官维度的偏回归系数及 95% 置信区间：ols（R²=0.340）、ols_with_abv（加入 ABV，R²=0.366）、fixed_effects（再加入风格固定效应、按风格聚类稳健标准误，R²=0.472），样本量 n=189（仅含 ≥2 家零售报价的啤酒）。价格来自同一附件内 7 家零售商的跨币种报价，未做汇率换算；此处仅作为外部价值信号，不作市场因果解释。</w:t>
       </w:r>
     </w:p>
     <w:p>
@@ -12044,13 +12044,27 @@
     </w:p>
     <w:p>
       <w:pPr>
+        <w:spacing w:after="80" w:line="324" w:lineRule="auto"/>
+        <w:ind w:firstLine="420"/>
+      </w:pPr>
+      <w:r>
+        <w:rPr>
+          <w:rFonts w:ascii="Times New Roman" w:hAnsi="Times New Roman" w:eastAsia="宋体"/>
+          <w:b w:val="0"/>
+          <w:sz w:val="21"/>
+        </w:rPr>
+        <w:t>为检验上述候选项能否在独立样本中复现，本文仅在 175 个训练样本上重选 150 个 Top-3 候选，再在固定的 75 个留出样本上进行 5000 次双侧置换检验，并对全部 150 项统一执行 Benjamini–Hochberg 校正。其中 83 项通过 q≤0.05；主结果中判为稳健的 32 项全部被训练集重选保留且方向一致，其中 30 项通过留出集 FDR，同时满足稳健与化学合理性的 9 项全部通过。这只是关联的独立样本复现，不验证化学机理，也不构成因果证据。</w:t>
+      </w:r>
+    </w:p>
+    <w:p>
+      <w:pPr>
         <w:spacing w:before="80"/>
         <w:jc w:val="center"/>
       </w:pPr>
       <w:r>
         <w:drawing>
           <wp:inline xmlns:a="http://schemas.openxmlformats.org/drawingml/2006/main" xmlns:pic="http://schemas.openxmlformats.org/drawingml/2006/picture">
-            <wp:extent cx="4206240" cy="4783075"/>
+            <wp:extent cx="4206240" cy="4068907"/>
             <wp:docPr id="8" name="Picture 8"/>
             <wp:cNvGraphicFramePr>
               <a:graphicFrameLocks noChangeAspect="1"/>
@@ -12071,7 +12085,7 @@
                   <pic:spPr>
                     <a:xfrm>
                       <a:off x="0" y="0"/>
-                      <a:ext cx="4206240" cy="4783075"/>
+                      <a:ext cx="4206240" cy="4068907"/>
                     </a:xfrm>
                     <a:prstGeom prst="rect"/>
                   </pic:spPr>
@@ -12093,7 +12107,7 @@
           <w:b w:val="0"/>
           <w:sz w:val="18"/>
         </w:rPr>
-        <w:t>图 7  共表达网络（按来源）。基于 2.csv 的斯皮尔曼相关，取 |ρ| ≥ 0.6 的边构成网络：全图 231 节点 / 266 边、114 个连通分量，其中 101 个节点在该阈值下不含任何关联边（孤立节点）而未绘出，其来源构成见后文的「社区化学成分」图；本图绘出 130 个有边节点。节点大小 = 度数，边粗细 = |ρ|，橙红描边为缺陷化合物；节点按化学来源着色；仅标注度数最高的 6 个节点，完整节点清单见支撑材料表。</w:t>
+        <w:t>图 7  共表达网络（按来源）。基于 2.csv 的斯皮尔曼相关，取 |ρ| ≥ 0.6 的边构成网络：全图 231 节点 / 266 边、114 个连通分量，其中 101 个节点在该阈值下不含任何关联边（孤立节点）而未绘出，其来源构成见支撑材料社区成员表；本图绘出 130 个有边节点。节点大小 = 度数，边粗细 = |ρ|，橙红描边为缺陷化合物；节点按化学来源着色；右侧按度数由高到低列出 6 个节点；完整节点清单见支撑材料表。</w:t>
       </w:r>
     </w:p>
     <w:p>
@@ -15769,39 +15783,21 @@
           <w:b w:val="0"/>
           <w:sz w:val="21"/>
         </w:rPr>
-        <w:t>全部风格生成样本中有阈值的缺陷化合物超阈值数量合计 0，即硬约束合规。该零违规结果不衡量无约束生成的真实性；受约束后的边际可能因拒绝重抽和单调压缩而发生分布压缩。生成覆盖附件中真实样本数不少于 10 款的 8 个风格（22 个细分风格中样本量更小的风格未纳入，故本文的生成结论只对这 8 个风格成立）；边际分布的可行性以生成值与真实样本的柯尔莫哥洛夫—斯米尔诺夫距离度量。为把「生成器本身的还原度」与「缺陷约束对边际的压平作用」区分开，本文同时给出不作约束的参照生成，并同时给出</w:t>
-      </w:r>
-      <w:r>
-        <w:rPr>
-          <w:rFonts w:ascii="Times New Roman" w:hAnsi="Times New Roman" w:eastAsia="宋体"/>
-          <w:b/>
+        <w:t>8 个纳入风格的受约束生成谱中，缺陷化合物超阈值数量合计 0，表示硬约束合规，不表示生成真实性。受约束谱与无约束谱的全量拟合 KS 中位数分别为 0.1780 和 0.1207，经验匹配地板为 0.0411；生成值落在真实风格区间内的比例中位数为 0.916。这些指标在用于定义经验边际的同一批样本上计算，只作拟合诊断。受约束谱用于合规画像，无约束谱用于风格代表性参照，两者不可混用。</w:t>
+      </w:r>
+    </w:p>
+    <w:p>
+      <w:pPr>
+        <w:spacing w:after="80" w:line="324" w:lineRule="auto"/>
+        <w:ind w:firstLine="420"/>
+      </w:pPr>
+      <w:r>
+        <w:rPr>
+          <w:rFonts w:ascii="Times New Roman" w:hAnsi="Times New Roman" w:eastAsia="宋体"/>
+          <w:b w:val="0"/>
           <w:sz w:val="21"/>
         </w:rPr>
-        <w:t>两个</w:t>
-      </w:r>
-      <w:r>
-        <w:rPr>
-          <w:rFonts w:ascii="Times New Roman" w:hAnsi="Times New Roman" w:eastAsia="宋体"/>
-          <w:b w:val="0"/>
-          <w:sz w:val="21"/>
-        </w:rPr>
-        <w:t>参照量：受约束谱的 KS 中位数为 0.1780，无约束参照谱为 0.1207；其一是「同分布的两个随机样本之间」的期望值 0.2229，其二是「完美复现该风格经验边际」时的经验匹配地板 0.0411（由真实样本自助重采样得到）。在当前参照下，无约束参照谱距离小于同分布随机重抽的期望距离；但与经验匹配地板相比仍高出一个量级，说明</w:t>
-      </w:r>
-      <w:r>
-        <w:rPr>
-          <w:rFonts w:ascii="Times New Roman" w:hAnsi="Times New Roman" w:eastAsia="宋体"/>
-          <w:b/>
-          <w:sz w:val="21"/>
-        </w:rPr>
-        <w:t>生成谱并未接近完美复现真实边际</w:t>
-      </w:r>
-      <w:r>
-        <w:rPr>
-          <w:rFonts w:ascii="Times New Roman" w:hAnsi="Times New Roman" w:eastAsia="宋体"/>
-          <w:b w:val="0"/>
-          <w:sz w:val="21"/>
-        </w:rPr>
-        <w:t>——因此本文只主张其在当前参照下具有结构性可用性，不把该差异解释为生成真实性或因果证据。受约束谱之所以偏离，是拒绝重抽把分布条件化到缺陷项低尾的结果——当某风格的真实样本本身大量超过阈值时，这一条件化尤为强烈。生成值落在真实风格取值区间内的比例中位数为 0.916。因此本文的两套生成谱分别对应「合规画像」与「风格代表性画像」两种用途，不可混用。</w:t>
+        <w:t>进一步的固定留出检验覆盖 8 个风格、3 个划分种子和 2 种 Copula 估计，共 48 个评估单元；每个风格的真实留出样本仅 3-9 款。真实样本参照、无约束生成与受约束生成的能量距离分别为 17.0075、16.9840 和 20.7664，MMD² 分别为 0.1746、0.1733 和 0.2040。受约束生成在 42/48 个单元上的能量距离更差，MMD² 亦为 42/48；与此同时，约束合规率从无约束的 13.5% 提升到 100.0%，候选接受率均值仅为 12.7%。因此，约束明确提高了规则合规性，却以可测的分布真实性损失为代价；同数据拟合并评估得到的全量 KS 仅作拟合诊断，不能替代该留出结论。</w:t>
       </w:r>
     </w:p>
     <w:p>
@@ -18774,7 +18770,7 @@
           <w:b/>
           <w:sz w:val="21"/>
         </w:rPr>
-        <w:t>消费者层缺少评分标签，价格来自单一零售源且未做币种换算。</w:t>
+        <w:t>消费者层缺少评分标签，价格为同一附件中的跨零售商报价且未做币种换算。</w:t>
       </w:r>
       <w:r>
         <w:rPr>
@@ -18782,7 +18778,7 @@
           <w:b w:val="0"/>
           <w:sz w:val="21"/>
         </w:rPr>
-        <w:t xml:space="preserve"> 本文无法构造也无法检验「消费者喜爱度」，只能以 183 维论坛派生描述符作为感知代理；价格虽覆盖 7 个零售来源中 ≥2 家的 189 款，但仍属单一零售体系，是市场价值的代理而非消费者效用的直接测量；且 7 个来源分别以美元、英镑与欧元标价，附件不含汇率列，本文未做币种换算，log 价格中混有币种与卖方价格水平差异，故价格回归的解释力只能视为上界而非精确估计。</w:t>
+        <w:t xml:space="preserve"> 本文无法构造也无法检验「消费者喜爱度」，只能以 183 维论坛派生描述符作为感知代理；价格虽覆盖 7 个零售来源中 ≥2 家的 189 款，但 7 家零售商并非统一定价体系，价格只能作为市场价值代理而非消费者效用的直接测量；且 7 个来源分别以美元、英镑与欧元标价，附件不含汇率列，本文未做币种换算，log 价格中混有币种与卖方价格水平差异，故价格回归的解释力只能视为上界而非精确估计。</w:t>
       </w:r>
     </w:p>
     <w:p>
@@ -18834,7 +18830,7 @@
           <w:b/>
           <w:sz w:val="21"/>
         </w:rPr>
-        <w:t>Copula 只保留相关结构、不还原个体极端值。</w:t>
+        <w:t>Copula 的边际拟合不等于留出真实性。</w:t>
       </w:r>
       <w:r>
         <w:rPr>
@@ -18842,7 +18838,7 @@
           <w:b w:val="0"/>
           <w:sz w:val="21"/>
         </w:rPr>
-        <w:t xml:space="preserve"> 全局高斯 Copula 以单一高斯相关矩阵刻画全部依赖结构，无法表达非高斯尾部依赖，因此生成谱的边际分布可以还原、个体极端组合不可还原，这也是问题三中生成谱方差系统性小于真实分布的直接原因。</w:t>
+        <w:t xml:space="preserve"> 全局高斯 Copula 以单一高斯相关矩阵刻画全部依赖结构，无法表达非高斯尾部依赖；经验边际可在拟合样本上被重放，但不能据此推断对新样本的还原度。留出检验中每个风格仅有 3–9 款真实啤酒，且受约束生成在 42/48 个评估单元上的能量距离和 MMD² 均劣于无约束生成，所以本文只主张其具有结构性与约束可用性，不主张个体极端组合或完整真实分布已被还原。</w:t>
       </w:r>
     </w:p>
     <w:p>
@@ -19018,7 +19014,7 @@
           <w:b w:val="0"/>
           <w:sz w:val="21"/>
         </w:rPr>
-        <w:t>（4）问题三以全局 Copula 结构加风格条件边际生成化合谱，在缺陷阈值约束下实现了零违规；这里的零违规只表示硬约束合规，不等同于无约束生成真实性，且受约束后的边际会发生分布压缩。并以秩—分位映射完成跨风格迁移，迁移后各缺陷化合物均不恶化。相关结构的保持程度需并置两个数字看：迁移前后斯皮尔曼相关系数的</w:t>
+        <w:t>（4）问题三以全局 Copula 结构加风格条件边际生成化合谱，在缺陷阈值约束下实现了零违规；这里的零违规只表示硬约束合规，不等同于无约束生成真实性，且受约束后的边际会发生分布压缩。在 48 个留出评估单元中，受约束生成的能量距离和 MMD² 均有 42 个劣于无约束生成，而约束合规率由 13.5% 提升至 100%，表明合规提升与真实性损失必须同时报告。并以秩—分位映射完成跨风格迁移，迁移后各缺陷化合物均不恶化。相关结构的保持程度需并置两个数字看：迁移前后斯皮尔曼相关系数的</w:t>
       </w:r>
       <w:r>
         <w:rPr>
@@ -19144,14 +19140,14 @@
     <w:p>
       <w:pPr>
         <w:keepLines/>
-        <w:spacing w:after="40" w:line="324" w:lineRule="auto"/>
+        <w:spacing w:after="0" w:line="324" w:lineRule="auto"/>
         <w:ind w:firstLine="0"/>
       </w:pPr>
       <w:r>
         <w:rPr>
           <w:rFonts w:ascii="Times New Roman" w:hAnsi="Times New Roman" w:eastAsia="宋体"/>
           <w:b w:val="0"/>
-          <w:sz w:val="19"/>
+          <w:sz w:val="18"/>
         </w:rPr>
         <w:t>[1] Schreurs M, Piampongsant S, Roncoroni M, Cool L, Herrera-Malaver B, Vanderaa C, Theßeling F A, Kreft Ł, Botzki A, Malcorps P, Daenen L, Wenseleers T, Verstrepen K J，Predicting and improving complex beer flavor through machine learning，Nature Communications，15(1)：2368，2024. DOI: 10.1038/s41467-024-46346-0.</w:t>
       </w:r>
@@ -19159,14 +19155,14 @@
     <w:p>
       <w:pPr>
         <w:keepLines/>
-        <w:spacing w:after="40" w:line="324" w:lineRule="auto"/>
+        <w:spacing w:after="0" w:line="324" w:lineRule="auto"/>
         <w:ind w:firstLine="0"/>
       </w:pPr>
       <w:r>
         <w:rPr>
           <w:rFonts w:ascii="Times New Roman" w:hAnsi="Times New Roman" w:eastAsia="宋体"/>
           <w:b w:val="0"/>
-          <w:sz w:val="19"/>
+          <w:sz w:val="18"/>
         </w:rPr>
         <w:t>[2] Pedregosa F, Varoquaux G, Gramfort A, Michel V, Thirion B, Grisel O, Blondel M, Prettenhofer P, 等，Scikit-learn: Machine Learning in Python，https://jmlr.org/papers/v12/pedregosa11a.html，访问时间（2026年10月29日）。</w:t>
       </w:r>
@@ -19174,14 +19170,14 @@
     <w:p>
       <w:pPr>
         <w:keepLines/>
-        <w:spacing w:after="40" w:line="324" w:lineRule="auto"/>
+        <w:spacing w:after="0" w:line="324" w:lineRule="auto"/>
         <w:ind w:firstLine="0"/>
       </w:pPr>
       <w:r>
         <w:rPr>
           <w:rFonts w:ascii="Times New Roman" w:hAnsi="Times New Roman" w:eastAsia="宋体"/>
           <w:b w:val="0"/>
-          <w:sz w:val="19"/>
+          <w:sz w:val="18"/>
         </w:rPr>
         <w:t>[3] Lundberg S M, Lee S I，A Unified Approach to Interpreting Model Predictions，https://arxiv.org/abs/1705.07874，访问时间（2026年10月29日）。</w:t>
       </w:r>
@@ -19189,14 +19185,14 @@
     <w:p>
       <w:pPr>
         <w:keepLines/>
-        <w:spacing w:after="40" w:line="324" w:lineRule="auto"/>
+        <w:spacing w:after="0" w:line="324" w:lineRule="auto"/>
         <w:ind w:firstLine="0"/>
       </w:pPr>
       <w:r>
         <w:rPr>
           <w:rFonts w:ascii="Times New Roman" w:hAnsi="Times New Roman" w:eastAsia="宋体"/>
           <w:b w:val="0"/>
-          <w:sz w:val="19"/>
+          <w:sz w:val="18"/>
         </w:rPr>
         <w:t>[4] Hollmann N, Müller S, Eggensperger K, Hutter F，TabPFN: A Transformer That Solves Small Tabular Classification Problems in a Second，https://arxiv.org/abs/2207.01848，访问时间（2026年10月29日）。</w:t>
       </w:r>
@@ -19204,14 +19200,14 @@
     <w:p>
       <w:pPr>
         <w:keepLines/>
-        <w:spacing w:after="40" w:line="324" w:lineRule="auto"/>
+        <w:spacing w:after="0" w:line="324" w:lineRule="auto"/>
         <w:ind w:firstLine="0"/>
       </w:pPr>
       <w:r>
         <w:rPr>
           <w:rFonts w:ascii="Times New Roman" w:hAnsi="Times New Roman" w:eastAsia="宋体"/>
           <w:b w:val="0"/>
-          <w:sz w:val="19"/>
+          <w:sz w:val="18"/>
         </w:rPr>
         <w:t>[5] Traag V A, Waltman L, van Eck N J，From Louvain to Leiden: guaranteeing well-connected communities，Scientific Reports，9(1)：5233，2019. DOI: 10.1038/s41598-019-41695-z.</w:t>
       </w:r>
@@ -19219,14 +19215,14 @@
     <w:p>
       <w:pPr>
         <w:keepLines/>
-        <w:spacing w:after="40" w:line="324" w:lineRule="auto"/>
+        <w:spacing w:after="0" w:line="324" w:lineRule="auto"/>
         <w:ind w:firstLine="0"/>
       </w:pPr>
       <w:r>
         <w:rPr>
           <w:rFonts w:ascii="Times New Roman" w:hAnsi="Times New Roman" w:eastAsia="宋体"/>
           <w:b w:val="0"/>
-          <w:sz w:val="19"/>
+          <w:sz w:val="18"/>
         </w:rPr>
         <w:t>[6] Nelsen R B，An Introduction to Copulas[M]. New York: Springer（Springer Series in Statistics）, 2006.</w:t>
       </w:r>
@@ -19234,14 +19230,14 @@
     <w:p>
       <w:pPr>
         <w:keepLines/>
-        <w:spacing w:after="40" w:line="324" w:lineRule="auto"/>
+        <w:spacing w:after="0" w:line="324" w:lineRule="auto"/>
         <w:ind w:firstLine="0"/>
       </w:pPr>
       <w:r>
         <w:rPr>
           <w:rFonts w:ascii="Times New Roman" w:hAnsi="Times New Roman" w:eastAsia="宋体"/>
           <w:b w:val="0"/>
-          <w:sz w:val="19"/>
+          <w:sz w:val="18"/>
         </w:rPr>
         <w:t>[7] Iman R L, Conover W J，A distribution-free approach to inducing rank correlation among input variables，Communications in Statistics - Simulation and Computation，11(3)：311-334，1982. DOI: 10.1080/03610918208812265.</w:t>
       </w:r>
@@ -19249,14 +19245,14 @@
     <w:p>
       <w:pPr>
         <w:keepLines/>
-        <w:spacing w:after="40" w:line="324" w:lineRule="auto"/>
+        <w:spacing w:after="0" w:line="324" w:lineRule="auto"/>
         <w:ind w:firstLine="0"/>
       </w:pPr>
       <w:r>
         <w:rPr>
           <w:rFonts w:ascii="Times New Roman" w:hAnsi="Times New Roman" w:eastAsia="宋体"/>
           <w:b w:val="0"/>
-          <w:sz w:val="19"/>
+          <w:sz w:val="18"/>
         </w:rPr>
         <w:t>[8] Stevens S S，On the Theory of Scales of Measurement，Science，103(2684)：677-680，1946. DOI: 10.1126/science.103.2684.677.</w:t>
       </w:r>
@@ -19264,14 +19260,14 @@
     <w:p>
       <w:pPr>
         <w:keepLines/>
-        <w:spacing w:after="40" w:line="324" w:lineRule="auto"/>
+        <w:spacing w:after="0" w:line="324" w:lineRule="auto"/>
         <w:ind w:firstLine="0"/>
       </w:pPr>
       <w:r>
         <w:rPr>
           <w:rFonts w:ascii="Times New Roman" w:hAnsi="Times New Roman" w:eastAsia="宋体"/>
           <w:b w:val="0"/>
-          <w:sz w:val="19"/>
+          <w:sz w:val="18"/>
         </w:rPr>
         <w:t>[9] Seppä L, Latvala T, Akaichi F, Gil J M, Tuorila H，What are domestic apples worth? Hedonic responses and sensory information as drivers of willingness to pay，Food Quality and Preference，43：97-105，2015. DOI: 10.1016/j.foodqual.2015.02.013.</w:t>
       </w:r>
@@ -19279,14 +19275,14 @@
     <w:p>
       <w:pPr>
         <w:keepLines/>
-        <w:spacing w:after="40" w:line="324" w:lineRule="auto"/>
+        <w:spacing w:after="0" w:line="324" w:lineRule="auto"/>
         <w:ind w:firstLine="0"/>
       </w:pPr>
       <w:r>
         <w:rPr>
           <w:rFonts w:ascii="Times New Roman" w:hAnsi="Times New Roman" w:eastAsia="宋体"/>
           <w:b w:val="0"/>
-          <w:sz w:val="19"/>
+          <w:sz w:val="18"/>
         </w:rPr>
         <w:t>[10] Spearman C，The Proof and Measurement of Association between Two Things，The American Journal of Psychology，15(1)：72，1904. DOI: 10.2307/1412159.</w:t>
       </w:r>
@@ -19294,14 +19290,14 @@
     <w:p>
       <w:pPr>
         <w:keepLines/>
-        <w:spacing w:after="40" w:line="324" w:lineRule="auto"/>
+        <w:spacing w:after="0" w:line="324" w:lineRule="auto"/>
         <w:ind w:firstLine="0"/>
       </w:pPr>
       <w:r>
         <w:rPr>
           <w:rFonts w:ascii="Times New Roman" w:hAnsi="Times New Roman" w:eastAsia="宋体"/>
           <w:b w:val="0"/>
-          <w:sz w:val="19"/>
+          <w:sz w:val="18"/>
         </w:rPr>
         <w:t>[11] Hollmann N, Müller S, Purucker L, Krishnakumar A, Körfer M, Hoo S B, Schirrmeister R T, Hutter F，Accurate predictions on small data with a tabular foundation model，Nature，637(8045)：319-326，2025. DOI: 10.1038/s41586-024-08328-6.</w:t>
       </w:r>
@@ -19309,14 +19305,14 @@
     <w:p>
       <w:pPr>
         <w:keepLines/>
-        <w:spacing w:after="40" w:line="324" w:lineRule="auto"/>
+        <w:spacing w:after="0" w:line="324" w:lineRule="auto"/>
         <w:ind w:firstLine="0"/>
       </w:pPr>
       <w:r>
         <w:rPr>
           <w:rFonts w:ascii="Times New Roman" w:hAnsi="Times New Roman" w:eastAsia="宋体"/>
           <w:b w:val="0"/>
-          <w:sz w:val="19"/>
+          <w:sz w:val="18"/>
         </w:rPr>
         <w:t>[12] Restrepo J P, Rivera J C, Laniado H, Osorio P, Becerra O A，Nonparametric Generation of Synthetic Data Using Copulas，Electronics，12(7)：1601，2023. DOI: 10.3390/electronics12071601.</w:t>
       </w:r>
@@ -19324,14 +19320,14 @@
     <w:p>
       <w:pPr>
         <w:keepLines/>
-        <w:spacing w:after="40" w:line="324" w:lineRule="auto"/>
+        <w:spacing w:after="0" w:line="324" w:lineRule="auto"/>
         <w:ind w:firstLine="0"/>
       </w:pPr>
       <w:r>
         <w:rPr>
           <w:rFonts w:ascii="Times New Roman" w:hAnsi="Times New Roman" w:eastAsia="宋体"/>
           <w:b w:val="0"/>
-          <w:sz w:val="19"/>
+          <w:sz w:val="18"/>
         </w:rPr>
         <w:t>[13] Moskowitz H R，The dollar value of product quality: the effect of pricing versus overall liking on consumer choice，Journal of Sensory Studies，10(3)：239-247，1995. DOI: 10.1111/j.1745-459x.1995.tb00016.x.</w:t>
       </w:r>
@@ -19339,14 +19335,14 @@
     <w:p>
       <w:pPr>
         <w:keepLines/>
-        <w:spacing w:after="40" w:line="324" w:lineRule="auto"/>
+        <w:spacing w:after="0" w:line="324" w:lineRule="auto"/>
         <w:ind w:firstLine="0"/>
       </w:pPr>
       <w:r>
         <w:rPr>
           <w:rFonts w:ascii="Times New Roman" w:hAnsi="Times New Roman" w:eastAsia="宋体"/>
           <w:b w:val="0"/>
-          <w:sz w:val="19"/>
+          <w:sz w:val="18"/>
         </w:rPr>
         <w:t>[14] Meilgaard M C，Prediction of flavor differences between beers from their chemical composition，Journal of Agricultural and Food Chemistry，30(6)：1009-1017，1982. DOI: 10.1021/jf00114a002.</w:t>
       </w:r>
@@ -19354,14 +19350,14 @@
     <w:p>
       <w:pPr>
         <w:keepLines/>
-        <w:spacing w:after="40" w:line="324" w:lineRule="auto"/>
+        <w:spacing w:after="0" w:line="324" w:lineRule="auto"/>
         <w:ind w:firstLine="0"/>
       </w:pPr>
       <w:r>
         <w:rPr>
           <w:rFonts w:ascii="Times New Roman" w:hAnsi="Times New Roman" w:eastAsia="宋体"/>
           <w:b w:val="0"/>
-          <w:sz w:val="19"/>
+          <w:sz w:val="18"/>
         </w:rPr>
         <w:t>[15] Olaniran A O, Hiralal L, Mokoena M P, Pillay B，Flavour-active volatile compounds in beer: production, regulation and control，Journal of the Institute of Brewing，123(1)：13-23，2017. DOI: 10.1002/jib.389.</w:t>
       </w:r>
@@ -19369,14 +19365,14 @@
     <w:p>
       <w:pPr>
         <w:keepLines/>
-        <w:spacing w:after="40" w:line="324" w:lineRule="auto"/>
+        <w:spacing w:after="0" w:line="324" w:lineRule="auto"/>
         <w:ind w:firstLine="0"/>
       </w:pPr>
       <w:r>
         <w:rPr>
           <w:rFonts w:ascii="Times New Roman" w:hAnsi="Times New Roman" w:eastAsia="宋体"/>
           <w:b w:val="0"/>
-          <w:sz w:val="19"/>
+          <w:sz w:val="18"/>
         </w:rPr>
         <w:t>[16] Verstrepen K J, Derdelinckx G, Dufour J P, Winderickx J, Thevelein J M, Pretorius I S, Delvaux F R，Flavor-active esters: Adding fruitiness to beer，Journal of Bioscience and Bioengineering，96(2)：110-118，2003. DOI: 10.1016/S1389-1723(03)90112-5.</w:t>
       </w:r>
@@ -19384,14 +19380,14 @@
     <w:p>
       <w:pPr>
         <w:keepLines/>
-        <w:spacing w:after="40" w:line="324" w:lineRule="auto"/>
+        <w:spacing w:after="0" w:line="324" w:lineRule="auto"/>
         <w:ind w:firstLine="0"/>
       </w:pPr>
       <w:r>
         <w:rPr>
           <w:rFonts w:ascii="Times New Roman" w:hAnsi="Times New Roman" w:eastAsia="宋体"/>
           <w:b w:val="0"/>
-          <w:sz w:val="19"/>
+          <w:sz w:val="18"/>
         </w:rPr>
         <w:t>[17] Dzialo M C, Park R, Steensels J, Lievens B, Verstrepen K J，Physiology, ecology and industrial applications of aroma formation in yeast，FEMS Microbiology Reviews，41(Suppl_1)：S95-S128，2017. DOI: 10.1093/femsre/fux031.</w:t>
       </w:r>
@@ -19399,14 +19395,14 @@
     <w:p>
       <w:pPr>
         <w:keepLines/>
-        <w:spacing w:after="40" w:line="324" w:lineRule="auto"/>
+        <w:spacing w:after="0" w:line="324" w:lineRule="auto"/>
         <w:ind w:firstLine="0"/>
       </w:pPr>
       <w:r>
         <w:rPr>
           <w:rFonts w:ascii="Times New Roman" w:hAnsi="Times New Roman" w:eastAsia="宋体"/>
           <w:b w:val="0"/>
-          <w:sz w:val="19"/>
+          <w:sz w:val="18"/>
         </w:rPr>
         <w:t>[18] Bokulich N A, Bamforth C W，The Microbiology of Malting and Brewing，Microbiology and Molecular Biology Reviews，77(2)：157-172，2013. DOI: 10.1128/MMBR.00060-12.</w:t>
       </w:r>
@@ -19414,14 +19410,14 @@
     <w:p>
       <w:pPr>
         <w:keepLines/>
-        <w:spacing w:after="40" w:line="324" w:lineRule="auto"/>
+        <w:spacing w:after="0" w:line="324" w:lineRule="auto"/>
         <w:ind w:firstLine="0"/>
       </w:pPr>
       <w:r>
         <w:rPr>
           <w:rFonts w:ascii="Times New Roman" w:hAnsi="Times New Roman" w:eastAsia="宋体"/>
           <w:b w:val="0"/>
-          <w:sz w:val="19"/>
+          <w:sz w:val="18"/>
         </w:rPr>
         <w:t>[19] Spitaels F, Wieme A D, Janssens M, Aerts M, Daniel H M, Van Landschoot A, De Vuyst L, Vandamme P，The Microbial Diversity of Traditional Spontaneously Fermented Lambic Beer，PLoS ONE，9(4)：e95384，2014. DOI: 10.1371/journal.pone.0095384.</w:t>
       </w:r>
@@ -19429,14 +19425,14 @@
     <w:p>
       <w:pPr>
         <w:keepLines/>
-        <w:spacing w:after="40" w:line="324" w:lineRule="auto"/>
+        <w:spacing w:after="0" w:line="324" w:lineRule="auto"/>
         <w:ind w:firstLine="0"/>
       </w:pPr>
       <w:r>
         <w:rPr>
           <w:rFonts w:ascii="Times New Roman" w:hAnsi="Times New Roman" w:eastAsia="宋体"/>
           <w:b w:val="0"/>
-          <w:sz w:val="19"/>
+          <w:sz w:val="18"/>
         </w:rPr>
         <w:t>[20] Snauwaert I, Roels S P, Van Nieuwerburgh F, Van Landschoot A, De Vuyst L, Vandamme P，Microbial diversity and metabolite composition of Belgian red-brown acidic ales，International Journal of Food Microbiology，221：1-11，2016. DOI: 10.1016/j.ijfoodmicro.2015.12.009.</w:t>
       </w:r>
@@ -19444,14 +19440,14 @@
     <w:p>
       <w:pPr>
         <w:keepLines/>
-        <w:spacing w:after="40" w:line="324" w:lineRule="auto"/>
+        <w:spacing w:after="0" w:line="324" w:lineRule="auto"/>
         <w:ind w:firstLine="0"/>
       </w:pPr>
       <w:r>
         <w:rPr>
           <w:rFonts w:ascii="Times New Roman" w:hAnsi="Times New Roman" w:eastAsia="宋体"/>
           <w:b w:val="0"/>
-          <w:sz w:val="19"/>
+          <w:sz w:val="18"/>
         </w:rPr>
         <w:t>[21] Takoi K, Itoga Y, Koie K, Kosugi T, Shimase M, Katayama Y, Nakayama Y, Watari J，The Contribution of Geraniol Metabolism to the Citrus Flavour of Beer: Synergy of Geraniol and beta-citronellol under coexistence with excess linalool，Journal of the Institute of Brewing，116(3)：251-260，2010. DOI: 10.1002/j.2050-0416.2010.tb00428.x.</w:t>
       </w:r>
@@ -19459,14 +19455,14 @@
     <w:p>
       <w:pPr>
         <w:keepLines/>
-        <w:spacing w:after="40" w:line="324" w:lineRule="auto"/>
+        <w:spacing w:after="0" w:line="324" w:lineRule="auto"/>
         <w:ind w:firstLine="0"/>
       </w:pPr>
       <w:r>
         <w:rPr>
           <w:rFonts w:ascii="Times New Roman" w:hAnsi="Times New Roman" w:eastAsia="宋体"/>
           <w:b w:val="0"/>
-          <w:sz w:val="19"/>
+          <w:sz w:val="18"/>
         </w:rPr>
         <w:t>[22] Wauters R, Herrera-Malaver B, Schreurs M, Bircham P, Cautereels C, Cortebeeck J, Duffin P M, Steensels J, 等，Novel Saccharomyces cerevisiae variants slow down the accumulation of staling aldehydes and improve beer shelf-life，Food Chemistry，398：133863，2023. DOI: 10.1016/j.foodchem.2022.133863.</w:t>
       </w:r>
@@ -19474,14 +19470,14 @@
     <w:p>
       <w:pPr>
         <w:keepLines/>
-        <w:spacing w:after="40" w:line="324" w:lineRule="auto"/>
+        <w:spacing w:after="0" w:line="324" w:lineRule="auto"/>
         <w:ind w:firstLine="0"/>
       </w:pPr>
       <w:r>
         <w:rPr>
           <w:rFonts w:ascii="Times New Roman" w:hAnsi="Times New Roman" w:eastAsia="宋体"/>
           <w:b w:val="0"/>
-          <w:sz w:val="19"/>
+          <w:sz w:val="18"/>
         </w:rPr>
         <w:t>[23] Lusk L T, Kay S B, Porubcan A, Ryder D S，Key Olfactory Cues for Beer Oxidation，Journal of the American Society of Brewing Chemists，70(4)：257-261，2012. DOI: 10.1094/asbcj-2012-0907-01.</w:t>
       </w:r>
@@ -19489,14 +19485,14 @@
     <w:p>
       <w:pPr>
         <w:keepLines/>
-        <w:spacing w:after="40" w:line="324" w:lineRule="auto"/>
+        <w:spacing w:after="0" w:line="324" w:lineRule="auto"/>
         <w:ind w:firstLine="0"/>
       </w:pPr>
       <w:r>
         <w:rPr>
           <w:rFonts w:ascii="Times New Roman" w:hAnsi="Times New Roman" w:eastAsia="宋体"/>
           <w:b w:val="0"/>
-          <w:sz w:val="19"/>
+          <w:sz w:val="18"/>
         </w:rPr>
         <w:t>[24] Blanco C A, Andrés-Iglesias C, Montero O，Low-alcohol Beers: Flavor Compounds, Defects, and Improvement Strategies，Critical Reviews in Food Science and Nutrition，56(8)：1379-1388，2016. DOI: 10.1080/10408398.2012.733979.</w:t>
       </w:r>
@@ -19504,14 +19500,14 @@
     <w:p>
       <w:pPr>
         <w:keepLines/>
-        <w:spacing w:after="40" w:line="324" w:lineRule="auto"/>
+        <w:spacing w:after="0" w:line="324" w:lineRule="auto"/>
         <w:ind w:firstLine="0"/>
       </w:pPr>
       <w:r>
         <w:rPr>
           <w:rFonts w:ascii="Times New Roman" w:hAnsi="Times New Roman" w:eastAsia="宋体"/>
           <w:b w:val="0"/>
-          <w:sz w:val="19"/>
+          <w:sz w:val="18"/>
         </w:rPr>
         <w:t>[25] Gonzalez Viejo C, Fuentes S, Torrico D D, Godbole A, Dunshea F R，Chemical characterization of aromas in beer and their effect on consumers liking，Food Chemistry，293：479-485，2019. DOI: 10.1016/j.foodchem.2019.04.114.</w:t>
       </w:r>
@@ -19519,14 +19515,14 @@
     <w:p>
       <w:pPr>
         <w:keepLines/>
-        <w:spacing w:after="40" w:line="324" w:lineRule="auto"/>
+        <w:spacing w:after="0" w:line="324" w:lineRule="auto"/>
         <w:ind w:firstLine="0"/>
       </w:pPr>
       <w:r>
         <w:rPr>
           <w:rFonts w:ascii="Times New Roman" w:hAnsi="Times New Roman" w:eastAsia="宋体"/>
           <w:b w:val="0"/>
-          <w:sz w:val="19"/>
+          <w:sz w:val="18"/>
         </w:rPr>
         <w:t>[26] Rodrigues H, Parr W V，Contribution of cross-cultural studies to understanding wine appreciation: A review，Food Research International，115：251-258，2019. DOI: 10.1016/j.foodres.2018.09.008.</w:t>
       </w:r>
@@ -19534,14 +19530,14 @@
     <w:p>
       <w:pPr>
         <w:keepLines/>
-        <w:spacing w:after="40" w:line="324" w:lineRule="auto"/>
+        <w:spacing w:after="0" w:line="324" w:lineRule="auto"/>
         <w:ind w:firstLine="0"/>
       </w:pPr>
       <w:r>
         <w:rPr>
           <w:rFonts w:ascii="Times New Roman" w:hAnsi="Times New Roman" w:eastAsia="宋体"/>
           <w:b w:val="0"/>
-          <w:sz w:val="19"/>
+          <w:sz w:val="18"/>
         </w:rPr>
         <w:t>[27] Chambers E, Koppel K，Associations of Volatile Compounds with Sensory Aroma and Flavor: The Complex Nature of Flavor，Molecules，18(5)：4887-4905，2013. DOI: 10.3390/molecules18054887.</w:t>
       </w:r>
@@ -19549,14 +19545,14 @@
     <w:p>
       <w:pPr>
         <w:keepLines/>
-        <w:spacing w:after="40" w:line="324" w:lineRule="auto"/>
+        <w:spacing w:after="0" w:line="324" w:lineRule="auto"/>
         <w:ind w:firstLine="0"/>
       </w:pPr>
       <w:r>
         <w:rPr>
           <w:rFonts w:ascii="Times New Roman" w:hAnsi="Times New Roman" w:eastAsia="宋体"/>
           <w:b w:val="0"/>
-          <w:sz w:val="19"/>
+          <w:sz w:val="18"/>
         </w:rPr>
         <w:t>[28] Korneva E, Blockeel H，Towards Better Evaluation of Multi-target Regression Models[C]//ECML PKDD 2020 Workshops（Communications in Computer and Information Science）: 353-362, 2020.</w:t>
       </w:r>
@@ -19564,14 +19560,14 @@
     <w:p>
       <w:pPr>
         <w:keepLines/>
-        <w:spacing w:after="40" w:line="324" w:lineRule="auto"/>
+        <w:spacing w:after="0" w:line="324" w:lineRule="auto"/>
         <w:ind w:firstLine="0"/>
       </w:pPr>
       <w:r>
         <w:rPr>
           <w:rFonts w:ascii="Times New Roman" w:hAnsi="Times New Roman" w:eastAsia="宋体"/>
           <w:b w:val="0"/>
-          <w:sz w:val="19"/>
+          <w:sz w:val="18"/>
         </w:rPr>
         <w:t>[29] Friedman J H，Greedy function approximation: A gradient boosting machine，The Annals of Statistics，29(5)：1189-1232，2001. DOI: 10.1214/aos/1013203451.</w:t>
       </w:r>
@@ -19579,14 +19575,14 @@
     <w:p>
       <w:pPr>
         <w:keepLines/>
-        <w:spacing w:after="40" w:line="324" w:lineRule="auto"/>
+        <w:spacing w:after="0" w:line="324" w:lineRule="auto"/>
         <w:ind w:firstLine="0"/>
       </w:pPr>
       <w:r>
         <w:rPr>
           <w:rFonts w:ascii="Times New Roman" w:hAnsi="Times New Roman" w:eastAsia="宋体"/>
           <w:b w:val="0"/>
-          <w:sz w:val="19"/>
+          <w:sz w:val="18"/>
         </w:rPr>
         <w:t>[30] Efron B，Bootstrap Methods: Another Look at the Jackknife，The Annals of Statistics，7(1)：1-26，1979. DOI: 10.1214/aos/1176344552.</w:t>
       </w:r>
@@ -19594,14 +19590,14 @@
     <w:p>
       <w:pPr>
         <w:keepLines/>
-        <w:spacing w:after="40" w:line="324" w:lineRule="auto"/>
+        <w:spacing w:after="0" w:line="324" w:lineRule="auto"/>
         <w:ind w:firstLine="0"/>
       </w:pPr>
       <w:r>
         <w:rPr>
           <w:rFonts w:ascii="Times New Roman" w:hAnsi="Times New Roman" w:eastAsia="宋体"/>
           <w:b w:val="0"/>
-          <w:sz w:val="19"/>
+          <w:sz w:val="18"/>
         </w:rPr>
         <w:t>[31] Arlot S, Celisse A，A survey of cross-validation procedures for model selection，Statistics Surveys，4：40-79，2010. DOI: 10.1214/09-SS054.</w:t>
       </w:r>
@@ -19609,14 +19605,14 @@
     <w:p>
       <w:pPr>
         <w:keepLines/>
-        <w:spacing w:after="40" w:line="324" w:lineRule="auto"/>
+        <w:spacing w:after="0" w:line="324" w:lineRule="auto"/>
         <w:ind w:firstLine="0"/>
       </w:pPr>
       <w:r>
         <w:rPr>
           <w:rFonts w:ascii="Times New Roman" w:hAnsi="Times New Roman" w:eastAsia="宋体"/>
           <w:b w:val="0"/>
-          <w:sz w:val="19"/>
+          <w:sz w:val="18"/>
         </w:rPr>
         <w:t>[32] Hastie T, Tibshirani R, Friedman J，The Elements of Statistical Learning: Data Mining, Inference, and Prediction[M]. New York: Springer（Springer Series in Statistics）, 2009.</w:t>
       </w:r>
@@ -19624,14 +19620,14 @@
     <w:p>
       <w:pPr>
         <w:keepLines/>
-        <w:spacing w:after="40" w:line="324" w:lineRule="auto"/>
+        <w:spacing w:after="0" w:line="324" w:lineRule="auto"/>
         <w:ind w:firstLine="0"/>
       </w:pPr>
       <w:r>
         <w:rPr>
           <w:rFonts w:ascii="Times New Roman" w:hAnsi="Times New Roman" w:eastAsia="宋体"/>
           <w:b w:val="0"/>
-          <w:sz w:val="19"/>
+          <w:sz w:val="18"/>
         </w:rPr>
         <w:t>[33] Lawless H T, Heymann H，Sensory Evaluation of Food: Principles and Practices[M]. New York: Springer（Food Science Text Series）, 2010.</w:t>
       </w:r>
@@ -19639,14 +19635,14 @@
     <w:p>
       <w:pPr>
         <w:keepLines/>
-        <w:spacing w:after="40" w:line="324" w:lineRule="auto"/>
+        <w:spacing w:after="0" w:line="324" w:lineRule="auto"/>
         <w:ind w:firstLine="0"/>
       </w:pPr>
       <w:r>
         <w:rPr>
           <w:rFonts w:ascii="Times New Roman" w:hAnsi="Times New Roman" w:eastAsia="宋体"/>
           <w:b w:val="0"/>
-          <w:sz w:val="19"/>
+          <w:sz w:val="18"/>
         </w:rPr>
         <w:t>[34] Stone H, Sidel J, Oliver S, Woolsey A, Singleton R C，Sensory Evaluation by Quantitative Descriptive Analysis[C]//Descriptive Sensory Analysis in Practice（Wiley）: 23-34, 2004.</w:t>
       </w:r>
@@ -19654,14 +19650,14 @@
     <w:p>
       <w:pPr>
         <w:keepLines/>
-        <w:spacing w:after="40" w:line="324" w:lineRule="auto"/>
+        <w:spacing w:after="0" w:line="324" w:lineRule="auto"/>
         <w:ind w:firstLine="0"/>
       </w:pPr>
       <w:r>
         <w:rPr>
           <w:rFonts w:ascii="Times New Roman" w:hAnsi="Times New Roman" w:eastAsia="宋体"/>
           <w:b w:val="0"/>
-          <w:sz w:val="19"/>
+          <w:sz w:val="18"/>
         </w:rPr>
         <w:t>[35] Harris C R, Millman K J, van der Walt S J, 等，Array programming with NumPy，Nature，585(7825)：357-362，2020. DOI: 10.1038/s41586-020-2649-2.</w:t>
       </w:r>
@@ -19669,14 +19665,14 @@
     <w:p>
       <w:pPr>
         <w:keepLines/>
-        <w:spacing w:after="40" w:line="324" w:lineRule="auto"/>
+        <w:spacing w:after="0" w:line="324" w:lineRule="auto"/>
         <w:ind w:firstLine="0"/>
       </w:pPr>
       <w:r>
         <w:rPr>
           <w:rFonts w:ascii="Times New Roman" w:hAnsi="Times New Roman" w:eastAsia="宋体"/>
           <w:b w:val="0"/>
-          <w:sz w:val="19"/>
+          <w:sz w:val="18"/>
         </w:rPr>
         <w:t>[36] Ma J, Thomas V, Hosseinzadeh R, et al，TabDPT: Scaling Tabular Foundation Models on Real Data[C]//Advances in Neural Information Processing Systems 38, 2025.</w:t>
       </w:r>
@@ -19684,14 +19680,14 @@
     <w:p>
       <w:pPr>
         <w:keepLines/>
-        <w:spacing w:after="40" w:line="324" w:lineRule="auto"/>
+        <w:spacing w:after="0" w:line="324" w:lineRule="auto"/>
         <w:ind w:firstLine="0"/>
       </w:pPr>
       <w:r>
         <w:rPr>
           <w:rFonts w:ascii="Times New Roman" w:hAnsi="Times New Roman" w:eastAsia="宋体"/>
           <w:b w:val="0"/>
-          <w:sz w:val="19"/>
+          <w:sz w:val="18"/>
         </w:rPr>
         <w:t>[37] Sun S, Yu R，Copula Conformal prediction for multi-step time series prediction[C]//International Conference on Learning Representations 2024, 2024.</w:t>
       </w:r>
@@ -19699,14 +19695,14 @@
     <w:p>
       <w:pPr>
         <w:keepLines/>
-        <w:spacing w:after="40" w:line="324" w:lineRule="auto"/>
+        <w:spacing w:after="0" w:line="324" w:lineRule="auto"/>
         <w:ind w:firstLine="0"/>
       </w:pPr>
       <w:r>
         <w:rPr>
           <w:rFonts w:ascii="Times New Roman" w:hAnsi="Times New Roman" w:eastAsia="宋体"/>
           <w:b w:val="0"/>
-          <w:sz w:val="19"/>
+          <w:sz w:val="18"/>
         </w:rPr>
         <w:t>[38] Chen Y, Huang H, Yin R, He X, Guo L, Song Y, Zhao D, Sun J, Li J, Huang M, Sun B，Multi-Technique Flavoromics for Identifying Key Differential Volatile Compounds Underlying Sensory Profiles in Lager Beers，Foods，14(19)：3428，2025. DOI: 10.3390/foods14193428.</w:t>
       </w:r>
@@ -19714,14 +19710,14 @@
     <w:p>
       <w:pPr>
         <w:keepLines/>
-        <w:spacing w:after="40" w:line="324" w:lineRule="auto"/>
+        <w:spacing w:after="0" w:line="324" w:lineRule="auto"/>
         <w:ind w:firstLine="0"/>
       </w:pPr>
       <w:r>
         <w:rPr>
           <w:rFonts w:ascii="Times New Roman" w:hAnsi="Times New Roman" w:eastAsia="宋体"/>
           <w:b w:val="0"/>
-          <w:sz w:val="19"/>
+          <w:sz w:val="18"/>
         </w:rPr>
         <w:t>本论文使用的人工智能工具：[39] MiniMax Code，模型 MiniMax-M3.1-Flash，开发机构 MiniMax，使用日期 2026-10-29。（参考文献来源：docs/refs_verified.json）</w:t>
       </w:r>
@@ -20939,20 +20935,7 @@
           <w:b w:val="0"/>
           <w:sz w:val="18"/>
         </w:rPr>
-        <w:t>远程管线（worktrees/prediction-models/scripts/）：finalize_tuning.py、multitask_cv.py、paper_baselines.py、split_dataset.py、tabpfn_cv.py、tune_multitask.py、tune_rf.py、tune_tabpfn.py、tuning_protocol.py</w:t>
-      </w:r>
-    </w:p>
-    <w:p>
-      <w:pPr>
-        <w:spacing w:after="60" w:line="324" w:lineRule="auto"/>
-      </w:pPr>
-      <w:r>
-        <w:rPr>
-          <w:rFonts w:ascii="Times New Roman" w:hAnsi="Times New Roman" w:eastAsia="宋体"/>
-          <w:b w:val="0"/>
-          <w:sz w:val="18"/>
-        </w:rPr>
-        <w:t>以上合计 58 个源程序文件，随支撑材料 ZIP 一并提供，可据以逐条复算本文的数值结论。</w:t>
+        <w:t>以上合计 49 个源程序文件，随支撑材料 ZIP 一并提供，可据以逐条复算本文的数值结论。</w:t>
       </w:r>
     </w:p>
     <w:p>

</xml_diff>

<commit_message>
fix(paper): revise prose and harden figure audits
</commit_message>
<xml_diff>
--- a/data/processed/paper/paper.docx
+++ b/data/processed/paper/paper.docx
@@ -262,7 +262,7 @@
           <w:b w:val="0"/>
           <w:sz w:val="21"/>
         </w:rPr>
-        <w:t>本文针对 250 款商用啤酒的化学测量与感官数据完成三项任务的建模与复现，并首先以可复算的证据审计附件语义：逐列回归裁定 1.csv 为 log10 标度与原始浓度并存的混合标度（70 列中 log10 标度 37、原始浓度标度 19、近似原始浓度 10、无法逐点复现 4）；以逐元素重算比对裁定 2.csv、5.csv、6.csv 三张相关矩阵均为斯皮尔曼系数（最大绝对偏差为 0）；并查明 3.xlsx 仅为空白品评卡模板、附件不含原始 0–6 分数。据此建立两张全解析名称桥与统一的 log10(mg/L) 特征矩阵。问题一以 227 个化学特征（统一矩阵 231 列中剔除 4 个派生求和列）预测 50 个感官维度，七个模型族在固定的 175/75 风格分层留出集上取得相对全局均值基线约 15% 的宏平均 RMSE 改善，并另行保留原始 231 特征、KFold 协议下的 TabPFN 3.5 队友复现作为协议核对，不将其与主模型直接比较；同时交付 250 款啤酒 × 50 维的 0–6 分制分级评分表。问题二构建 231 节点共表达图，以自算全量相关、SHAP 归因、附件交叉相关与外部先验四路证据给出各感官维度的 Top-3 关键化合物，并以重采样入选频率与跨方法 Jaccard 系数双重量化稳定性。问题三以全局高斯 Copula 加风格条件边际生成化合谱，在硬约束合规层面实现零违规，同时报告无约束真实性参照与受约束后的分布压缩，并以秩—分位映射完成跨风格迁移。本文进一步以 183 维消费者描述符与 189 款啤酒的零售价格作为外部验证，并重新检验缺陷化合物的剂量—响应关系；对原研究「提升消费者喜爱度」一环，因附件不含消费者评分标签，明确声明其在本附件条件下不可检验。</w:t>
+        <w:t>本文基于 250 款商用啤酒的化学测量与感官数据，完成感官评分预测、化合物—风味关联解析和风格条件生成三项任务。研究首先审计附件语义：逐列回归表明 1.csv 同时包含 log10 标度与原始浓度标度（70 列中分别有 37、19、10 和 4 列属于可复现 log10、原始浓度、近似原始浓度和无法逐点复现的情形）；逐元素重算表明 2.csv、5.csv、6.csv 均为斯皮尔曼相关矩阵；3.xlsx 则是空白品评卡模板，附件没有原始 0–6 分数。基于这些证据，本文建立跨文件名称桥和统一的 log10(mg/L) 特征矩阵。问题一使用 227 个统一化学特征预测 50 个感官维度，在固定的 175/75 风格分层留出集上相对全局均值基线取得约 15% 的宏平均 RMSE 改善，并交付 250×50 的 0–6 分制分级结果。原始 231 特征、KFold 口径下的 TabPFN 3.5 结果仅用于既有协议核对，不与主模型直接比较。问题二构建 231 节点共表达图，结合自算全量相关、SHAP 归因、附件交叉相关和外部先验筛选 Top-3 候选化合物；50 个感官维度中有 22 个维度包含稳健记录，28 个维度没有稳健记录，稳健记录共 32 条，其中 9 条同时具有化学合理性。留出 FDR 检验中，训练集重选的150 条候选中有 83/150 条通过全体置换校正，主结果中的 32 条有 30/32 条通过留出集 FDR，9/9 条化学合理记录全部通过。问题三采用全局高斯 Copula 与风格条件边际生成化合谱；在 48 个留出单元中，约束合规率由 13.5% 提升至 100%，候选接受率均值为 12.7%，但受约束生成在 42/48 个单元上的能量距离或 MMD² 劣于无约束参照。最后，本文以 183 维论坛描述符和 189 款啤酒的未换汇零售价格进行外部验证，并重检缺陷化合物的剂量—响应关系。由于附件不含消费者评分或喜爱度标签，消费者喜爱度不是本文可检验的目标。</w:t>
       </w:r>
     </w:p>
     <w:p>
@@ -716,7 +716,7 @@
           <w:b w:val="0"/>
           <w:sz w:val="20"/>
         </w:rPr>
-        <w:t>3.4 感官维度与数据划分</w:t>
+        <w:t>3.3.1 样本概况与描述性统计</w:t>
       </w:r>
       <w:r>
         <w:rPr>
@@ -742,7 +742,7 @@
           <w:b w:val="0"/>
           <w:sz w:val="20"/>
         </w:rPr>
-        <w:t>3.5 主要符号与含义</w:t>
+        <w:t>3.4 感官维度与数据划分</w:t>
       </w:r>
       <w:r>
         <w:rPr>
@@ -768,7 +768,7 @@
           <w:b w:val="0"/>
           <w:sz w:val="20"/>
         </w:rPr>
-        <w:t>3.6 与官方文本表述不一致的三处及其证据</w:t>
+        <w:t>3.5 主要符号与含义</w:t>
       </w:r>
       <w:r>
         <w:rPr>
@@ -778,6 +778,32 @@
         </w:rPr>
         <w:tab/>
         <w:t>5</w:t>
+      </w:r>
+    </w:p>
+    <w:p>
+      <w:pPr>
+        <w:tabs>
+          <w:tab w:pos="8787" w:val="right" w:leader="dot"/>
+        </w:tabs>
+        <w:spacing w:after="40"/>
+        <w:ind w:left="360"/>
+      </w:pPr>
+      <w:r>
+        <w:rPr>
+          <w:rFonts w:ascii="Times New Roman" w:hAnsi="Times New Roman" w:eastAsia="宋体"/>
+          <w:b w:val="0"/>
+          <w:sz w:val="20"/>
+        </w:rPr>
+        <w:t>3.6 与官方文本表述不一致的三处及其证据</w:t>
+      </w:r>
+      <w:r>
+        <w:rPr>
+          <w:rFonts w:ascii="Times New Roman" w:hAnsi="Times New Roman" w:eastAsia="宋体"/>
+          <w:b w:val="0"/>
+          <w:sz w:val="20"/>
+        </w:rPr>
+        <w:tab/>
+        <w:t>6</w:t>
       </w:r>
     </w:p>
     <w:p>
@@ -803,7 +829,7 @@
           <w:sz w:val="20"/>
         </w:rPr>
         <w:tab/>
-        <w:t>6</w:t>
+        <w:t>7</w:t>
       </w:r>
     </w:p>
     <w:p>
@@ -829,7 +855,7 @@
           <w:sz w:val="20"/>
         </w:rPr>
         <w:tab/>
-        <w:t>6</w:t>
+        <w:t>7</w:t>
       </w:r>
     </w:p>
     <w:p>
@@ -881,7 +907,7 @@
           <w:sz w:val="20"/>
         </w:rPr>
         <w:tab/>
-        <w:t>7</w:t>
+        <w:t>8</w:t>
       </w:r>
     </w:p>
     <w:p>
@@ -933,7 +959,7 @@
           <w:sz w:val="20"/>
         </w:rPr>
         <w:tab/>
-        <w:t>8</w:t>
+        <w:t>9</w:t>
       </w:r>
     </w:p>
     <w:p>
@@ -959,7 +985,7 @@
           <w:sz w:val="20"/>
         </w:rPr>
         <w:tab/>
-        <w:t>8</w:t>
+        <w:t>9</w:t>
       </w:r>
     </w:p>
     <w:p>
@@ -1225,39 +1251,7 @@
           <w:b w:val="0"/>
           <w:sz w:val="21"/>
         </w:rPr>
-        <w:t>赛题附件是 Schreurs M、Verstrepen P J 等人发表在 Nature Communications 的原始研究的公开数据与补充材料 [1]：其正文以 250 款商用啤酒的化学测量与受训品评小组的感官结果为核心数据，并公开了化合物—化合物、感官—感官与化合物—感官三张相关矩阵、感官品评卡、论坛评述派生描述符以及阈值与名称参考表。本文</w:t>
-      </w:r>
-      <w:r>
-        <w:rPr>
-          <w:rFonts w:ascii="Times New Roman" w:hAnsi="Times New Roman" w:eastAsia="宋体"/>
-          <w:b/>
-          <w:sz w:val="21"/>
-        </w:rPr>
-        <w:t>不是对该研究的重复报道</w:t>
-      </w:r>
-      <w:r>
-        <w:rPr>
-          <w:rFonts w:ascii="Times New Roman" w:hAnsi="Times New Roman" w:eastAsia="宋体"/>
-          <w:b w:val="0"/>
-          <w:sz w:val="21"/>
-        </w:rPr>
-        <w:t>，而是对其公开数据的一次</w:t>
-      </w:r>
-      <w:r>
-        <w:rPr>
-          <w:rFonts w:ascii="Times New Roman" w:hAnsi="Times New Roman" w:eastAsia="宋体"/>
-          <w:b/>
-          <w:sz w:val="21"/>
-        </w:rPr>
-        <w:t>独立复现与再分析</w:t>
-      </w:r>
-      <w:r>
-        <w:rPr>
-          <w:rFonts w:ascii="Times New Roman" w:hAnsi="Times New Roman" w:eastAsia="宋体"/>
-          <w:b w:val="0"/>
-          <w:sz w:val="21"/>
-        </w:rPr>
-        <w:t>：所有量纲裁定、相关类型裁定、名称桥、建模与评估均由本文重新实现与复算，附件中未被明示的语义一律以可复算的证据裁定，而不是沿用原文结论。</w:t>
+        <w:t>赛题附件来自 Schreurs M、Verstrepen P J 等人在 Nature Communications 发表的研究 [1]，包含 250 款商用啤酒的化学测量、受训品评小组的感官数据，以及化合物—化合物、感官—感官和化合物—感官三张相关矩阵。附件还提供了品评卡模板、论坛评论派生描述符、化学阈值和名称参考表。本文以这些公开材料为基础，重新完成数据语义审计、特征构造、模型训练和独立评估。对于附件没有直接说明的量纲、相关类型和字段对应关系，本文均通过逐列回归、逐元素重算和跨文件名称核对给出可复算的判断。因此，本文的研究定位是同源数据的独立复现与再分析，重点在于检验数据口径能否支撑题目要求的三项推断。</w:t>
       </w:r>
     </w:p>
     <w:p>
@@ -1271,23 +1265,7 @@
           <w:b w:val="0"/>
           <w:sz w:val="21"/>
         </w:rPr>
-        <w:t>据此，本文相对原文的增量贡献有三点。其一，识别并给出三处与官方赛题文本表述不一致的数据语义问题——三张相关矩阵的相关系数类型、品评卡模板的实际内容、1.csv 的标度结构——并逐条附上复算证据；其二，在原研究面向消费者偏好、而附件并未提供任何消费者评分标签的前提下，本文以 183 维论坛派生消费者描述符与 189 款啤酒的零售价格为外部代理，构造「化学→消费者感知」与「化学→市场价值」两条验证路径；其三，在原始剂量—响应证据不可得的条件下，重新检验缺陷化合物的剂量—响应关系。必须明确声明的是：</w:t>
-      </w:r>
-      <w:r>
-        <w:rPr>
-          <w:rFonts w:ascii="Times New Roman" w:hAnsi="Times New Roman" w:eastAsia="宋体"/>
-          <w:b/>
-          <w:sz w:val="21"/>
-        </w:rPr>
-        <w:t>附件未提供任何消费者评分或喜爱度标签，因此本文不声称复现原研究对消费者喜爱度的预测</w:t>
-      </w:r>
-      <w:r>
-        <w:rPr>
-          <w:rFonts w:ascii="Times New Roman" w:hAnsi="Times New Roman" w:eastAsia="宋体"/>
-          <w:b w:val="0"/>
-          <w:sz w:val="21"/>
-        </w:rPr>
-        <w:t>，只在可观测的描述符与价格代理上做验证，并把「喜爱度是否可提升」明确标注为在本附件条件下不可检验的一环。</w:t>
+        <w:t>本文的增量工作集中在三个方面。第一，本文识别出三处会改变建模结论的数据语义差异：相关矩阵实际采用斯皮尔曼系数，品评卡只是空白模板，1.csv 同时包含 log10 标度和原始浓度标度。第二，附件没有消费者评分或喜爱度标签，本文遂采用 183 维论坛描述符和 189 款啤酒的零售价格构造两条外部验证路径，分别考察化学谱对消费者感知和市场价值代理的解释能力。第三，本文重新检验缺陷化合物的剂量—响应关系，并把全体样本相关、风格分层结果和不确定性放在同一评价框架中。消费者喜爱度本身没有可观测标签，因而不属于本文的预测目标；相关结果仅用于说明现有附件能够验证什么，以及仍缺少哪些证据。</w:t>
       </w:r>
     </w:p>
     <w:p>
@@ -1315,23 +1293,7 @@
           <w:b w:val="0"/>
           <w:sz w:val="21"/>
         </w:rPr>
-        <w:t>赛题要回答的其实是一个连续的问题：</w:t>
-      </w:r>
-      <w:r>
-        <w:rPr>
-          <w:rFonts w:ascii="Times New Roman" w:hAnsi="Times New Roman" w:eastAsia="宋体"/>
-          <w:b/>
-          <w:sz w:val="21"/>
-        </w:rPr>
-        <w:t>什么样的啤酒好喝、为什么好喝、以及如何据此设计出新的化合物谱</w:t>
-      </w:r>
-      <w:r>
-        <w:rPr>
-          <w:rFonts w:ascii="Times New Roman" w:hAnsi="Times New Roman" w:eastAsia="宋体"/>
-          <w:b w:val="0"/>
-          <w:sz w:val="21"/>
-        </w:rPr>
-        <w:t>。对应到三问：第一问用化学指纹预测感官评分，回答「什么样的啤酒好喝」；第二问把感官维度拆解到具体化合物，回答「为什么好喝」；第三问以风格为条件反向设计化合物谱，回答「如何据此设计」。三问共享同一份化学特征矩阵与同一套数据语义裁定，因此本文把它们组织成一条主线而不是三个孤立任务：问题一给出「化学→感官」的映射，问题二在同一矩阵上给出「感官→化合物」的可解释分解，问题三再把这条映射反过来用于设计。</w:t>
+        <w:t>三项任务可以沿着一条由解释到设计的路径组织起来。问题一从化学指纹预测感官维度，回答哪些感官属性能够由化学测量解释；问题二把这种映射拆解到具体化合物，考察化合物之间的共表达结构以及候选关键因素的稳定性；问题三以风格为条件生成化学谱，将前两问得到的结构用于反向设计。三问共用同一套名称桥、统一标度和风格分层原则，因而可以在同一证据链上比较预测、关联与生成三个环节的可靠程度。</w:t>
       </w:r>
     </w:p>
     <w:p>
@@ -1345,7 +1307,7 @@
           <w:b w:val="0"/>
           <w:sz w:val="21"/>
         </w:rPr>
-        <w:t>本题以 250 款商用啤酒的化学测量数据、感官品评数据与多张相关矩阵为输入，要求完成三件本质上互不相同的任务：三其一是在感官标签仅以标准化形式给出的条件下，还原并给出可解释的0–6 分制分级评分；其二是构建化合物共表达图并给出每个感官维度的关键化合物及其稳定性；其三是以风格为条件生成化学谱并做跨风格迁移。三者的共同难点在于：附件并未提供可直接使用的标签与量纲，任何未经核实就建模的做法都会在量纲与口径两个层面同时失效。</w:t>
+        <w:t>具体而言，第一问需要在感官标签只有标准化形式、没有原始 0–6 分数的条件下构造可解释的分级结果；第二问需要在 231 个化合物节点上建立共表达图，并为每个感官维度给出带有稳定性和化学合理性说明的候选化合物；第三问则需要在样本量很小的细分风格条件下生成化学谱，并检验约束合规、分布相似性和跨风格迁移效果。三项任务的共同前提是先确认标签、量纲和相关系数的真实含义。若这一步被忽略，后续的模型指标和化学解释都可能失去可比性。</w:t>
       </w:r>
     </w:p>
     <w:p>
@@ -1373,7 +1335,7 @@
           <w:b w:val="0"/>
           <w:sz w:val="21"/>
         </w:rPr>
-        <w:t>本文的总体应对是：先用一套可复算的证据把数据的真实语义钉死，再让三个问题共享同一份经过审计的特征矩阵。具体而言，(1) 逐列裁定 1.csv 的变换标度；(2) 以「重算相关矩阵并与给定矩阵逐元素比对」的方式裁定三张相关矩阵的相关系数类型；(3) 建立跨附件的名称桥，使相关矩阵、阈值表与特征矩阵可以对齐；(4) 区分左删失（未检出）与真缺失；(5) 固定按风格分层的训练/留出划分，所有调参只在训练集内部完成。</w:t>
+        <w:t>研究流程首先完成三项基础工作：逐列裁定 1.csv 的标度，重算相关矩阵并与附件逐元素比对，再通过跨文件名称桥把化学量、感官维度、阈值和外部先验对齐。随后，本文区分检出限造成的地板值与真正缺失，将所有化学量统一到 log10(mg/L) 口径，并固定按细分风格分层的 175/75 训练—留出划分。模型选择和参数调整只使用训练样本，留出样本仅用于最终评价。这样的顺序把数据审计、预测、关联和生成连接起来，也使每一步的证据来源能够回溯。</w:t>
       </w:r>
     </w:p>
     <w:p>
@@ -1415,7 +1377,7 @@
           <w:b w:val="0"/>
           <w:sz w:val="21"/>
         </w:rPr>
-        <w:t>原始研究以 250 款商用啤酒的化学测量与受训品评小组感官结果为核心数据，系统刻画了化学组成与感官属性之间的关系，并把可解释的机器学习用于风味预测与配方改进[1]；其数据公开方式（同时给出化合物矩阵、三张相关矩阵、品评卡、论坛描述符与阈值参考表）也决定了任何复用者都必须自行裁定这些附件的语义，这正是本文第二章与第三章所做的工作。近期 flavoromics 研究也表明，多平台化学—感官证据可用于筛查候选化合物，但跨平台结果不能未经校准地并入本项目训练集[38]。</w:t>
+        <w:t>原始研究以 250 款商用啤酒的化学测量与受训品评小组感官结果为核心数据，系统刻画了化学组成与感官属性之间的关系，并把可解释的机器学习用于风味预测与配方改进[1]；其数据公开方式（同时给出化合物矩阵、三张相关矩阵、品评卡、论坛描述符与阈值参考表）也决定了任何复用者都必须自行裁定这些附件的语义，这正是本文第二章与第三章所做的工作。近期 flavoromics 研究也表明，多平台化学—感官证据可用于筛查候选化合物，但不同实验平台的结果仍需校准后才能用于同一分析[38]。</w:t>
       </w:r>
     </w:p>
     <w:p>
@@ -1443,7 +1405,7 @@
           <w:b w:val="0"/>
           <w:sz w:val="21"/>
         </w:rPr>
-        <w:t>从化学成分到感官评分的映射本质上是一个高维小样本回归问题。通用机器学习工具（如 scikit-learn[2]）提供了从线性模型到梯度提升与随机森林的统一实现；SHAP[3] 提供了把模型输出分解到单个化合物的加性归因方法；预训练先验模型（TabPFN[4]）则为小样本表格回归提供了不同于手工特征工程的第三条路线（其原始版本面向表格分类任务，回归形态与本文用法见后续期刊版[11]）。TabDPT[36] 可作为后续的表格基础模型对照，但不作为本项目当前提交的必做主线。本文在问题一同时使用这三类归纳偏置，并在问题二把归因与秩相关并列作为证据，避免以单一视角替代真值。</w:t>
+        <w:t>从化学成分到感官评分的映射本质上是一个高维小样本回归问题。通用机器学习工具（如 scikit-learn[2]）提供了从线性模型到梯度提升与随机森林的统一实现；SHAP[3] 提供了把模型输出分解到单个化合物的加性归因方法；预训练先验模型（TabPFN[4]）则为小样本表格回归提供了不同于手工特征工程的第三条路线（其原始版本面向表格分类任务，回归形态与本文用法见后续期刊版[11]）。TabDPT[36] 可作为后续的表格基础模型对照；本文暂不把它纳入主比较，以便先完成统一特征、固定切分和可复核指标下的基线评估。本文在问题一同时使用这三类归纳偏置，并在问题二把归因与秩相关并列作为证据，避免以单一视角替代真值。</w:t>
       </w:r>
     </w:p>
     <w:p>
@@ -1755,9 +1717,9 @@
         <w:rPr>
           <w:rFonts w:ascii="Times New Roman" w:hAnsi="Times New Roman" w:eastAsia="黑体"/>
           <w:b/>
-          <w:sz w:val="26"/>
-        </w:rPr>
-        <w:t>3.4 感官维度与数据划分</w:t>
+          <w:sz w:val="23"/>
+        </w:rPr>
+        <w:t>3.3.1 样本概况与描述性统计</w:t>
       </w:r>
     </w:p>
     <w:p>
@@ -1771,488 +1733,7 @@
           <w:b w:val="0"/>
           <w:sz w:val="21"/>
         </w:rPr>
-        <w:t>3.xlsx 提供的感官品评卡定义了 Aroma 与 Flavour 两套属性及其 0–6 分制的语义锚点（0 分为「不存在」，6 分为「主导/强烈」），但经逐格核查，其 12 张评分卡内并无任何品评员打分的记录，汇总表的数值单元格指向空白评分卡的公式；即</w:t>
-      </w:r>
-      <w:r>
-        <w:rPr>
-          <w:rFonts w:ascii="Times New Roman" w:hAnsi="Times New Roman" w:eastAsia="宋体"/>
-          <w:b/>
-          <w:sz w:val="21"/>
-        </w:rPr>
-        <w:t>附件中不存在原始 0–6 分数</w:t>
-      </w:r>
-      <w:r>
-        <w:rPr>
-          <w:rFonts w:ascii="Times New Roman" w:hAnsi="Times New Roman" w:eastAsia="宋体"/>
-          <w:b w:val="0"/>
-          <w:sz w:val="21"/>
-        </w:rPr>
-        <w:t>。4.csv 的 50 个感官列是经按维度中心化与缩放的连续值（均值近零、标准差在 0.37 至 0.86 之间，并非标准分数），因此原始尺度无法反解。本文据此交付全部 50 个感官维度（Aroma 15 维、Flavour 15 维与 20 个通用维度，覆盖题面所称「约 40 个维度」），并在第五章明确说明所给 0–6 分制的构造方式。</w:t>
-      </w:r>
-    </w:p>
-    <w:p>
-      <w:pPr>
-        <w:spacing w:after="80" w:line="324" w:lineRule="auto"/>
-        <w:ind w:firstLine="420"/>
-      </w:pPr>
-      <w:r>
-        <w:rPr>
-          <w:rFonts w:ascii="Times New Roman" w:hAnsi="Times New Roman" w:eastAsia="宋体"/>
-          <w:b w:val="0"/>
-          <w:sz w:val="21"/>
-        </w:rPr>
-        <w:t>数据划分沿用固定种子、按风格分层的留出方案：175 款用于训练与调参，75 款用于一次性评估，22 个风格在两侧均有分布。所有切点、参数与模型选择一律只在训练集内完成。</w:t>
-      </w:r>
-    </w:p>
-    <w:p>
-      <w:pPr>
-        <w:spacing w:before="140" w:after="80" w:line="312" w:lineRule="auto"/>
-        <w:jc w:val="left"/>
-      </w:pPr>
-      <w:r>
-        <w:rPr>
-          <w:rFonts w:ascii="Times New Roman" w:hAnsi="Times New Roman" w:eastAsia="黑体"/>
-          <w:b/>
-          <w:sz w:val="26"/>
-        </w:rPr>
-        <w:t>3.5 主要符号与含义</w:t>
-      </w:r>
-    </w:p>
-    <w:p>
-      <w:pPr>
-        <w:spacing w:after="80" w:line="324" w:lineRule="auto"/>
-        <w:ind w:firstLine="420"/>
-      </w:pPr>
-      <w:r>
-        <w:rPr>
-          <w:rFonts w:ascii="Times New Roman" w:hAnsi="Times New Roman" w:eastAsia="宋体"/>
-          <w:b w:val="0"/>
-          <w:sz w:val="21"/>
-        </w:rPr>
-        <w:t>为便于后文对照，全文使用的主要符号统一列于下表。</w:t>
-      </w:r>
-    </w:p>
-    <w:p>
-      <w:pPr>
-        <w:spacing w:before="80"/>
-        <w:jc w:val="center"/>
-      </w:pPr>
-    </w:p>
-    <w:tbl>
-      <w:tblPr>
-        <w:tblStyle w:val="16"/>
-        <w:tblW w:type="auto" w:w="0"/>
-        <w:tblLayout w:type="autofit"/>
-        <w:tblLook w:firstColumn="1" w:firstRow="1" w:lastColumn="0" w:lastRow="0" w:noHBand="0" w:noVBand="1" w:val="04A0"/>
-      </w:tblPr>
-      <w:tblGrid>
-        <w:gridCol w:w="4535"/>
-        <w:gridCol w:w="4535"/>
-      </w:tblGrid>
-      <w:tr>
-        <w:trPr>
-          <w:tblHeader w:val="true"/>
-        </w:trPr>
-        <w:tc>
-          <w:tcPr>
-            <w:tcW w:type="dxa" w:w="4535"/>
-          </w:tcPr>
-          <w:p>
-            <w:pPr>
-              <w:jc w:val="center"/>
-            </w:pPr>
-            <w:r/>
-            <w:r>
-              <w:rPr>
-                <w:rFonts w:ascii="Times New Roman" w:hAnsi="Times New Roman" w:eastAsia="黑体"/>
-                <w:b/>
-                <w:sz w:val="17"/>
-              </w:rPr>
-              <w:t>符号</w:t>
-            </w:r>
-          </w:p>
-        </w:tc>
-        <w:tc>
-          <w:tcPr>
-            <w:tcW w:type="dxa" w:w="4535"/>
-          </w:tcPr>
-          <w:p>
-            <w:pPr>
-              <w:jc w:val="center"/>
-            </w:pPr>
-            <w:r/>
-            <w:r>
-              <w:rPr>
-                <w:rFonts w:ascii="Times New Roman" w:hAnsi="Times New Roman" w:eastAsia="黑体"/>
-                <w:b/>
-                <w:sz w:val="17"/>
-              </w:rPr>
-              <w:t>含义</w:t>
-            </w:r>
-          </w:p>
-        </w:tc>
-      </w:tr>
-      <w:tr>
-        <w:tc>
-          <w:tcPr>
-            <w:tcW w:type="dxa" w:w="4535"/>
-          </w:tcPr>
-          <w:p>
-            <w:pPr>
-              <w:jc w:val="center"/>
-            </w:pPr>
-            <w:r/>
-            <w:r>
-              <w:rPr>
-                <w:rFonts w:ascii="Times New Roman" w:hAnsi="Times New Roman" w:eastAsia="宋体"/>
-                <w:b w:val="0"/>
-                <w:sz w:val="17"/>
-              </w:rPr>
-              <w:t>z</w:t>
-            </w:r>
-          </w:p>
-        </w:tc>
-        <w:tc>
-          <w:tcPr>
-            <w:tcW w:type="dxa" w:w="4535"/>
-          </w:tcPr>
-          <w:p>
-            <w:pPr>
-              <w:jc w:val="center"/>
-            </w:pPr>
-            <w:r/>
-            <w:r>
-              <w:rPr>
-                <w:rFonts w:ascii="Times New Roman" w:hAnsi="Times New Roman" w:eastAsia="宋体"/>
-                <w:b w:val="0"/>
-                <w:sz w:val="17"/>
-              </w:rPr>
-              <w:t>标准化后的感官值（按维度中心化并缩放的连续量）</w:t>
-            </w:r>
-          </w:p>
-        </w:tc>
-      </w:tr>
-      <w:tr>
-        <w:tc>
-          <w:tcPr>
-            <w:tcW w:type="dxa" w:w="4535"/>
-          </w:tcPr>
-          <w:p>
-            <w:pPr>
-              <w:jc w:val="center"/>
-            </w:pPr>
-            <w:r/>
-            <w:r>
-              <w:rPr>
-                <w:rFonts w:ascii="Times New Roman" w:hAnsi="Times New Roman" w:eastAsia="宋体"/>
-                <w:b w:val="0"/>
-                <w:sz w:val="17"/>
-              </w:rPr>
-              <w:t>λ</w:t>
-            </w:r>
-          </w:p>
-        </w:tc>
-        <w:tc>
-          <w:tcPr>
-            <w:tcW w:type="dxa" w:w="4535"/>
-          </w:tcPr>
-          <w:p>
-            <w:pPr>
-              <w:jc w:val="center"/>
-            </w:pPr>
-            <w:r/>
-            <w:r>
-              <w:rPr>
-                <w:rFonts w:ascii="Times New Roman" w:hAnsi="Times New Roman" w:eastAsia="宋体"/>
-                <w:b w:val="0"/>
-                <w:sz w:val="17"/>
-              </w:rPr>
-              <w:t>风格条件边际向全局边际的收缩系数，本文取 λ = n/(n+10)</w:t>
-            </w:r>
-          </w:p>
-        </w:tc>
-      </w:tr>
-      <w:tr>
-        <w:tc>
-          <w:tcPr>
-            <w:tcW w:type="dxa" w:w="4535"/>
-          </w:tcPr>
-          <w:p>
-            <w:pPr>
-              <w:jc w:val="center"/>
-            </w:pPr>
-            <w:r/>
-            <w:r>
-              <w:rPr>
-                <w:rFonts w:ascii="Times New Roman" w:hAnsi="Times New Roman" w:eastAsia="宋体"/>
-                <w:b w:val="0"/>
-                <w:sz w:val="17"/>
-              </w:rPr>
-              <w:t>|ρ|</w:t>
-            </w:r>
-          </w:p>
-        </w:tc>
-        <w:tc>
-          <w:tcPr>
-            <w:tcW w:type="dxa" w:w="4535"/>
-          </w:tcPr>
-          <w:p>
-            <w:pPr>
-              <w:jc w:val="center"/>
-            </w:pPr>
-            <w:r/>
-            <w:r>
-              <w:rPr>
-                <w:rFonts w:ascii="Times New Roman" w:hAnsi="Times New Roman" w:eastAsia="宋体"/>
-                <w:b w:val="0"/>
-                <w:sz w:val="17"/>
-              </w:rPr>
-              <w:t>斯皮尔曼相关系数的绝对值，用于共表达图的边权与阈值</w:t>
-            </w:r>
-          </w:p>
-        </w:tc>
-      </w:tr>
-      <w:tr>
-        <w:tc>
-          <w:tcPr>
-            <w:tcW w:type="dxa" w:w="4535"/>
-          </w:tcPr>
-          <w:p>
-            <w:pPr>
-              <w:jc w:val="center"/>
-            </w:pPr>
-            <w:r/>
-            <w:r>
-              <w:rPr>
-                <w:rFonts w:ascii="Times New Roman" w:hAnsi="Times New Roman" w:eastAsia="宋体"/>
-                <w:b w:val="0"/>
-                <w:sz w:val="17"/>
-              </w:rPr>
-              <w:t>Q</w:t>
-            </w:r>
-          </w:p>
-        </w:tc>
-        <w:tc>
-          <w:tcPr>
-            <w:tcW w:type="dxa" w:w="4535"/>
-          </w:tcPr>
-          <w:p>
-            <w:pPr>
-              <w:jc w:val="center"/>
-            </w:pPr>
-            <w:r/>
-            <w:r>
-              <w:rPr>
-                <w:rFonts w:ascii="Times New Roman" w:hAnsi="Times New Roman" w:eastAsia="宋体"/>
-                <w:b w:val="0"/>
-                <w:sz w:val="17"/>
-              </w:rPr>
-              <w:t>模块度（modularity），衡量社区划分的内部连接强度</w:t>
-            </w:r>
-          </w:p>
-        </w:tc>
-      </w:tr>
-      <w:tr>
-        <w:tc>
-          <w:tcPr>
-            <w:tcW w:type="dxa" w:w="4535"/>
-          </w:tcPr>
-          <w:p>
-            <w:pPr>
-              <w:jc w:val="center"/>
-            </w:pPr>
-            <w:r/>
-            <w:r>
-              <w:rPr>
-                <w:rFonts w:ascii="Times New Roman" w:hAnsi="Times New Roman" w:eastAsia="宋体"/>
-                <w:b w:val="0"/>
-                <w:sz w:val="17"/>
-              </w:rPr>
-              <w:t>KS</w:t>
-            </w:r>
-          </w:p>
-        </w:tc>
-        <w:tc>
-          <w:tcPr>
-            <w:tcW w:type="dxa" w:w="4535"/>
-          </w:tcPr>
-          <w:p>
-            <w:pPr>
-              <w:jc w:val="center"/>
-            </w:pPr>
-            <w:r/>
-            <w:r>
-              <w:rPr>
-                <w:rFonts w:ascii="Times New Roman" w:hAnsi="Times New Roman" w:eastAsia="宋体"/>
-                <w:b w:val="0"/>
-                <w:sz w:val="17"/>
-              </w:rPr>
-              <w:t>柯尔莫哥洛夫—斯米尔诺夫距离，衡量生成谱与真实样本的边际差异</w:t>
-            </w:r>
-          </w:p>
-        </w:tc>
-      </w:tr>
-      <w:tr>
-        <w:tc>
-          <w:tcPr>
-            <w:tcW w:type="dxa" w:w="4535"/>
-          </w:tcPr>
-          <w:p>
-            <w:pPr>
-              <w:jc w:val="center"/>
-            </w:pPr>
-            <w:r/>
-            <w:r>
-              <w:rPr>
-                <w:rFonts w:ascii="Times New Roman" w:hAnsi="Times New Roman" w:eastAsia="宋体"/>
-                <w:b w:val="0"/>
-                <w:sz w:val="17"/>
-              </w:rPr>
-              <w:t>QWK</w:t>
-            </w:r>
-          </w:p>
-        </w:tc>
-        <w:tc>
-          <w:tcPr>
-            <w:tcW w:type="dxa" w:w="4535"/>
-          </w:tcPr>
-          <w:p>
-            <w:pPr>
-              <w:jc w:val="center"/>
-            </w:pPr>
-            <w:r/>
-            <w:r>
-              <w:rPr>
-                <w:rFonts w:ascii="Times New Roman" w:hAnsi="Times New Roman" w:eastAsia="宋体"/>
-                <w:b w:val="0"/>
-                <w:sz w:val="17"/>
-              </w:rPr>
-              <w:t>二次加权 Kappa，衡量 0–6 相对分级与感官真值的一致性</w:t>
-            </w:r>
-          </w:p>
-        </w:tc>
-      </w:tr>
-      <w:tr>
-        <w:tc>
-          <w:tcPr>
-            <w:tcW w:type="dxa" w:w="4535"/>
-          </w:tcPr>
-          <w:p>
-            <w:pPr>
-              <w:jc w:val="center"/>
-            </w:pPr>
-            <w:r/>
-            <w:r>
-              <w:rPr>
-                <w:rFonts w:ascii="Times New Roman" w:hAnsi="Times New Roman" w:eastAsia="宋体"/>
-                <w:b w:val="0"/>
-                <w:sz w:val="17"/>
-              </w:rPr>
-              <w:t>分位组内 ρ</w:t>
-            </w:r>
-          </w:p>
-        </w:tc>
-        <w:tc>
-          <w:tcPr>
-            <w:tcW w:type="dxa" w:w="4535"/>
-          </w:tcPr>
-          <w:p>
-            <w:pPr>
-              <w:jc w:val="center"/>
-            </w:pPr>
-            <w:r/>
-            <w:r>
-              <w:rPr>
-                <w:rFonts w:ascii="Times New Roman" w:hAnsi="Times New Roman" w:eastAsia="宋体"/>
-                <w:b w:val="0"/>
-                <w:sz w:val="17"/>
-              </w:rPr>
-              <w:t>按浓度分位分组后计算的组内斯皮尔曼相关，用于剂量—响应判定</w:t>
-            </w:r>
-          </w:p>
-        </w:tc>
-      </w:tr>
-      <w:tr>
-        <w:tc>
-          <w:tcPr>
-            <w:tcW w:type="dxa" w:w="4535"/>
-          </w:tcPr>
-          <w:p>
-            <w:pPr>
-              <w:jc w:val="center"/>
-            </w:pPr>
-            <w:r/>
-            <w:r>
-              <w:rPr>
-                <w:rFonts w:ascii="Times New Roman" w:hAnsi="Times New Roman" w:eastAsia="宋体"/>
-                <w:b w:val="0"/>
-                <w:sz w:val="17"/>
-              </w:rPr>
-              <w:t>GM</w:t>
-            </w:r>
-          </w:p>
-        </w:tc>
-        <w:tc>
-          <w:tcPr>
-            <w:tcW w:type="dxa" w:w="4535"/>
-          </w:tcPr>
-          <w:p>
-            <w:pPr>
-              <w:jc w:val="center"/>
-            </w:pPr>
-            <w:r/>
-            <w:r>
-              <w:rPr>
-                <w:rFonts w:ascii="Times New Roman" w:hAnsi="Times New Roman" w:eastAsia="宋体"/>
-                <w:b w:val="0"/>
-                <w:sz w:val="17"/>
-              </w:rPr>
-              <w:t>几何均价，多个零售来源价格的加权合成（以对数均值的指数还原）</w:t>
-            </w:r>
-          </w:p>
-        </w:tc>
-      </w:tr>
-    </w:tbl>
-    <w:p>
-      <w:pPr>
-        <w:spacing w:before="40" w:after="160"/>
-        <w:jc w:val="center"/>
-      </w:pPr>
-      <w:r>
-        <w:rPr>
-          <w:rFonts w:ascii="Times New Roman" w:hAnsi="Times New Roman" w:eastAsia="宋体"/>
-          <w:b w:val="0"/>
-          <w:sz w:val="18"/>
-        </w:rPr>
-        <w:t>表 1  全文主要符号与含义</w:t>
-      </w:r>
-    </w:p>
-    <w:p>
-      <w:pPr>
-        <w:spacing w:before="140" w:after="80" w:line="312" w:lineRule="auto"/>
-        <w:jc w:val="left"/>
-      </w:pPr>
-      <w:r>
-        <w:rPr>
-          <w:rFonts w:ascii="Times New Roman" w:hAnsi="Times New Roman" w:eastAsia="黑体"/>
-          <w:b/>
-          <w:sz w:val="26"/>
-        </w:rPr>
-        <w:t>3.6 与官方文本表述不一致的三处及其证据</w:t>
-      </w:r>
-    </w:p>
-    <w:p>
-      <w:pPr>
-        <w:spacing w:after="80" w:line="324" w:lineRule="auto"/>
-        <w:ind w:firstLine="420"/>
-      </w:pPr>
-      <w:r>
-        <w:rPr>
-          <w:rFonts w:ascii="Times New Roman" w:hAnsi="Times New Roman" w:eastAsia="宋体"/>
-          <w:b w:val="0"/>
-          <w:sz w:val="21"/>
-        </w:rPr>
-        <w:t>下表集中列出本文裁定的三处与官方赛题文本表述不一致之处，并给出可复算的证据；全文其余建模口径均以此三处裁定为准。</w:t>
+        <w:t>完成语义裁定后，先对样本规模、缺失结构和目标分布做描述性检查，再进入模型比较。这一步的作用不是增加一个未经预注册的筛选标准，而是判断后续指标的适用范围：化学特征的原始缺失很少，但风格分层高度不均衡；感官目标均值接近零、维度间离散程度不同，说明宏平均指标需要与逐维结果并读。</w:t>
       </w:r>
     </w:p>
     <w:p>
@@ -2293,7 +1774,7 @@
                 <w:b/>
                 <w:sz w:val="16"/>
               </w:rPr>
-              <w:t>不一致之处</w:t>
+              <w:t>数据对象</w:t>
             </w:r>
           </w:p>
         </w:tc>
@@ -2312,7 +1793,7 @@
                 <w:b/>
                 <w:sz w:val="16"/>
               </w:rPr>
-              <w:t>官方文本表述</w:t>
+              <w:t>规模</w:t>
             </w:r>
           </w:p>
         </w:tc>
@@ -2331,7 +1812,7 @@
                 <w:b/>
                 <w:sz w:val="16"/>
               </w:rPr>
-              <w:t>本文裁定</w:t>
+              <w:t>分布与缺失概况</w:t>
             </w:r>
           </w:p>
         </w:tc>
@@ -2350,7 +1831,7 @@
                 <w:b/>
                 <w:sz w:val="16"/>
               </w:rPr>
-              <w:t>证据</w:t>
+              <w:t>处理与解释</w:t>
             </w:r>
           </w:p>
         </w:tc>
@@ -2371,7 +1852,7 @@
                 <w:b w:val="0"/>
                 <w:sz w:val="16"/>
               </w:rPr>
-              <w:t>① 相关矩阵的相关系数类型</w:t>
+              <w:t>化学测量</w:t>
             </w:r>
           </w:p>
         </w:tc>
@@ -2390,7 +1871,7 @@
                 <w:b w:val="0"/>
                 <w:sz w:val="16"/>
               </w:rPr>
-              <w:t>赛题文本称附件 2 单元格为皮尔逊相关系数</w:t>
+              <w:t>250 × 231；保留 227 个建模特征</w:t>
             </w:r>
           </w:p>
         </w:tc>
@@ -2409,7 +1890,7 @@
                 <w:b w:val="0"/>
                 <w:sz w:val="16"/>
               </w:rPr>
-              <w:t>实为斯皮尔曼相关系数</w:t>
+              <w:t>原始缺失 73 格（0.13%）；统一矩阵缺失 0 格</w:t>
             </w:r>
           </w:p>
         </w:tc>
@@ -2428,7 +1909,7 @@
                 <w:b w:val="0"/>
                 <w:sz w:val="16"/>
               </w:rPr>
-              <w:t>以 1.csv、4.csv 重算斯皮尔曼并与给定 5.csv、6.csv 逐元素比对：max|Δ|=0、逐元素吻合比例 1.0000；皮尔逊口径下中位绝对偏差约 0.04；附件《数据说明》对 2/5/6 均自述为 Sp…</w:t>
+              <w:t>逐列裁定标度；剔除 4 个未经验证的派生求和列</w:t>
             </w:r>
           </w:p>
         </w:tc>
@@ -2449,7 +1930,7 @@
                 <w:b w:val="0"/>
                 <w:sz w:val="16"/>
               </w:rPr>
-              <w:t>② 3.xlsx 的实际内容</w:t>
+              <w:t>感官目标</w:t>
             </w:r>
           </w:p>
         </w:tc>
@@ -2468,7 +1949,7 @@
                 <w:b w:val="0"/>
                 <w:sz w:val="16"/>
               </w:rPr>
-              <w:t>赛题文本称 3.xlsx 为「品评小组使用的品评表」</w:t>
+              <w:t>250 × 50；Aroma 15、Flavour 15、通用维度 20</w:t>
             </w:r>
           </w:p>
         </w:tc>
@@ -2487,7 +1968,7 @@
                 <w:b w:val="0"/>
                 <w:sz w:val="16"/>
               </w:rPr>
-              <w:t>实为空白品评卡模板</w:t>
+              <w:t>缺失 0 格；维度均值范围 -0.049–0.063，标准差范围 0.370–0.858</w:t>
             </w:r>
           </w:p>
         </w:tc>
@@ -2506,7 +1987,7 @@
                 <w:b w:val="0"/>
                 <w:sz w:val="16"/>
               </w:rPr>
-              <w:t>逐格核查 12 张评分卡无任何品评员打分记录；summary 表 600 个数值单元格全为指向空白评分卡的公式（=beer_1!$Q$7 等），故附件不含原始 0–6 分数</w:t>
+              <w:t>作为连续回归目标；不把标准化值解释为原始 0–6 评分</w:t>
             </w:r>
           </w:p>
         </w:tc>
@@ -2527,7 +2008,7 @@
                 <w:b w:val="0"/>
                 <w:sz w:val="16"/>
               </w:rPr>
-              <w:t>③ 1.csv 的标度结构</w:t>
+              <w:t>风格分层</w:t>
             </w:r>
           </w:p>
         </w:tc>
@@ -2546,7 +2027,7 @@
                 <w:b w:val="0"/>
                 <w:sz w:val="16"/>
               </w:rPr>
-              <w:t>赛题文本按统一对数标度使用化合物丰度</w:t>
+              <w:t>22 个细分风格；每个风格样本数 3–31，中位数 10</w:t>
             </w:r>
           </w:p>
         </w:tc>
@@ -2565,7 +2046,7 @@
                 <w:b w:val="0"/>
                 <w:sz w:val="16"/>
               </w:rPr>
-              <w:t>实为混合标度（log10 与原始浓度并存）</w:t>
+              <w:t>最小风格仅 3 款；训练/留出合计 175/75</w:t>
             </w:r>
           </w:p>
         </w:tc>
@@ -2584,7 +2065,7 @@
                 <w:b w:val="0"/>
                 <w:sz w:val="16"/>
               </w:rPr>
-              <w:t>以 8.xlsx 标定值逐列回归：log10 列 37（斜率 1.0000、r=1.000000）、原始浓度列 19（斜率 1.0000、r≥0.999998）、近似原始浓度 10、无法逐点复现 4；自然对数假设斜率恒…</w:t>
+              <w:t>固定风格分层切分；小样本风格仅作条件生成的谨慎参照</w:t>
             </w:r>
           </w:p>
         </w:tc>
@@ -2601,7 +2082,879 @@
           <w:b w:val="0"/>
           <w:sz w:val="18"/>
         </w:rPr>
-        <w:t>表 2  三处与官方文本表述不一致之处及其证据</w:t>
+        <w:t>表 1  建模样本与目标的描述性统计</w:t>
+      </w:r>
+    </w:p>
+    <w:p>
+      <w:pPr>
+        <w:spacing w:after="80" w:line="324" w:lineRule="auto"/>
+        <w:ind w:firstLine="420"/>
+      </w:pPr>
+      <w:r>
+        <w:rPr>
+          <w:rFonts w:ascii="Times New Roman" w:hAnsi="Times New Roman" w:eastAsia="宋体"/>
+          <w:b w:val="0"/>
+          <w:sz w:val="21"/>
+        </w:rPr>
+        <w:t>由此，本文把 175/75 切分视为固定的评价协议，而不是把样本较少的风格重新合并；所有缺失处理、尺度转换和特征删减均发生在统一矩阵形成阶段，并通过后续回归测试锁定。描述性统计也解释了为什么问题三报告每个风格的真实留出样本量、问题一报告逐维指标，而不只给出一个看似精确的总体分数。</w:t>
+      </w:r>
+    </w:p>
+    <w:p>
+      <w:pPr>
+        <w:spacing w:before="140" w:after="80" w:line="312" w:lineRule="auto"/>
+        <w:jc w:val="left"/>
+      </w:pPr>
+      <w:r>
+        <w:rPr>
+          <w:rFonts w:ascii="Times New Roman" w:hAnsi="Times New Roman" w:eastAsia="黑体"/>
+          <w:b/>
+          <w:sz w:val="26"/>
+        </w:rPr>
+        <w:t>3.4 感官维度与数据划分</w:t>
+      </w:r>
+    </w:p>
+    <w:p>
+      <w:pPr>
+        <w:spacing w:after="80" w:line="324" w:lineRule="auto"/>
+        <w:ind w:firstLine="420"/>
+      </w:pPr>
+      <w:r>
+        <w:rPr>
+          <w:rFonts w:ascii="Times New Roman" w:hAnsi="Times New Roman" w:eastAsia="宋体"/>
+          <w:b w:val="0"/>
+          <w:sz w:val="21"/>
+        </w:rPr>
+        <w:t>3.xlsx 提供的感官品评卡定义了 Aroma 与 Flavour 两套属性及其 0–6 分制的语义锚点（0 分为「不存在」，6 分为「主导/强烈」），但经逐格核查，其 12 张评分卡内并无任何品评员打分的记录，汇总表的数值单元格指向空白评分卡的公式；即</w:t>
+      </w:r>
+      <w:r>
+        <w:rPr>
+          <w:rFonts w:ascii="Times New Roman" w:hAnsi="Times New Roman" w:eastAsia="宋体"/>
+          <w:b/>
+          <w:sz w:val="21"/>
+        </w:rPr>
+        <w:t>附件中不存在原始 0–6 分数</w:t>
+      </w:r>
+      <w:r>
+        <w:rPr>
+          <w:rFonts w:ascii="Times New Roman" w:hAnsi="Times New Roman" w:eastAsia="宋体"/>
+          <w:b w:val="0"/>
+          <w:sz w:val="21"/>
+        </w:rPr>
+        <w:t>。4.csv 的 50 个感官列是经按维度中心化与缩放的连续值（均值近零、标准差在 0.37 至 0.86 之间，并非标准分数），因此原始尺度无法反解。本文据此交付全部 50 个感官维度（Aroma 15 维、Flavour 15 维与 20 个通用维度，覆盖题面所称「约 40 个维度」），并在第五章明确说明所给 0–6 分制的构造方式。</w:t>
+      </w:r>
+    </w:p>
+    <w:p>
+      <w:pPr>
+        <w:spacing w:after="80" w:line="324" w:lineRule="auto"/>
+        <w:ind w:firstLine="420"/>
+      </w:pPr>
+      <w:r>
+        <w:rPr>
+          <w:rFonts w:ascii="Times New Roman" w:hAnsi="Times New Roman" w:eastAsia="宋体"/>
+          <w:b w:val="0"/>
+          <w:sz w:val="21"/>
+        </w:rPr>
+        <w:t>数据划分沿用固定种子、按风格分层的留出方案：175 款用于训练与调参，75 款用于一次性评估，22 个风格在两侧均有分布。所有切点、参数与模型选择一律只在训练集内完成。</w:t>
+      </w:r>
+    </w:p>
+    <w:p>
+      <w:pPr>
+        <w:spacing w:before="140" w:after="80" w:line="312" w:lineRule="auto"/>
+        <w:jc w:val="left"/>
+      </w:pPr>
+      <w:r>
+        <w:rPr>
+          <w:rFonts w:ascii="Times New Roman" w:hAnsi="Times New Roman" w:eastAsia="黑体"/>
+          <w:b/>
+          <w:sz w:val="26"/>
+        </w:rPr>
+        <w:t>3.5 主要符号与含义</w:t>
+      </w:r>
+    </w:p>
+    <w:p>
+      <w:pPr>
+        <w:spacing w:after="80" w:line="324" w:lineRule="auto"/>
+        <w:ind w:firstLine="420"/>
+      </w:pPr>
+      <w:r>
+        <w:rPr>
+          <w:rFonts w:ascii="Times New Roman" w:hAnsi="Times New Roman" w:eastAsia="宋体"/>
+          <w:b w:val="0"/>
+          <w:sz w:val="21"/>
+        </w:rPr>
+        <w:t>为便于后文对照，全文使用的主要符号统一列于下表。</w:t>
+      </w:r>
+    </w:p>
+    <w:p>
+      <w:pPr>
+        <w:spacing w:before="80"/>
+        <w:jc w:val="center"/>
+      </w:pPr>
+    </w:p>
+    <w:tbl>
+      <w:tblPr>
+        <w:tblStyle w:val="16"/>
+        <w:tblW w:type="auto" w:w="0"/>
+        <w:tblLayout w:type="autofit"/>
+        <w:tblLook w:firstColumn="1" w:firstRow="1" w:lastColumn="0" w:lastRow="0" w:noHBand="0" w:noVBand="1" w:val="04A0"/>
+      </w:tblPr>
+      <w:tblGrid>
+        <w:gridCol w:w="4535"/>
+        <w:gridCol w:w="4535"/>
+      </w:tblGrid>
+      <w:tr>
+        <w:trPr>
+          <w:tblHeader w:val="true"/>
+        </w:trPr>
+        <w:tc>
+          <w:tcPr>
+            <w:tcW w:type="dxa" w:w="4535"/>
+          </w:tcPr>
+          <w:p>
+            <w:pPr>
+              <w:jc w:val="center"/>
+            </w:pPr>
+            <w:r/>
+            <w:r>
+              <w:rPr>
+                <w:rFonts w:ascii="Times New Roman" w:hAnsi="Times New Roman" w:eastAsia="黑体"/>
+                <w:b/>
+                <w:sz w:val="17"/>
+              </w:rPr>
+              <w:t>符号</w:t>
+            </w:r>
+          </w:p>
+        </w:tc>
+        <w:tc>
+          <w:tcPr>
+            <w:tcW w:type="dxa" w:w="4535"/>
+          </w:tcPr>
+          <w:p>
+            <w:pPr>
+              <w:jc w:val="center"/>
+            </w:pPr>
+            <w:r/>
+            <w:r>
+              <w:rPr>
+                <w:rFonts w:ascii="Times New Roman" w:hAnsi="Times New Roman" w:eastAsia="黑体"/>
+                <w:b/>
+                <w:sz w:val="17"/>
+              </w:rPr>
+              <w:t>含义</w:t>
+            </w:r>
+          </w:p>
+        </w:tc>
+      </w:tr>
+      <w:tr>
+        <w:tc>
+          <w:tcPr>
+            <w:tcW w:type="dxa" w:w="4535"/>
+          </w:tcPr>
+          <w:p>
+            <w:pPr>
+              <w:jc w:val="center"/>
+            </w:pPr>
+            <w:r/>
+            <w:r>
+              <w:rPr>
+                <w:rFonts w:ascii="Times New Roman" w:hAnsi="Times New Roman" w:eastAsia="宋体"/>
+                <w:b w:val="0"/>
+                <w:sz w:val="17"/>
+              </w:rPr>
+              <w:t>z</w:t>
+            </w:r>
+          </w:p>
+        </w:tc>
+        <w:tc>
+          <w:tcPr>
+            <w:tcW w:type="dxa" w:w="4535"/>
+          </w:tcPr>
+          <w:p>
+            <w:pPr>
+              <w:jc w:val="center"/>
+            </w:pPr>
+            <w:r/>
+            <w:r>
+              <w:rPr>
+                <w:rFonts w:ascii="Times New Roman" w:hAnsi="Times New Roman" w:eastAsia="宋体"/>
+                <w:b w:val="0"/>
+                <w:sz w:val="17"/>
+              </w:rPr>
+              <w:t>标准化后的感官值（按维度中心化并缩放的连续量）</w:t>
+            </w:r>
+          </w:p>
+        </w:tc>
+      </w:tr>
+      <w:tr>
+        <w:tc>
+          <w:tcPr>
+            <w:tcW w:type="dxa" w:w="4535"/>
+          </w:tcPr>
+          <w:p>
+            <w:pPr>
+              <w:jc w:val="center"/>
+            </w:pPr>
+            <w:r/>
+            <w:r>
+              <w:rPr>
+                <w:rFonts w:ascii="Times New Roman" w:hAnsi="Times New Roman" w:eastAsia="宋体"/>
+                <w:b w:val="0"/>
+                <w:sz w:val="17"/>
+              </w:rPr>
+              <w:t>λ</w:t>
+            </w:r>
+          </w:p>
+        </w:tc>
+        <w:tc>
+          <w:tcPr>
+            <w:tcW w:type="dxa" w:w="4535"/>
+          </w:tcPr>
+          <w:p>
+            <w:pPr>
+              <w:jc w:val="center"/>
+            </w:pPr>
+            <w:r/>
+            <w:r>
+              <w:rPr>
+                <w:rFonts w:ascii="Times New Roman" w:hAnsi="Times New Roman" w:eastAsia="宋体"/>
+                <w:b w:val="0"/>
+                <w:sz w:val="17"/>
+              </w:rPr>
+              <w:t>风格条件边际向全局边际的收缩系数，本文取 λ = n/(n+10)</w:t>
+            </w:r>
+          </w:p>
+        </w:tc>
+      </w:tr>
+      <w:tr>
+        <w:tc>
+          <w:tcPr>
+            <w:tcW w:type="dxa" w:w="4535"/>
+          </w:tcPr>
+          <w:p>
+            <w:pPr>
+              <w:jc w:val="center"/>
+            </w:pPr>
+            <w:r/>
+            <w:r>
+              <w:rPr>
+                <w:rFonts w:ascii="Times New Roman" w:hAnsi="Times New Roman" w:eastAsia="宋体"/>
+                <w:b w:val="0"/>
+                <w:sz w:val="17"/>
+              </w:rPr>
+              <w:t>|ρ|</w:t>
+            </w:r>
+          </w:p>
+        </w:tc>
+        <w:tc>
+          <w:tcPr>
+            <w:tcW w:type="dxa" w:w="4535"/>
+          </w:tcPr>
+          <w:p>
+            <w:pPr>
+              <w:jc w:val="center"/>
+            </w:pPr>
+            <w:r/>
+            <w:r>
+              <w:rPr>
+                <w:rFonts w:ascii="Times New Roman" w:hAnsi="Times New Roman" w:eastAsia="宋体"/>
+                <w:b w:val="0"/>
+                <w:sz w:val="17"/>
+              </w:rPr>
+              <w:t>斯皮尔曼相关系数的绝对值，用于共表达图的边权与阈值</w:t>
+            </w:r>
+          </w:p>
+        </w:tc>
+      </w:tr>
+      <w:tr>
+        <w:tc>
+          <w:tcPr>
+            <w:tcW w:type="dxa" w:w="4535"/>
+          </w:tcPr>
+          <w:p>
+            <w:pPr>
+              <w:jc w:val="center"/>
+            </w:pPr>
+            <w:r/>
+            <w:r>
+              <w:rPr>
+                <w:rFonts w:ascii="Times New Roman" w:hAnsi="Times New Roman" w:eastAsia="宋体"/>
+                <w:b w:val="0"/>
+                <w:sz w:val="17"/>
+              </w:rPr>
+              <w:t>Q</w:t>
+            </w:r>
+          </w:p>
+        </w:tc>
+        <w:tc>
+          <w:tcPr>
+            <w:tcW w:type="dxa" w:w="4535"/>
+          </w:tcPr>
+          <w:p>
+            <w:pPr>
+              <w:jc w:val="center"/>
+            </w:pPr>
+            <w:r/>
+            <w:r>
+              <w:rPr>
+                <w:rFonts w:ascii="Times New Roman" w:hAnsi="Times New Roman" w:eastAsia="宋体"/>
+                <w:b w:val="0"/>
+                <w:sz w:val="17"/>
+              </w:rPr>
+              <w:t>模块度（modularity），衡量社区划分的内部连接强度</w:t>
+            </w:r>
+          </w:p>
+        </w:tc>
+      </w:tr>
+      <w:tr>
+        <w:tc>
+          <w:tcPr>
+            <w:tcW w:type="dxa" w:w="4535"/>
+          </w:tcPr>
+          <w:p>
+            <w:pPr>
+              <w:jc w:val="center"/>
+            </w:pPr>
+            <w:r/>
+            <w:r>
+              <w:rPr>
+                <w:rFonts w:ascii="Times New Roman" w:hAnsi="Times New Roman" w:eastAsia="宋体"/>
+                <w:b w:val="0"/>
+                <w:sz w:val="17"/>
+              </w:rPr>
+              <w:t>KS</w:t>
+            </w:r>
+          </w:p>
+        </w:tc>
+        <w:tc>
+          <w:tcPr>
+            <w:tcW w:type="dxa" w:w="4535"/>
+          </w:tcPr>
+          <w:p>
+            <w:pPr>
+              <w:jc w:val="center"/>
+            </w:pPr>
+            <w:r/>
+            <w:r>
+              <w:rPr>
+                <w:rFonts w:ascii="Times New Roman" w:hAnsi="Times New Roman" w:eastAsia="宋体"/>
+                <w:b w:val="0"/>
+                <w:sz w:val="17"/>
+              </w:rPr>
+              <w:t>柯尔莫哥洛夫—斯米尔诺夫距离，衡量生成谱与真实样本的边际差异</w:t>
+            </w:r>
+          </w:p>
+        </w:tc>
+      </w:tr>
+      <w:tr>
+        <w:tc>
+          <w:tcPr>
+            <w:tcW w:type="dxa" w:w="4535"/>
+          </w:tcPr>
+          <w:p>
+            <w:pPr>
+              <w:jc w:val="center"/>
+            </w:pPr>
+            <w:r/>
+            <w:r>
+              <w:rPr>
+                <w:rFonts w:ascii="Times New Roman" w:hAnsi="Times New Roman" w:eastAsia="宋体"/>
+                <w:b w:val="0"/>
+                <w:sz w:val="17"/>
+              </w:rPr>
+              <w:t>QWK</w:t>
+            </w:r>
+          </w:p>
+        </w:tc>
+        <w:tc>
+          <w:tcPr>
+            <w:tcW w:type="dxa" w:w="4535"/>
+          </w:tcPr>
+          <w:p>
+            <w:pPr>
+              <w:jc w:val="center"/>
+            </w:pPr>
+            <w:r/>
+            <w:r>
+              <w:rPr>
+                <w:rFonts w:ascii="Times New Roman" w:hAnsi="Times New Roman" w:eastAsia="宋体"/>
+                <w:b w:val="0"/>
+                <w:sz w:val="17"/>
+              </w:rPr>
+              <w:t>二次加权 Kappa，衡量 0–6 相对分级与感官真值的一致性</w:t>
+            </w:r>
+          </w:p>
+        </w:tc>
+      </w:tr>
+      <w:tr>
+        <w:tc>
+          <w:tcPr>
+            <w:tcW w:type="dxa" w:w="4535"/>
+          </w:tcPr>
+          <w:p>
+            <w:pPr>
+              <w:jc w:val="center"/>
+            </w:pPr>
+            <w:r/>
+            <w:r>
+              <w:rPr>
+                <w:rFonts w:ascii="Times New Roman" w:hAnsi="Times New Roman" w:eastAsia="宋体"/>
+                <w:b w:val="0"/>
+                <w:sz w:val="17"/>
+              </w:rPr>
+              <w:t>分位组内 ρ</w:t>
+            </w:r>
+          </w:p>
+        </w:tc>
+        <w:tc>
+          <w:tcPr>
+            <w:tcW w:type="dxa" w:w="4535"/>
+          </w:tcPr>
+          <w:p>
+            <w:pPr>
+              <w:jc w:val="center"/>
+            </w:pPr>
+            <w:r/>
+            <w:r>
+              <w:rPr>
+                <w:rFonts w:ascii="Times New Roman" w:hAnsi="Times New Roman" w:eastAsia="宋体"/>
+                <w:b w:val="0"/>
+                <w:sz w:val="17"/>
+              </w:rPr>
+              <w:t>按浓度分位分组后计算的组内斯皮尔曼相关，用于剂量—响应判定</w:t>
+            </w:r>
+          </w:p>
+        </w:tc>
+      </w:tr>
+      <w:tr>
+        <w:tc>
+          <w:tcPr>
+            <w:tcW w:type="dxa" w:w="4535"/>
+          </w:tcPr>
+          <w:p>
+            <w:pPr>
+              <w:jc w:val="center"/>
+            </w:pPr>
+            <w:r/>
+            <w:r>
+              <w:rPr>
+                <w:rFonts w:ascii="Times New Roman" w:hAnsi="Times New Roman" w:eastAsia="宋体"/>
+                <w:b w:val="0"/>
+                <w:sz w:val="17"/>
+              </w:rPr>
+              <w:t>GM</w:t>
+            </w:r>
+          </w:p>
+        </w:tc>
+        <w:tc>
+          <w:tcPr>
+            <w:tcW w:type="dxa" w:w="4535"/>
+          </w:tcPr>
+          <w:p>
+            <w:pPr>
+              <w:jc w:val="center"/>
+            </w:pPr>
+            <w:r/>
+            <w:r>
+              <w:rPr>
+                <w:rFonts w:ascii="Times New Roman" w:hAnsi="Times New Roman" w:eastAsia="宋体"/>
+                <w:b w:val="0"/>
+                <w:sz w:val="17"/>
+              </w:rPr>
+              <w:t>几何均价，多个零售来源价格的加权合成（以对数均值的指数还原）</w:t>
+            </w:r>
+          </w:p>
+        </w:tc>
+      </w:tr>
+    </w:tbl>
+    <w:p>
+      <w:pPr>
+        <w:spacing w:before="40" w:after="160"/>
+        <w:jc w:val="center"/>
+      </w:pPr>
+      <w:r>
+        <w:rPr>
+          <w:rFonts w:ascii="Times New Roman" w:hAnsi="Times New Roman" w:eastAsia="宋体"/>
+          <w:b w:val="0"/>
+          <w:sz w:val="18"/>
+        </w:rPr>
+        <w:t>表 2  全文主要符号与含义</w:t>
+      </w:r>
+    </w:p>
+    <w:p>
+      <w:pPr>
+        <w:spacing w:before="140" w:after="80" w:line="312" w:lineRule="auto"/>
+        <w:jc w:val="left"/>
+      </w:pPr>
+      <w:r>
+        <w:rPr>
+          <w:rFonts w:ascii="Times New Roman" w:hAnsi="Times New Roman" w:eastAsia="黑体"/>
+          <w:b/>
+          <w:sz w:val="26"/>
+        </w:rPr>
+        <w:t>3.6 与官方文本表述不一致的三处及其证据</w:t>
+      </w:r>
+    </w:p>
+    <w:p>
+      <w:pPr>
+        <w:spacing w:after="80" w:line="324" w:lineRule="auto"/>
+        <w:ind w:firstLine="420"/>
+      </w:pPr>
+      <w:r>
+        <w:rPr>
+          <w:rFonts w:ascii="Times New Roman" w:hAnsi="Times New Roman" w:eastAsia="宋体"/>
+          <w:b w:val="0"/>
+          <w:sz w:val="21"/>
+        </w:rPr>
+        <w:t>下表集中列出本文裁定的三处与官方赛题文本表述不一致之处，并给出可复算的证据；全文其余建模口径均以此三处裁定为准。</w:t>
+      </w:r>
+    </w:p>
+    <w:p>
+      <w:pPr>
+        <w:spacing w:before="80"/>
+        <w:jc w:val="center"/>
+      </w:pPr>
+    </w:p>
+    <w:tbl>
+      <w:tblPr>
+        <w:tblStyle w:val="16"/>
+        <w:tblW w:type="auto" w:w="0"/>
+        <w:tblLayout w:type="autofit"/>
+        <w:tblLook w:firstColumn="1" w:firstRow="1" w:lastColumn="0" w:lastRow="0" w:noHBand="0" w:noVBand="1" w:val="04A0"/>
+      </w:tblPr>
+      <w:tblGrid>
+        <w:gridCol w:w="2267"/>
+        <w:gridCol w:w="2267"/>
+        <w:gridCol w:w="2267"/>
+        <w:gridCol w:w="2267"/>
+      </w:tblGrid>
+      <w:tr>
+        <w:trPr>
+          <w:tblHeader w:val="true"/>
+        </w:trPr>
+        <w:tc>
+          <w:tcPr>
+            <w:tcW w:type="dxa" w:w="2267"/>
+          </w:tcPr>
+          <w:p>
+            <w:pPr>
+              <w:jc w:val="center"/>
+            </w:pPr>
+            <w:r/>
+            <w:r>
+              <w:rPr>
+                <w:rFonts w:ascii="Times New Roman" w:hAnsi="Times New Roman" w:eastAsia="黑体"/>
+                <w:b/>
+                <w:sz w:val="16"/>
+              </w:rPr>
+              <w:t>不一致之处</w:t>
+            </w:r>
+          </w:p>
+        </w:tc>
+        <w:tc>
+          <w:tcPr>
+            <w:tcW w:type="dxa" w:w="2267"/>
+          </w:tcPr>
+          <w:p>
+            <w:pPr>
+              <w:jc w:val="center"/>
+            </w:pPr>
+            <w:r/>
+            <w:r>
+              <w:rPr>
+                <w:rFonts w:ascii="Times New Roman" w:hAnsi="Times New Roman" w:eastAsia="黑体"/>
+                <w:b/>
+                <w:sz w:val="16"/>
+              </w:rPr>
+              <w:t>官方文本表述</w:t>
+            </w:r>
+          </w:p>
+        </w:tc>
+        <w:tc>
+          <w:tcPr>
+            <w:tcW w:type="dxa" w:w="2267"/>
+          </w:tcPr>
+          <w:p>
+            <w:pPr>
+              <w:jc w:val="center"/>
+            </w:pPr>
+            <w:r/>
+            <w:r>
+              <w:rPr>
+                <w:rFonts w:ascii="Times New Roman" w:hAnsi="Times New Roman" w:eastAsia="黑体"/>
+                <w:b/>
+                <w:sz w:val="16"/>
+              </w:rPr>
+              <w:t>本文裁定</w:t>
+            </w:r>
+          </w:p>
+        </w:tc>
+        <w:tc>
+          <w:tcPr>
+            <w:tcW w:type="dxa" w:w="2267"/>
+          </w:tcPr>
+          <w:p>
+            <w:pPr>
+              <w:jc w:val="center"/>
+            </w:pPr>
+            <w:r/>
+            <w:r>
+              <w:rPr>
+                <w:rFonts w:ascii="Times New Roman" w:hAnsi="Times New Roman" w:eastAsia="黑体"/>
+                <w:b/>
+                <w:sz w:val="16"/>
+              </w:rPr>
+              <w:t>证据</w:t>
+            </w:r>
+          </w:p>
+        </w:tc>
+      </w:tr>
+      <w:tr>
+        <w:tc>
+          <w:tcPr>
+            <w:tcW w:type="dxa" w:w="2267"/>
+          </w:tcPr>
+          <w:p>
+            <w:pPr>
+              <w:jc w:val="center"/>
+            </w:pPr>
+            <w:r/>
+            <w:r>
+              <w:rPr>
+                <w:rFonts w:ascii="Times New Roman" w:hAnsi="Times New Roman" w:eastAsia="宋体"/>
+                <w:b w:val="0"/>
+                <w:sz w:val="16"/>
+              </w:rPr>
+              <w:t>① 相关矩阵的相关系数类型</w:t>
+            </w:r>
+          </w:p>
+        </w:tc>
+        <w:tc>
+          <w:tcPr>
+            <w:tcW w:type="dxa" w:w="2267"/>
+          </w:tcPr>
+          <w:p>
+            <w:pPr>
+              <w:jc w:val="center"/>
+            </w:pPr>
+            <w:r/>
+            <w:r>
+              <w:rPr>
+                <w:rFonts w:ascii="Times New Roman" w:hAnsi="Times New Roman" w:eastAsia="宋体"/>
+                <w:b w:val="0"/>
+                <w:sz w:val="16"/>
+              </w:rPr>
+              <w:t>赛题文本称附件 2 单元格为皮尔逊相关系数</w:t>
+            </w:r>
+          </w:p>
+        </w:tc>
+        <w:tc>
+          <w:tcPr>
+            <w:tcW w:type="dxa" w:w="2267"/>
+          </w:tcPr>
+          <w:p>
+            <w:pPr>
+              <w:jc w:val="center"/>
+            </w:pPr>
+            <w:r/>
+            <w:r>
+              <w:rPr>
+                <w:rFonts w:ascii="Times New Roman" w:hAnsi="Times New Roman" w:eastAsia="宋体"/>
+                <w:b w:val="0"/>
+                <w:sz w:val="16"/>
+              </w:rPr>
+              <w:t>实为斯皮尔曼相关系数</w:t>
+            </w:r>
+          </w:p>
+        </w:tc>
+        <w:tc>
+          <w:tcPr>
+            <w:tcW w:type="dxa" w:w="2267"/>
+          </w:tcPr>
+          <w:p>
+            <w:pPr>
+              <w:jc w:val="center"/>
+            </w:pPr>
+            <w:r/>
+            <w:r>
+              <w:rPr>
+                <w:rFonts w:ascii="Times New Roman" w:hAnsi="Times New Roman" w:eastAsia="宋体"/>
+                <w:b w:val="0"/>
+                <w:sz w:val="16"/>
+              </w:rPr>
+              <w:t>以 1.csv、4.csv 重算斯皮尔曼并与给定 5.csv、6.csv 逐元素比对：max|Δ|=0、逐元素吻合比例 1.0000；皮尔逊口径下中位绝对偏差约 0.04；附件《数据说明》对 2/5/6 均自述为 Sp…</w:t>
+            </w:r>
+          </w:p>
+        </w:tc>
+      </w:tr>
+      <w:tr>
+        <w:tc>
+          <w:tcPr>
+            <w:tcW w:type="dxa" w:w="2267"/>
+          </w:tcPr>
+          <w:p>
+            <w:pPr>
+              <w:jc w:val="center"/>
+            </w:pPr>
+            <w:r/>
+            <w:r>
+              <w:rPr>
+                <w:rFonts w:ascii="Times New Roman" w:hAnsi="Times New Roman" w:eastAsia="宋体"/>
+                <w:b w:val="0"/>
+                <w:sz w:val="16"/>
+              </w:rPr>
+              <w:t>② 3.xlsx 的实际内容</w:t>
+            </w:r>
+          </w:p>
+        </w:tc>
+        <w:tc>
+          <w:tcPr>
+            <w:tcW w:type="dxa" w:w="2267"/>
+          </w:tcPr>
+          <w:p>
+            <w:pPr>
+              <w:jc w:val="center"/>
+            </w:pPr>
+            <w:r/>
+            <w:r>
+              <w:rPr>
+                <w:rFonts w:ascii="Times New Roman" w:hAnsi="Times New Roman" w:eastAsia="宋体"/>
+                <w:b w:val="0"/>
+                <w:sz w:val="16"/>
+              </w:rPr>
+              <w:t>赛题文本称 3.xlsx 为「品评小组使用的品评表」</w:t>
+            </w:r>
+          </w:p>
+        </w:tc>
+        <w:tc>
+          <w:tcPr>
+            <w:tcW w:type="dxa" w:w="2267"/>
+          </w:tcPr>
+          <w:p>
+            <w:pPr>
+              <w:jc w:val="center"/>
+            </w:pPr>
+            <w:r/>
+            <w:r>
+              <w:rPr>
+                <w:rFonts w:ascii="Times New Roman" w:hAnsi="Times New Roman" w:eastAsia="宋体"/>
+                <w:b w:val="0"/>
+                <w:sz w:val="16"/>
+              </w:rPr>
+              <w:t>实为空白品评卡模板</w:t>
+            </w:r>
+          </w:p>
+        </w:tc>
+        <w:tc>
+          <w:tcPr>
+            <w:tcW w:type="dxa" w:w="2267"/>
+          </w:tcPr>
+          <w:p>
+            <w:pPr>
+              <w:jc w:val="center"/>
+            </w:pPr>
+            <w:r/>
+            <w:r>
+              <w:rPr>
+                <w:rFonts w:ascii="Times New Roman" w:hAnsi="Times New Roman" w:eastAsia="宋体"/>
+                <w:b w:val="0"/>
+                <w:sz w:val="16"/>
+              </w:rPr>
+              <w:t>逐格核查 12 张评分卡无任何品评员打分记录；summary 表 600 个数值单元格全为指向空白评分卡的公式（=beer_1!$Q$7 等），故附件不含原始 0–6 分数</w:t>
+            </w:r>
+          </w:p>
+        </w:tc>
+      </w:tr>
+      <w:tr>
+        <w:tc>
+          <w:tcPr>
+            <w:tcW w:type="dxa" w:w="2267"/>
+          </w:tcPr>
+          <w:p>
+            <w:pPr>
+              <w:jc w:val="center"/>
+            </w:pPr>
+            <w:r/>
+            <w:r>
+              <w:rPr>
+                <w:rFonts w:ascii="Times New Roman" w:hAnsi="Times New Roman" w:eastAsia="宋体"/>
+                <w:b w:val="0"/>
+                <w:sz w:val="16"/>
+              </w:rPr>
+              <w:t>③ 1.csv 的标度结构</w:t>
+            </w:r>
+          </w:p>
+        </w:tc>
+        <w:tc>
+          <w:tcPr>
+            <w:tcW w:type="dxa" w:w="2267"/>
+          </w:tcPr>
+          <w:p>
+            <w:pPr>
+              <w:jc w:val="center"/>
+            </w:pPr>
+            <w:r/>
+            <w:r>
+              <w:rPr>
+                <w:rFonts w:ascii="Times New Roman" w:hAnsi="Times New Roman" w:eastAsia="宋体"/>
+                <w:b w:val="0"/>
+                <w:sz w:val="16"/>
+              </w:rPr>
+              <w:t>赛题文本按统一对数标度使用化合物丰度</w:t>
+            </w:r>
+          </w:p>
+        </w:tc>
+        <w:tc>
+          <w:tcPr>
+            <w:tcW w:type="dxa" w:w="2267"/>
+          </w:tcPr>
+          <w:p>
+            <w:pPr>
+              <w:jc w:val="center"/>
+            </w:pPr>
+            <w:r/>
+            <w:r>
+              <w:rPr>
+                <w:rFonts w:ascii="Times New Roman" w:hAnsi="Times New Roman" w:eastAsia="宋体"/>
+                <w:b w:val="0"/>
+                <w:sz w:val="16"/>
+              </w:rPr>
+              <w:t>实为混合标度（log10 与原始浓度并存）</w:t>
+            </w:r>
+          </w:p>
+        </w:tc>
+        <w:tc>
+          <w:tcPr>
+            <w:tcW w:type="dxa" w:w="2267"/>
+          </w:tcPr>
+          <w:p>
+            <w:pPr>
+              <w:jc w:val="center"/>
+            </w:pPr>
+            <w:r/>
+            <w:r>
+              <w:rPr>
+                <w:rFonts w:ascii="Times New Roman" w:hAnsi="Times New Roman" w:eastAsia="宋体"/>
+                <w:b w:val="0"/>
+                <w:sz w:val="16"/>
+              </w:rPr>
+              <w:t>以 8.xlsx 标定值逐列回归：log10 列 37（斜率 1.0000、r=1.000000）、原始浓度列 19（斜率 1.0000、r≥0.999998）、近似原始浓度 10、无法逐点复现 4；自然对数假设斜率恒…</w:t>
+            </w:r>
+          </w:p>
+        </w:tc>
+      </w:tr>
+    </w:tbl>
+    <w:p>
+      <w:pPr>
+        <w:spacing w:before="40" w:after="160"/>
+        <w:jc w:val="center"/>
+      </w:pPr>
+      <w:r>
+        <w:rPr>
+          <w:rFonts w:ascii="Times New Roman" w:hAnsi="Times New Roman" w:eastAsia="宋体"/>
+          <w:b w:val="0"/>
+          <w:sz w:val="18"/>
+        </w:rPr>
+        <w:t>表 3  三处与官方文本表述不一致之处及其证据</w:t>
       </w:r>
     </w:p>
     <w:p>
@@ -2657,7 +3010,7 @@
           <w:b w:val="0"/>
           <w:sz w:val="21"/>
         </w:rPr>
-        <w:t>问题一以 1.csv 的化合物特征预测 50 个感官维度。特征取统一标度后的 227 个化学量，剔除 4 个公式未经验证的派生求和列；模型采用岭回归、偏最小二乘回归、多任务弹性网络、全局与分组极端随机树、逐指标梯度提升回归共七个主模型族；另保留 TabPFN 3.5 的队友协议五折复现，以覆盖线性低秩、强稀疏与树形非线性三类归纳偏置。该复现使用 231 个原始特征和 KFold，与主模型的 227 特征、固定 175/75 留出协议不同，只作协议核对，不参与主模型优劣排序。主指标为宏平均均方根误差，并同时报告宏平均绝对误差、逐维决定系数中位数、斯皮尔曼相关系数中位数。</w:t>
+        <w:t>问题一以 1.csv 的化合物特征预测 50 个感官维度。特征取统一标度后的 227 个化学量，剔除 4 个公式未经验证的派生求和列；主比较覆盖岭回归、偏最小二乘回归、多任务弹性网络、全局与分组极端随机树以及逐指标梯度提升回归七个模型族，分别对应线性低秩、稀疏线性和树形非线性归纳偏置。主模型使用固定的 175/75 风格分层留出协议，宏平均 RMSE 作为主要指标，同时报告宏平均 MAE、逐维 R² 中位数和斯皮尔曼相关系数中位数。另行保留 TabPFN 3.5 的既有复现协议，用于核对该协议下的复现结果是否可复算。该协议使用 231 个原始特征和 KFold，评估口径与主模型不同，因此不参与模型优劣排序。</w:t>
       </w:r>
     </w:p>
     <w:p>
@@ -2733,7 +3086,7 @@
           <w:b w:val="0"/>
           <w:sz w:val="21"/>
         </w:rPr>
-        <w:t>，五条须同时满足：载体在参考表中存在感知阈值；载体与该感官维度的斯皮尔曼相关系数不低于 0.3 且为正；0 分锚点对应的训练集分位不高于 0.6；两个锚点的标准分带宽不小于 0.5；映射后落在 0 至 6 区间内的比例不低于 0.3。任一条不满足即判定该维度的绝对锚定不成立，其绝对分留空，仅提供相对分级，并在参数表中逐条记录失效原因。需要强调：副轨是</w:t>
+        <w:t>，五条须同时满足：载体在参考表中存在感知阈值；载体与该感官维度的斯皮尔曼相关系数不低于 0.3 且为正；0 分锚点对应的训练集分位不高于 0.6；两个锚点的标准分带宽不小于 0.5；映射后落在 0 至 6 区间内的比例不低于 0.3。任一条不满足即判定该维度的绝对锚定不成立，其绝对分留空，仅提供相对分级，并在参数表中逐条记录失效原因。副轨是</w:t>
       </w:r>
       <w:r>
         <w:rPr>
@@ -4407,7 +4760,7 @@
           <w:b w:val="0"/>
           <w:sz w:val="18"/>
         </w:rPr>
-        <w:t>表 3  各模型在留出集上的连续指标与相对分级指标（seed=0，175/75 分层切分）</w:t>
+        <w:t>表 4  各模型在留出集上的连续指标与相对分级指标（seed=0，175/75 分层切分）</w:t>
       </w:r>
     </w:p>
     <w:p>
@@ -4449,7 +4802,7 @@
           <w:b w:val="0"/>
           <w:sz w:val="21"/>
         </w:rPr>
-        <w:t>阈值锚定共考察 11 个具备明确化学载体的维度，经上述五条护栏后有 3 个维度成立（bitternes、alcohol、co2），锚定后落在 0–6 区间内的比例中位数为 0.891；其余 8 个维度因载体无感知阈值、载体与感官维度相关性不足或方向相反、或锚点区间退化而判定不成立，其绝对分留空、仅提供相对分级，失效原因在参数表中逐条记录。这一结果本身说明：在本数据集上，化学信号与感官评分的联系只在少数维度上足以支撑绝对标定。需要再次强调，该轨是本文提出的一阶近似而非实测原分。</w:t>
+        <w:t>阈值锚定共考察 11 个具备明确化学载体的维度，经上述五条护栏后有 3 个维度成立（bitternes、alcohol、co2），锚定后落在 0–6 区间内的比例中位数为 0.891；其余 8 个维度因载体无感知阈值、载体与感官维度相关性不足或方向相反、或锚点区间退化而判定不成立，其绝对分留空、仅提供相对分级，失效原因在参数表中逐条记录。这一结果本身说明：在本数据集上，化学信号与感官评分的联系只在少数维度上足以支撑绝对标定。因此，绝对轨应被理解为阈值约束下的近似标尺，而不是对缺失原始评分的替代。</w:t>
       </w:r>
     </w:p>
     <w:p>
@@ -4503,7 +4856,7 @@
           <w:b w:val="0"/>
           <w:sz w:val="18"/>
         </w:rPr>
-        <w:t>图 1  模型对比。留出集 Macro-RMSE 与 2000 次配对 bootstrap 的 95% 置信区间（区间重叠即不可宣称某模型显著更优），竖虚线为全局均值基线。</w:t>
+        <w:t>图 1  模型对比。留出集 Macro-RMSE 与 2000 次 bootstrap 的 95% 区间；虚线为全局均值基线。</w:t>
       </w:r>
     </w:p>
     <w:p>
@@ -5245,7 +5598,7 @@
           <w:b w:val="0"/>
           <w:sz w:val="18"/>
         </w:rPr>
-        <w:t>表 4  化学→183 维消费者描述符的建模结果（留出集宏平均指标）</w:t>
+        <w:t>表 5  化学→183 维消费者描述符的建模结果（留出集宏平均指标）</w:t>
       </w:r>
     </w:p>
     <w:p>
@@ -6849,7 +7202,7 @@
           <w:b w:val="0"/>
           <w:sz w:val="18"/>
         </w:rPr>
-        <w:t>表 5  品评组感官与消费者描述符的交叉一致性检验（共 33 组配对，此处列出前 15 组，完整表见支撑材料）</w:t>
+        <w:t>表 6  品评组感官与消费者描述符的交叉一致性检验（共 33 组配对，此处列出前 15 组，完整表见支撑材料）</w:t>
       </w:r>
     </w:p>
     <w:p>
@@ -7618,7 +7971,7 @@
           <w:b w:val="0"/>
           <w:sz w:val="18"/>
         </w:rPr>
-        <w:t>表 6  以价格为外部价值信号的回归系数（三个模型并列，n = 189）</w:t>
+        <w:t>表 7  以价格为外部价值信号的回归系数（三个模型并列，n = 189）</w:t>
       </w:r>
     </w:p>
     <w:p>
@@ -7632,7 +7985,7 @@
           <w:b w:val="0"/>
           <w:sz w:val="21"/>
         </w:rPr>
-        <w:t>价格回归以可算几何均价的 189 款样品为样本，并列给出 3 组模型：ols；ols_with_abv；fixed_effects（依次为不控变量、控制酒精度、控制酒精度并加入风格固定效应）。ols 的 R² = 0.340、ols_with_abv 的 R² = 0.366、fixed_effects 的 R² = 0.472，在 8 个可跨模型比较的描述符项中，有 8 项的系数符号在三个模型间保持一致，说明化学—感知组合携带的信息不完全由酒精度与风格标签解释。需要强调其边界：价格来自同一附件内 7 家零售商的跨币种报价，且未做汇率换算，是市场价值的代理，</w:t>
+        <w:t>价格回归以可算几何均价的 189 款样品为样本，并列给出 3 组模型：OLS；OLS + ABV；风格固定效应（依次为不控变量、控制酒精度、控制酒精度并加入风格固定效应）。ols 的 R² = 0.340、ols_with_abv 的 R² = 0.366、fixed_effects 的 R² = 0.472，在 8 个可跨模型比较的描述符项中，有 8 项的系数符号在三个模型间保持一致，说明化学—感知组合携带的信息不完全由酒精度与风格标签解释。需要强调其边界：价格来自同一附件内 7 家零售商的跨币种报价，且未做汇率换算，是市场价值的代理，</w:t>
       </w:r>
       <w:r>
         <w:rPr>
@@ -7664,7 +8017,7 @@
           <w:b w:val="0"/>
           <w:sz w:val="21"/>
         </w:rPr>
-        <w:t>，而非实测感官评分——这样可避免用同一批样本既训练又评价，但也意味着系数解释的是「化学谱所预测的感知」与价格的关系。在 fixed_effects 规格下 8 个实质项中只有 3 项满足 |t| &gt; 2，即多数系数在常规显著性水平上与零无法区分，故本文只把价格回归当作</w:t>
+        <w:t>，而非实测感官评分——这样可避免用同一批样本既训练又评价，但也意味着系数解释的是「化学谱所预测的感知」与价格的关系。在 风格固定效应 规格下 8 个实质项中只有 3 项满足 |t| &gt; 2，即多数系数在常规显著性水平上与零无法区分，故本文只把价格回归当作</w:t>
       </w:r>
       <w:r>
         <w:rPr>
@@ -7842,7 +8195,7 @@
           <w:b w:val="0"/>
           <w:sz w:val="18"/>
         </w:rPr>
-        <w:t>图 6  价格部分效应。三个设定下 log 价格对各感官维度的偏回归系数及 95% 置信区间：ols（R²=0.340）、ols_with_abv（加入 ABV，R²=0.366）、fixed_effects（再加入风格固定效应、按风格聚类稳健标准误，R²=0.472），样本量 n=189（仅含 ≥2 家零售报价的啤酒）。价格来自同一附件内 7 家零售商的跨币种报价，未做汇率换算；此处仅作为外部价值信号，不作市场因果解释。</w:t>
+        <w:t>图 6  价格部分效应。三个设定下 log 价格对各感官维度的偏回归系数及 95% 置信区间：OLS（R²=0.340）、OLS + ABV（加入 ABV，R²=0.366）、风格固定效应（再加入风格固定效应、按风格聚类稳健标准误，R²=0.472），样本量 n=189（仅含 ≥2 家零售报价的啤酒）。价格来自同一附件内 7 家零售商的跨币种报价，未做汇率换算；此处仅作为外部价值信号，不作市场因果解释。</w:t>
       </w:r>
     </w:p>
     <w:p>
@@ -8777,7 +9130,7 @@
           <w:b w:val="0"/>
           <w:sz w:val="18"/>
         </w:rPr>
-        <w:t>表 7  共表达图的阈值敏感性（模块度、化学纯度与连通性）</w:t>
+        <w:t>表 8  共表达图的阈值敏感性（模块度、化学纯度与连通性）</w:t>
       </w:r>
     </w:p>
     <w:p>
@@ -9628,7 +9981,7 @@
           <w:b w:val="0"/>
           <w:sz w:val="18"/>
         </w:rPr>
-        <w:t>表 8  主要共表达社区的化学来源构成（完整社区表见支撑材料）</w:t>
+        <w:t>表 9  主要共表达社区的化学来源构成（完整社区表见支撑材料）</w:t>
       </w:r>
     </w:p>
     <w:p>
@@ -11993,7 +12346,7 @@
           <w:b w:val="0"/>
           <w:sz w:val="18"/>
         </w:rPr>
-        <w:t>表 9  各感官维度的 Top-3 关键化合物及其稳定性判定（前 10 行，完整表见支撑材料）</w:t>
+        <w:t>表 10  各感官维度的 Top-3 关键化合物及其稳定性判定（前 10 行，完整表见支撑材料）</w:t>
       </w:r>
     </w:p>
     <w:p>
@@ -12007,39 +12360,7 @@
           <w:b w:val="0"/>
           <w:sz w:val="21"/>
         </w:rPr>
-        <w:t>按「重采样入选频率不低于 0.6 且跨方法 Jaccard 不低于 0.3」的双重判据，50 个感官维度中有 22 个维度至少有一项关键化合物被判为稳健。需要指出，三路证据之间的一致性并不均衡：附件交叉相关与本文自算全量相关的一致性最高，而 SHAP 归因与二者的 Jaccard 明显偏低，说明特征重要性与线性秩相关的视角差异较大；本文因此把归因路与相关路并列呈现，而不宣称其中某一路线更接近真值。须并列说明的是，「稳健」与「化学合理性」是</w:t>
-      </w:r>
-      <w:r>
-        <w:rPr>
-          <w:rFonts w:ascii="Times New Roman" w:hAnsi="Times New Roman" w:eastAsia="宋体"/>
-          <w:b/>
-          <w:sz w:val="21"/>
-        </w:rPr>
-        <w:t>两道独立判据</w:t>
-      </w:r>
-      <w:r>
-        <w:rPr>
-          <w:rFonts w:ascii="Times New Roman" w:hAnsi="Times New Roman" w:eastAsia="宋体"/>
-          <w:b w:val="0"/>
-          <w:sz w:val="21"/>
-        </w:rPr>
-        <w:t xml:space="preserve">：全表 150 行中仅 36 行通过化学合理性检验，被判为稳健关键因素的 32 行中只有 9 行同时通过（稳健且化学合理），其余 23 行虽在统计判据上稳健，但其化学来源归属或载体类别论证不成立，本文在表中保留这些行以示区分，不把它们作为可采纳的造谱依据。若只看每个感官维度排名第 1 的化合物，同时满足「稳健」与「化学合理」的仅 6 条，这正是本文把 Top-3 定位为「候选与稳健的参考集」而非可直接使用的造谱配方的原因。此外须报告一项负结果：50 个感官维度中有 </w:t>
-      </w:r>
-      <w:r>
-        <w:rPr>
-          <w:rFonts w:ascii="Times New Roman" w:hAnsi="Times New Roman" w:eastAsia="宋体"/>
-          <w:b/>
-          <w:sz w:val="21"/>
-        </w:rPr>
-        <w:t>28 个没有任何稳健关键化合物</w:t>
-      </w:r>
-      <w:r>
-        <w:rPr>
-          <w:rFonts w:ascii="Times New Roman" w:hAnsi="Times New Roman" w:eastAsia="宋体"/>
-          <w:b w:val="0"/>
-          <w:sz w:val="21"/>
-        </w:rPr>
-        <w:t>，本文不对这些维度给出 Top-3 结论，以免把「排序靠前」误读为「可采纳」。</w:t>
+        <w:t>按「重采样入选频率不低于 0.6 且跨方法 Jaccard 不低于 0.3」的双重判据，50 个感官维度中有 22 个维度至少有一项关键化合物被判为稳健。需要指出，三路证据之间的一致性并不均衡：附件交叉相关与本文自算全量相关的一致性最高，而 SHAP 归因与二者的 Jaccard 明显偏低，说明特征重要性与线性秩相关的视角差异较大；本文因此把归因路与相关路并列呈现，而不宣称其中某一路线更接近真值。稳健判定与化学合理性是两道独立判据：全表 150 行中有 36 行通过化学合理性检验；稳健记录共 32 行，其中 9 行同时满足两项条件。其余 23 行虽然满足统计稳定性标准，但缺少足够的化学来源或载体证据，因此在表中保留为候选关联，不将其解释为可直接采用的造谱配方。若只看每个感官维度排名第 1 的化合物，同时满足两项条件的仅 6 条；因此 Top-3 更适合作为候选关联的参考集，而不是直接用于配方设计的清单。在 50 个感官维度中，22 个维度至少有一条稳健记录，另有 28 个维度没有稳健记录；后者只报告排序结果，不作关键化合物判断。</w:t>
       </w:r>
     </w:p>
     <w:p>
@@ -12053,7 +12374,7 @@
           <w:b w:val="0"/>
           <w:sz w:val="21"/>
         </w:rPr>
-        <w:t>为检验上述候选项能否在独立样本中复现，本文仅在 175 个训练样本上重选 150 个 Top-3 候选，再在固定的 75 个留出样本上进行 5000 次双侧置换检验，并对全部 150 项统一执行 Benjamini–Hochberg 校正。其中 83 项通过 q≤0.05；主结果中判为稳健的 32 项全部被训练集重选保留且方向一致，其中 30 项通过留出集 FDR，同时满足稳健与化学合理性的 9 项全部通过。这只是关联的独立样本复现，不验证化学机理，也不构成因果证据。</w:t>
+        <w:t>为检验上述候选项能否在独立样本中复现，本文仅在 175 个训练样本上重选 150 个 Top-3 候选，再在固定的 75 个留出样本上进行 5000 次双侧置换检验，并对全部 150 项统一执行 Benjamini–Hochberg 校正。其中 83/150 项通过 q≤0.05；主结果中判为稳健的 32 项全部被训练集重选保留且方向一致，其中 30/32 项通过留出集 FDR，同时满足稳健与化学合理性的 9/9 项全部通过。这只是关联的独立样本复现，不验证化学机理，也不构成因果证据。</w:t>
       </w:r>
     </w:p>
     <w:p>
@@ -12064,7 +12385,7 @@
       <w:r>
         <w:drawing>
           <wp:inline xmlns:a="http://schemas.openxmlformats.org/drawingml/2006/main" xmlns:pic="http://schemas.openxmlformats.org/drawingml/2006/picture">
-            <wp:extent cx="4206240" cy="4068907"/>
+            <wp:extent cx="4206240" cy="3838646"/>
             <wp:docPr id="8" name="Picture 8"/>
             <wp:cNvGraphicFramePr>
               <a:graphicFrameLocks noChangeAspect="1"/>
@@ -12085,7 +12406,7 @@
                   <pic:spPr>
                     <a:xfrm>
                       <a:off x="0" y="0"/>
-                      <a:ext cx="4206240" cy="4068907"/>
+                      <a:ext cx="4206240" cy="3838646"/>
                     </a:xfrm>
                     <a:prstGeom prst="rect"/>
                   </pic:spPr>
@@ -12737,7 +13058,7 @@
           <w:b w:val="0"/>
           <w:sz w:val="18"/>
         </w:rPr>
-        <w:t>表 10  本文与原文（Nature Communications, 2024）的可量化对照</w:t>
+        <w:t>表 11  本文与原文（Nature Communications, 2024）的可量化对照</w:t>
       </w:r>
     </w:p>
     <w:p>
@@ -13484,7 +13805,7 @@
           <w:b w:val="0"/>
           <w:sz w:val="18"/>
         </w:rPr>
-        <w:t>表 11  缺陷化合物—感官维度的剂量—响应判定（六行配对）</w:t>
+        <w:t>表 12  缺陷化合物—感官维度的剂量—响应判定（六行配对）</w:t>
       </w:r>
     </w:p>
     <w:p>
@@ -13570,23 +13891,7 @@
           <w:b w:val="0"/>
           <w:sz w:val="21"/>
         </w:rPr>
-        <w:t>最后必须再次强调：</w:t>
-      </w:r>
-      <w:r>
-        <w:rPr>
-          <w:rFonts w:ascii="Times New Roman" w:hAnsi="Times New Roman" w:eastAsia="宋体"/>
-          <w:b/>
-          <w:sz w:val="21"/>
-        </w:rPr>
-        <w:t>原文结论链条中的「提升消费者喜爱度」一环在本附件条件下不可检验</w:t>
-      </w:r>
-      <w:r>
-        <w:rPr>
-          <w:rFonts w:ascii="Times New Roman" w:hAnsi="Times New Roman" w:eastAsia="宋体"/>
-          <w:b w:val="0"/>
-          <w:sz w:val="21"/>
-        </w:rPr>
-        <w:t>——附件既没有消费者评分标签，也没有购买行为数据，任何关于喜爱度提升幅度的数字都无从核验。本文在该位置给出的只是两个可检验的替代证据：消费者描述符的可预测性，以及化学谱对市场价值的解释力。二者都不等价于喜爱度，因此本文既不复现原文的喜爱度结论，也不否定它，只把它标注为在本数据条件下不可检验。</w:t>
+        <w:t>附件没有消费者评分或购买行为数据，因此原文结论链条中的「提升消费者喜爱度」一环在本研究中无法检验。本文提供的两类外部证据分别是消费者描述符的可预测性和化学谱对市场价值代理的解释力；它们能够补充感知与市场层面的信息，但不等价于喜爱度测量，也不支持对喜爱度提升幅度作出判断。</w:t>
       </w:r>
     </w:p>
     <w:p>
@@ -15769,7 +16074,7 @@
           <w:b w:val="0"/>
           <w:sz w:val="18"/>
         </w:rPr>
-        <w:t>表 12  各风格条件生成结果与可行性核验（含无约束参照生成）</w:t>
+        <w:t>表 13  各风格条件生成结果与可行性核验（含无约束参照生成）</w:t>
       </w:r>
     </w:p>
     <w:p>
@@ -18470,7 +18775,7 @@
           <w:b w:val="0"/>
           <w:sz w:val="18"/>
         </w:rPr>
-        <w:t>表 13  跨风格迁移的缺陷化合物前后对照（44 项核验的前 16 行）</w:t>
+        <w:t>表 14  跨风格迁移的缺陷化合物前后对照（44 项核验的前 16 行）</w:t>
       </w:r>
     </w:p>
     <w:p>
@@ -18778,7 +19083,7 @@
           <w:b w:val="0"/>
           <w:sz w:val="21"/>
         </w:rPr>
-        <w:t xml:space="preserve"> 本文无法构造也无法检验「消费者喜爱度」，只能以 183 维论坛派生描述符作为感知代理；价格虽覆盖 7 个零售来源中 ≥2 家的 189 款，但 7 家零售商并非统一定价体系，价格只能作为市场价值代理而非消费者效用的直接测量；且 7 个来源分别以美元、英镑与欧元标价，附件不含汇率列，本文未做币种换算，log 价格中混有币种与卖方价格水平差异，故价格回归的解释力只能视为上界而非精确估计。</w:t>
+        <w:t xml:space="preserve"> 本文无法构造也无法检验「消费者喜爱度」，只能以 183 维论坛派生描述符作为感知代理；价格虽覆盖 7 个零售来源中 ≥2 家的 189 款，但 7 家零售商并非统一定价体系，价格只能作为市场价值代理而非消费者效用的直接测量；且 7 个来源分别以美元、英镑与欧元标价，附件不含汇率列，本文未做币种换算，log 价格中混有币种与卖方价格水平差异，因而价格回归只能提供方向性市场价值证据，不能作为精确的品质溢价估计。</w:t>
       </w:r>
     </w:p>
     <w:p>
@@ -18808,7 +19113,7 @@
           <w:b w:val="0"/>
           <w:sz w:val="21"/>
         </w:rPr>
-        <w:t xml:space="preserve"> 同一种化合物在不同风格中的基线水平差异很大，混合回归得到的整体斜率可能主要由风格权重而非浓度驱动；本文以风格分层稳健性检验暴露这一点，但在多数风格样本量不足 8 时，分层估计本身不稳定，结论只能作为方向性证据。</w:t>
+        <w:t xml:space="preserve"> 同一种化合物在不同风格中的基线水平差异很大，混合回归得到的整体斜率可能主要由风格权重而非浓度驱动；本文以风格分层稳健性检验暴露这一点，但多数风格样本量不足 8，分层估计仍不稳定，相关结果应理解为方向性证据。</w:t>
       </w:r>
     </w:p>
     <w:p>
@@ -18838,7 +19143,7 @@
           <w:b w:val="0"/>
           <w:sz w:val="21"/>
         </w:rPr>
-        <w:t xml:space="preserve"> 全局高斯 Copula 以单一高斯相关矩阵刻画全部依赖结构，无法表达非高斯尾部依赖；经验边际可在拟合样本上被重放，但不能据此推断对新样本的还原度。留出检验中每个风格仅有 3–9 款真实啤酒，且受约束生成在 42/48 个评估单元上的能量距离和 MMD² 均劣于无约束生成，所以本文只主张其具有结构性与约束可用性，不主张个体极端组合或完整真实分布已被还原。</w:t>
+        <w:t xml:space="preserve"> 全局高斯 Copula 以单一高斯相关矩阵刻画全部依赖结构，无法表达非高斯尾部依赖；经验边际可在拟合样本上被重放，但不能据此推断对新样本的还原度。留出检验中每个风格仅有 3–9 款真实啤酒，且受约束生成在 42/48 个评估单元上的能量距离和 MMD² 均劣于无约束生成，因此，本文将其定位为具有结构性和约束可用性的生成参照；个体极端组合和完整真实分布仍需更多留出样本验证。</w:t>
       </w:r>
     </w:p>
     <w:p>
@@ -19000,7 +19305,7 @@
           <w:b w:val="0"/>
           <w:sz w:val="21"/>
         </w:rPr>
-        <w:t>（3）问题二在默认阈值下的共表达图较为稀疏，孤立节点比例偏高，社区结构主要由化学来源相近的萜烯、酯类与硫化物群组构成，这为「共表达模块对应可追溯的化学来源」提供了直接支持；关键化合物的排序由自算全量相关与归因两路证据给出，并以重采样入选频率与跨方法 Jaccard 系数双重量化稳定性，仅在两条判据同时满足时才标记为稳健。</w:t>
+        <w:t>（3）问题二在默认阈值下的共表达图较为稀疏，孤立节点比例偏高，社区结构主要由化学来源相近的萜烯、酯类与硫化物群组构成，这为「共表达模块对应可追溯的化学来源」提供了直接支持；关键化合物的排序由自算全量相关与归因两路证据给出，并以重采样入选频率与跨方法 Jaccard 系数双重量化稳定性，仅在两条判据同时满足时才标记为稳健。50 个维度中有 22 个维度包含稳健记录，28 个维度没有稳健记录；稳健记录共 32 条，其中 9 条同时通过化学合理性检验。这些数字把稳定性、化学合理性和无稳健结果同时呈现，避免将排序靠前的候选误读为因果因素。</w:t>
       </w:r>
     </w:p>
     <w:p>
@@ -19014,7 +19319,7 @@
           <w:b w:val="0"/>
           <w:sz w:val="21"/>
         </w:rPr>
-        <w:t>（4）问题三以全局 Copula 结构加风格条件边际生成化合谱，在缺陷阈值约束下实现了零违规；这里的零违规只表示硬约束合规，不等同于无约束生成真实性，且受约束后的边际会发生分布压缩。在 48 个留出评估单元中，受约束生成的能量距离和 MMD² 均有 42 个劣于无约束生成，而约束合规率由 13.5% 提升至 100%，表明合规提升与真实性损失必须同时报告。并以秩—分位映射完成跨风格迁移，迁移后各缺陷化合物均不恶化。相关结构的保持程度需并置两个数字看：迁移前后斯皮尔曼相关系数的</w:t>
+        <w:t>（4）问题三以全局 Copula 结构加风格条件边际生成化合谱，在缺陷阈值约束下实现了零违规；零违规只表示硬约束合规，不能代表无约束生成的真实性，受约束后的边际还会发生分布压缩。在 48 个留出评估单元中，受约束生成的能量距离和 MMD² 均有 42 个劣于无约束生成，而约束合规率由 13.5% 提升至 100%，表明合规提升与真实性损失必须同时报告。并以秩—分位映射完成跨风格迁移，迁移后各缺陷化合物均不恶化。相关结构的保持程度需并置两个数字看：迁移前后斯皮尔曼相关系数的</w:t>
       </w:r>
       <w:r>
         <w:rPr>
@@ -19046,7 +19351,7 @@
           <w:b w:val="0"/>
           <w:sz w:val="21"/>
         </w:rPr>
-        <w:t>的最大偏差明显更大（见 5.5 节），即整体分布形态得以保持而个别化合物对仍会被重排，故本文只作「整体结构基本保持」的表述。本文通过并列给出不作约束的参照生成，发现其在当前参照下距离小于同分布随机重抽的期望距离，但与「完美复现风格经验边际」的经验匹配地板相比仍高出一个量级，故本文只主张其在当前参照下具有结构性可用性，不主张精确还原真实边际；受约束谱的边际偏移来自拒绝重抽对缺陷项低尾的条件化，而非生成器的还原能力不足。一个值得注意的发现是：约束对感官画像的影响方向随维度而异——对二甲基硫醚与 4-乙烯基愈创木酚压低浓度即拉低评分，而对双乙酰与 trans-2-壬烯醛，由于其浓度与感官在训练数据中呈弱负相关，压低浓度反而使预测评分略有升高，说明约束效应必须逐维度判读。</w:t>
+        <w:t>的最大偏差明显更大（见 5.5 节），即整体分布形态得以保持而个别化合物对仍会被重排，故本文只作「整体结构基本保持」的表述。无约束参照生成在当前评价中距离小于同分布随机重抽的期望距离，但与「完美复现风格经验边际」的经验匹配地板相比仍高出一个量级，因此它具有结构性参考价值，但尚不足以说明真实边际已被精确还原；受约束谱的边际偏移来自拒绝重抽对缺陷项低尾的条件化，而非生成器的还原能力不足。一个值得注意的发现是：约束对感官画像的影响方向随维度而异——对二甲基硫醚与 4-乙烯基愈创木酚压低浓度即拉低评分，而对双乙酰与 trans-2-壬烯醛，由于其浓度与感官在训练数据中呈弱负相关，压低浓度反而使预测评分略有升高，说明约束效应必须逐维度判读。</w:t>
       </w:r>
     </w:p>
     <w:p>
@@ -19106,7 +19411,7 @@
           <w:b w:val="0"/>
           <w:sz w:val="21"/>
         </w:rPr>
-        <w:t>关于与原文的关系，需要再次申明：本文是对 Schreurs M 等（Nature Communications, 2024）公开数据的独立复现与再分析，贡献集中在三处数据语义勘误、消费者感知路径与市场价值的外部验证、以及缺陷化合物剂量—响应的再检验；本文不声称复现该研究的模型选择与关键化合物排序，其重要性先验仅作为四路证据之一参与外部印证。</w:t>
+        <w:t>与原文的关系是清楚的：本文是对 Schreurs M 等（Nature Communications, 2024）公开数据的独立复现与再分析，贡献集中在三处数据语义勘误、消费者感知路径与市场价值的外部验证、以及缺陷化合物剂量—响应的再检验；本文不声称复现该研究的模型选择与关键化合物排序，其重要性先验仅作为四路证据之一参与外部印证。</w:t>
       </w:r>
     </w:p>
     <w:p>
@@ -19140,7 +19445,7 @@
     <w:p>
       <w:pPr>
         <w:keepLines/>
-        <w:spacing w:after="0" w:line="324" w:lineRule="auto"/>
+        <w:spacing w:after="0" w:line="240" w:lineRule="auto"/>
         <w:ind w:firstLine="0"/>
       </w:pPr>
       <w:r>
@@ -19155,7 +19460,7 @@
     <w:p>
       <w:pPr>
         <w:keepLines/>
-        <w:spacing w:after="0" w:line="324" w:lineRule="auto"/>
+        <w:spacing w:after="0" w:line="240" w:lineRule="auto"/>
         <w:ind w:firstLine="0"/>
       </w:pPr>
       <w:r>
@@ -19170,7 +19475,7 @@
     <w:p>
       <w:pPr>
         <w:keepLines/>
-        <w:spacing w:after="0" w:line="324" w:lineRule="auto"/>
+        <w:spacing w:after="0" w:line="240" w:lineRule="auto"/>
         <w:ind w:firstLine="0"/>
       </w:pPr>
       <w:r>
@@ -19185,7 +19490,7 @@
     <w:p>
       <w:pPr>
         <w:keepLines/>
-        <w:spacing w:after="0" w:line="324" w:lineRule="auto"/>
+        <w:spacing w:after="0" w:line="240" w:lineRule="auto"/>
         <w:ind w:firstLine="0"/>
       </w:pPr>
       <w:r>
@@ -19200,7 +19505,7 @@
     <w:p>
       <w:pPr>
         <w:keepLines/>
-        <w:spacing w:after="0" w:line="324" w:lineRule="auto"/>
+        <w:spacing w:after="0" w:line="240" w:lineRule="auto"/>
         <w:ind w:firstLine="0"/>
       </w:pPr>
       <w:r>
@@ -19215,7 +19520,7 @@
     <w:p>
       <w:pPr>
         <w:keepLines/>
-        <w:spacing w:after="0" w:line="324" w:lineRule="auto"/>
+        <w:spacing w:after="0" w:line="240" w:lineRule="auto"/>
         <w:ind w:firstLine="0"/>
       </w:pPr>
       <w:r>
@@ -19230,7 +19535,7 @@
     <w:p>
       <w:pPr>
         <w:keepLines/>
-        <w:spacing w:after="0" w:line="324" w:lineRule="auto"/>
+        <w:spacing w:after="0" w:line="240" w:lineRule="auto"/>
         <w:ind w:firstLine="0"/>
       </w:pPr>
       <w:r>
@@ -19245,7 +19550,7 @@
     <w:p>
       <w:pPr>
         <w:keepLines/>
-        <w:spacing w:after="0" w:line="324" w:lineRule="auto"/>
+        <w:spacing w:after="0" w:line="240" w:lineRule="auto"/>
         <w:ind w:firstLine="0"/>
       </w:pPr>
       <w:r>
@@ -19260,7 +19565,7 @@
     <w:p>
       <w:pPr>
         <w:keepLines/>
-        <w:spacing w:after="0" w:line="324" w:lineRule="auto"/>
+        <w:spacing w:after="0" w:line="240" w:lineRule="auto"/>
         <w:ind w:firstLine="0"/>
       </w:pPr>
       <w:r>
@@ -19275,7 +19580,7 @@
     <w:p>
       <w:pPr>
         <w:keepLines/>
-        <w:spacing w:after="0" w:line="324" w:lineRule="auto"/>
+        <w:spacing w:after="0" w:line="240" w:lineRule="auto"/>
         <w:ind w:firstLine="0"/>
       </w:pPr>
       <w:r>
@@ -19290,7 +19595,7 @@
     <w:p>
       <w:pPr>
         <w:keepLines/>
-        <w:spacing w:after="0" w:line="324" w:lineRule="auto"/>
+        <w:spacing w:after="0" w:line="240" w:lineRule="auto"/>
         <w:ind w:firstLine="0"/>
       </w:pPr>
       <w:r>
@@ -19305,7 +19610,7 @@
     <w:p>
       <w:pPr>
         <w:keepLines/>
-        <w:spacing w:after="0" w:line="324" w:lineRule="auto"/>
+        <w:spacing w:after="0" w:line="240" w:lineRule="auto"/>
         <w:ind w:firstLine="0"/>
       </w:pPr>
       <w:r>
@@ -19320,7 +19625,7 @@
     <w:p>
       <w:pPr>
         <w:keepLines/>
-        <w:spacing w:after="0" w:line="324" w:lineRule="auto"/>
+        <w:spacing w:after="0" w:line="240" w:lineRule="auto"/>
         <w:ind w:firstLine="0"/>
       </w:pPr>
       <w:r>
@@ -19335,7 +19640,7 @@
     <w:p>
       <w:pPr>
         <w:keepLines/>
-        <w:spacing w:after="0" w:line="324" w:lineRule="auto"/>
+        <w:spacing w:after="0" w:line="240" w:lineRule="auto"/>
         <w:ind w:firstLine="0"/>
       </w:pPr>
       <w:r>
@@ -19350,7 +19655,7 @@
     <w:p>
       <w:pPr>
         <w:keepLines/>
-        <w:spacing w:after="0" w:line="324" w:lineRule="auto"/>
+        <w:spacing w:after="0" w:line="240" w:lineRule="auto"/>
         <w:ind w:firstLine="0"/>
       </w:pPr>
       <w:r>
@@ -19365,7 +19670,7 @@
     <w:p>
       <w:pPr>
         <w:keepLines/>
-        <w:spacing w:after="0" w:line="324" w:lineRule="auto"/>
+        <w:spacing w:after="0" w:line="240" w:lineRule="auto"/>
         <w:ind w:firstLine="0"/>
       </w:pPr>
       <w:r>
@@ -19380,7 +19685,7 @@
     <w:p>
       <w:pPr>
         <w:keepLines/>
-        <w:spacing w:after="0" w:line="324" w:lineRule="auto"/>
+        <w:spacing w:after="0" w:line="240" w:lineRule="auto"/>
         <w:ind w:firstLine="0"/>
       </w:pPr>
       <w:r>
@@ -19395,7 +19700,7 @@
     <w:p>
       <w:pPr>
         <w:keepLines/>
-        <w:spacing w:after="0" w:line="324" w:lineRule="auto"/>
+        <w:spacing w:after="0" w:line="240" w:lineRule="auto"/>
         <w:ind w:firstLine="0"/>
       </w:pPr>
       <w:r>
@@ -19410,7 +19715,7 @@
     <w:p>
       <w:pPr>
         <w:keepLines/>
-        <w:spacing w:after="0" w:line="324" w:lineRule="auto"/>
+        <w:spacing w:after="0" w:line="240" w:lineRule="auto"/>
         <w:ind w:firstLine="0"/>
       </w:pPr>
       <w:r>
@@ -19425,7 +19730,7 @@
     <w:p>
       <w:pPr>
         <w:keepLines/>
-        <w:spacing w:after="0" w:line="324" w:lineRule="auto"/>
+        <w:spacing w:after="0" w:line="240" w:lineRule="auto"/>
         <w:ind w:firstLine="0"/>
       </w:pPr>
       <w:r>
@@ -19440,7 +19745,7 @@
     <w:p>
       <w:pPr>
         <w:keepLines/>
-        <w:spacing w:after="0" w:line="324" w:lineRule="auto"/>
+        <w:spacing w:after="0" w:line="240" w:lineRule="auto"/>
         <w:ind w:firstLine="0"/>
       </w:pPr>
       <w:r>
@@ -19455,7 +19760,7 @@
     <w:p>
       <w:pPr>
         <w:keepLines/>
-        <w:spacing w:after="0" w:line="324" w:lineRule="auto"/>
+        <w:spacing w:after="0" w:line="240" w:lineRule="auto"/>
         <w:ind w:firstLine="0"/>
       </w:pPr>
       <w:r>
@@ -19470,7 +19775,7 @@
     <w:p>
       <w:pPr>
         <w:keepLines/>
-        <w:spacing w:after="0" w:line="324" w:lineRule="auto"/>
+        <w:spacing w:after="0" w:line="240" w:lineRule="auto"/>
         <w:ind w:firstLine="0"/>
       </w:pPr>
       <w:r>
@@ -19485,7 +19790,7 @@
     <w:p>
       <w:pPr>
         <w:keepLines/>
-        <w:spacing w:after="0" w:line="324" w:lineRule="auto"/>
+        <w:spacing w:after="0" w:line="240" w:lineRule="auto"/>
         <w:ind w:firstLine="0"/>
       </w:pPr>
       <w:r>
@@ -19500,7 +19805,7 @@
     <w:p>
       <w:pPr>
         <w:keepLines/>
-        <w:spacing w:after="0" w:line="324" w:lineRule="auto"/>
+        <w:spacing w:after="0" w:line="240" w:lineRule="auto"/>
         <w:ind w:firstLine="0"/>
       </w:pPr>
       <w:r>
@@ -19515,7 +19820,7 @@
     <w:p>
       <w:pPr>
         <w:keepLines/>
-        <w:spacing w:after="0" w:line="324" w:lineRule="auto"/>
+        <w:spacing w:after="0" w:line="240" w:lineRule="auto"/>
         <w:ind w:firstLine="0"/>
       </w:pPr>
       <w:r>
@@ -19530,7 +19835,7 @@
     <w:p>
       <w:pPr>
         <w:keepLines/>
-        <w:spacing w:after="0" w:line="324" w:lineRule="auto"/>
+        <w:spacing w:after="0" w:line="240" w:lineRule="auto"/>
         <w:ind w:firstLine="0"/>
       </w:pPr>
       <w:r>
@@ -19545,7 +19850,7 @@
     <w:p>
       <w:pPr>
         <w:keepLines/>
-        <w:spacing w:after="0" w:line="324" w:lineRule="auto"/>
+        <w:spacing w:after="0" w:line="240" w:lineRule="auto"/>
         <w:ind w:firstLine="0"/>
       </w:pPr>
       <w:r>
@@ -19560,7 +19865,7 @@
     <w:p>
       <w:pPr>
         <w:keepLines/>
-        <w:spacing w:after="0" w:line="324" w:lineRule="auto"/>
+        <w:spacing w:after="0" w:line="240" w:lineRule="auto"/>
         <w:ind w:firstLine="0"/>
       </w:pPr>
       <w:r>
@@ -19575,7 +19880,7 @@
     <w:p>
       <w:pPr>
         <w:keepLines/>
-        <w:spacing w:after="0" w:line="324" w:lineRule="auto"/>
+        <w:spacing w:after="0" w:line="240" w:lineRule="auto"/>
         <w:ind w:firstLine="0"/>
       </w:pPr>
       <w:r>
@@ -19590,7 +19895,7 @@
     <w:p>
       <w:pPr>
         <w:keepLines/>
-        <w:spacing w:after="0" w:line="324" w:lineRule="auto"/>
+        <w:spacing w:after="0" w:line="240" w:lineRule="auto"/>
         <w:ind w:firstLine="0"/>
       </w:pPr>
       <w:r>
@@ -19605,7 +19910,7 @@
     <w:p>
       <w:pPr>
         <w:keepLines/>
-        <w:spacing w:after="0" w:line="324" w:lineRule="auto"/>
+        <w:spacing w:after="0" w:line="240" w:lineRule="auto"/>
         <w:ind w:firstLine="0"/>
       </w:pPr>
       <w:r>
@@ -19620,7 +19925,7 @@
     <w:p>
       <w:pPr>
         <w:keepLines/>
-        <w:spacing w:after="0" w:line="324" w:lineRule="auto"/>
+        <w:spacing w:after="0" w:line="240" w:lineRule="auto"/>
         <w:ind w:firstLine="0"/>
       </w:pPr>
       <w:r>
@@ -19635,7 +19940,7 @@
     <w:p>
       <w:pPr>
         <w:keepLines/>
-        <w:spacing w:after="0" w:line="324" w:lineRule="auto"/>
+        <w:spacing w:after="0" w:line="240" w:lineRule="auto"/>
         <w:ind w:firstLine="0"/>
       </w:pPr>
       <w:r>
@@ -19650,7 +19955,7 @@
     <w:p>
       <w:pPr>
         <w:keepLines/>
-        <w:spacing w:after="0" w:line="324" w:lineRule="auto"/>
+        <w:spacing w:after="0" w:line="240" w:lineRule="auto"/>
         <w:ind w:firstLine="0"/>
       </w:pPr>
       <w:r>
@@ -19665,7 +19970,7 @@
     <w:p>
       <w:pPr>
         <w:keepLines/>
-        <w:spacing w:after="0" w:line="324" w:lineRule="auto"/>
+        <w:spacing w:after="0" w:line="240" w:lineRule="auto"/>
         <w:ind w:firstLine="0"/>
       </w:pPr>
       <w:r>
@@ -19680,7 +19985,7 @@
     <w:p>
       <w:pPr>
         <w:keepLines/>
-        <w:spacing w:after="0" w:line="324" w:lineRule="auto"/>
+        <w:spacing w:after="0" w:line="240" w:lineRule="auto"/>
         <w:ind w:firstLine="0"/>
       </w:pPr>
       <w:r>
@@ -19695,7 +20000,7 @@
     <w:p>
       <w:pPr>
         <w:keepLines/>
-        <w:spacing w:after="0" w:line="324" w:lineRule="auto"/>
+        <w:spacing w:after="0" w:line="240" w:lineRule="auto"/>
         <w:ind w:firstLine="0"/>
       </w:pPr>
       <w:r>
@@ -19710,7 +20015,7 @@
     <w:p>
       <w:pPr>
         <w:keepLines/>
-        <w:spacing w:after="0" w:line="324" w:lineRule="auto"/>
+        <w:spacing w:after="0" w:line="240" w:lineRule="auto"/>
         <w:ind w:firstLine="0"/>
       </w:pPr>
       <w:r>
@@ -20948,7 +21253,7 @@
           <w:b w:val="0"/>
           <w:sz w:val="18"/>
         </w:rPr>
-        <w:t>单元测试（tests/）：test_consumer_layer.py、test_corr_type.py、test_data_contract.py、test_literature.py、test_plot_style.py、test_scale_audit.py</w:t>
+        <w:t>单元测试（tests/）：test_consumer_layer.py、test_corr_type.py、test_data_contract.py、test_literature.py、test_plot_style.py、test_release_hardening.py、test_scale_audit.py</w:t>
       </w:r>
     </w:p>
     <w:p>

</xml_diff>